<commit_message>
docs: actualizar columna Estado de la RTM con lo ejecutado
</commit_message>
<xml_diff>
--- a/docs/Hito-Integracion-SQA.docx.docx
+++ b/docs/Hito-Integracion-SQA.docx.docx
@@ -7390,6 +7390,246 @@
               <w:rPr>
                 <w:color w:val="000000"/>
               </w:rPr>
+              <w:t>Aprobado</w:t>
+            </w:r>
+          </w:p>
+        </w:tc>
+      </w:tr>
+      <w:tr>
+        <w:tblPrEx>
+          <w:tblCellMar>
+            <w:top w:w="0" w:type="dxa"/>
+            <w:bottom w:w="0" w:type="dxa"/>
+          </w:tblCellMar>
+        </w:tblPrEx>
+        <w:tc>
+          <w:tcPr>
+            <w:tcW w:w="900" w:type="dxa"/>
+            <w:vAlign w:val="center"/>
+          </w:tcPr>
+          <w:p>
+            <w:r>
+              <w:rPr>
+                <w:color w:val="000000"/>
+              </w:rPr>
+              <w:t>CP-04</w:t>
+            </w:r>
+          </w:p>
+        </w:tc>
+        <w:tc>
+          <w:tcPr>
+            <w:tcW w:w="1500" w:type="dxa"/>
+            <w:vAlign w:val="center"/>
+          </w:tcPr>
+          <w:p>
+            <w:r>
+              <w:rPr>
+                <w:color w:val="000000"/>
+              </w:rPr>
+              <w:t>HU-02</w:t>
+            </w:r>
+          </w:p>
+        </w:tc>
+        <w:tc>
+          <w:tcPr>
+            <w:tcW w:w="2200" w:type="dxa"/>
+            <w:vAlign w:val="center"/>
+          </w:tcPr>
+          <w:p>
+            <w:r>
+              <w:rPr>
+                <w:color w:val="000000"/>
+              </w:rPr>
+              <w:t>Campos vacíos</w:t>
+            </w:r>
+          </w:p>
+        </w:tc>
+        <w:tc>
+          <w:tcPr>
+            <w:tcW w:w="1400" w:type="dxa"/>
+            <w:vAlign w:val="center"/>
+          </w:tcPr>
+          <w:p>
+            <w:r>
+              <w:rPr>
+                <w:color w:val="000000"/>
+              </w:rPr>
+              <w:t>Equivalencia</w:t>
+            </w:r>
+          </w:p>
+        </w:tc>
+        <w:tc>
+          <w:tcPr>
+            <w:tcW w:w="900" w:type="dxa"/>
+            <w:vAlign w:val="center"/>
+          </w:tcPr>
+          <w:p>
+            <w:r>
+              <w:rPr>
+                <w:color w:val="000000"/>
+              </w:rPr>
+              <w:t>Media</w:t>
+            </w:r>
+          </w:p>
+        </w:tc>
+        <w:tc>
+          <w:tcPr>
+            <w:tcW w:w="2600" w:type="dxa"/>
+            <w:vAlign w:val="center"/>
+          </w:tcPr>
+          <w:p>
+            <w:r>
+              <w:rPr>
+                <w:color w:val="000000"/>
+              </w:rPr>
+              <w:t>Pide llenarlos</w:t>
+            </w:r>
+          </w:p>
+        </w:tc>
+        <w:tc>
+          <w:tcPr>
+            <w:tcW w:w="900" w:type="dxa"/>
+            <w:vAlign w:val="center"/>
+          </w:tcPr>
+          <w:p>
+            <w:r>
+              <w:rPr>
+                <w:color w:val="000000"/>
+              </w:rPr>
+              <w:t>—</w:t>
+            </w:r>
+          </w:p>
+        </w:tc>
+        <w:tc>
+          <w:tcPr>
+            <w:tcW w:w="1400" w:type="dxa"/>
+            <w:vAlign w:val="center"/>
+          </w:tcPr>
+          <w:p>
+            <w:r>
+              <w:rPr>
+                <w:color w:val="000000"/>
+              </w:rPr>
+              <w:t>Aprobado</w:t>
+            </w:r>
+          </w:p>
+        </w:tc>
+      </w:tr>
+      <w:tr>
+        <w:tblPrEx>
+          <w:tblCellMar>
+            <w:top w:w="0" w:type="dxa"/>
+            <w:bottom w:w="0" w:type="dxa"/>
+          </w:tblCellMar>
+        </w:tblPrEx>
+        <w:tc>
+          <w:tcPr>
+            <w:tcW w:w="900" w:type="dxa"/>
+            <w:vAlign w:val="center"/>
+          </w:tcPr>
+          <w:p>
+            <w:r>
+              <w:rPr>
+                <w:color w:val="000000"/>
+              </w:rPr>
+              <w:t>CP-05</w:t>
+            </w:r>
+          </w:p>
+        </w:tc>
+        <w:tc>
+          <w:tcPr>
+            <w:tcW w:w="1500" w:type="dxa"/>
+            <w:vAlign w:val="center"/>
+          </w:tcPr>
+          <w:p>
+            <w:r>
+              <w:rPr>
+                <w:color w:val="000000"/>
+              </w:rPr>
+              <w:t>HU-02</w:t>
+            </w:r>
+          </w:p>
+        </w:tc>
+        <w:tc>
+          <w:tcPr>
+            <w:tcW w:w="2200" w:type="dxa"/>
+            <w:vAlign w:val="center"/>
+          </w:tcPr>
+          <w:p>
+            <w:r>
+              <w:rPr>
+                <w:color w:val="000000"/>
+              </w:rPr>
+              <w:t>URL sin sesión</w:t>
+            </w:r>
+          </w:p>
+        </w:tc>
+        <w:tc>
+          <w:tcPr>
+            <w:tcW w:w="1400" w:type="dxa"/>
+            <w:vAlign w:val="center"/>
+          </w:tcPr>
+          <w:p>
+            <w:r>
+              <w:rPr>
+                <w:color w:val="000000"/>
+              </w:rPr>
+              <w:t>Negativa</w:t>
+            </w:r>
+          </w:p>
+        </w:tc>
+        <w:tc>
+          <w:tcPr>
+            <w:tcW w:w="900" w:type="dxa"/>
+            <w:vAlign w:val="center"/>
+          </w:tcPr>
+          <w:p>
+            <w:r>
+              <w:rPr>
+                <w:color w:val="000000"/>
+              </w:rPr>
+              <w:t>Alta</w:t>
+            </w:r>
+          </w:p>
+        </w:tc>
+        <w:tc>
+          <w:tcPr>
+            <w:tcW w:w="2600" w:type="dxa"/>
+            <w:vAlign w:val="center"/>
+          </w:tcPr>
+          <w:p>
+            <w:r>
+              <w:rPr>
+                <w:color w:val="000000"/>
+              </w:rPr>
+              <w:t>Manda al login</w:t>
+            </w:r>
+          </w:p>
+        </w:tc>
+        <w:tc>
+          <w:tcPr>
+            <w:tcW w:w="900" w:type="dxa"/>
+            <w:vAlign w:val="center"/>
+          </w:tcPr>
+          <w:p>
+            <w:r>
+              <w:rPr>
+                <w:color w:val="000000"/>
+              </w:rPr>
+              <w:t>R-04</w:t>
+            </w:r>
+          </w:p>
+        </w:tc>
+        <w:tc>
+          <w:tcPr>
+            <w:tcW w:w="1400" w:type="dxa"/>
+            <w:vAlign w:val="center"/>
+          </w:tcPr>
+          <w:p>
+            <w:r>
+              <w:rPr>
+                <w:color w:val="000000"/>
+              </w:rPr>
               <w:t>No ejecutado</w:t>
             </w:r>
           </w:p>
@@ -7412,7 +7652,7 @@
               <w:rPr>
                 <w:color w:val="000000"/>
               </w:rPr>
-              <w:t>CP-04</w:t>
+              <w:t>CP-06</w:t>
             </w:r>
           </w:p>
         </w:tc>
@@ -7426,7 +7666,7 @@
               <w:rPr>
                 <w:color w:val="000000"/>
               </w:rPr>
-              <w:t>HU-02</w:t>
+              <w:t>HU-03 / RN-03</w:t>
             </w:r>
           </w:p>
         </w:tc>
@@ -7440,7 +7680,7 @@
               <w:rPr>
                 <w:color w:val="000000"/>
               </w:rPr>
-              <w:t>Campos vacíos</w:t>
+              <w:t>Agotados marcados</w:t>
             </w:r>
           </w:p>
         </w:tc>
@@ -7454,6 +7694,126 @@
               <w:rPr>
                 <w:color w:val="000000"/>
               </w:rPr>
+              <w:t>Positiva</w:t>
+            </w:r>
+          </w:p>
+        </w:tc>
+        <w:tc>
+          <w:tcPr>
+            <w:tcW w:w="900" w:type="dxa"/>
+            <w:vAlign w:val="center"/>
+          </w:tcPr>
+          <w:p>
+            <w:r>
+              <w:rPr>
+                <w:color w:val="000000"/>
+              </w:rPr>
+              <w:t>Media</w:t>
+            </w:r>
+          </w:p>
+        </w:tc>
+        <w:tc>
+          <w:tcPr>
+            <w:tcW w:w="2600" w:type="dxa"/>
+            <w:vAlign w:val="center"/>
+          </w:tcPr>
+          <w:p>
+            <w:r>
+              <w:rPr>
+                <w:color w:val="000000"/>
+              </w:rPr>
+              <w:t>8 productos, 2 marcados</w:t>
+            </w:r>
+          </w:p>
+        </w:tc>
+        <w:tc>
+          <w:tcPr>
+            <w:tcW w:w="900" w:type="dxa"/>
+            <w:vAlign w:val="center"/>
+          </w:tcPr>
+          <w:p>
+            <w:r>
+              <w:rPr>
+                <w:color w:val="000000"/>
+              </w:rPr>
+              <w:t>R-06</w:t>
+            </w:r>
+          </w:p>
+        </w:tc>
+        <w:tc>
+          <w:tcPr>
+            <w:tcW w:w="1400" w:type="dxa"/>
+            <w:vAlign w:val="center"/>
+          </w:tcPr>
+          <w:p>
+            <w:r>
+              <w:rPr>
+                <w:color w:val="000000"/>
+              </w:rPr>
+              <w:t>No ejecutado</w:t>
+            </w:r>
+          </w:p>
+        </w:tc>
+      </w:tr>
+      <w:tr>
+        <w:tblPrEx>
+          <w:tblCellMar>
+            <w:top w:w="0" w:type="dxa"/>
+            <w:bottom w:w="0" w:type="dxa"/>
+          </w:tblCellMar>
+        </w:tblPrEx>
+        <w:tc>
+          <w:tcPr>
+            <w:tcW w:w="900" w:type="dxa"/>
+            <w:vAlign w:val="center"/>
+          </w:tcPr>
+          <w:p>
+            <w:r>
+              <w:rPr>
+                <w:color w:val="000000"/>
+              </w:rPr>
+              <w:t>CP-07</w:t>
+            </w:r>
+          </w:p>
+        </w:tc>
+        <w:tc>
+          <w:tcPr>
+            <w:tcW w:w="1500" w:type="dxa"/>
+            <w:vAlign w:val="center"/>
+          </w:tcPr>
+          <w:p>
+            <w:r>
+              <w:rPr>
+                <w:color w:val="000000"/>
+              </w:rPr>
+              <w:t>HU-04</w:t>
+            </w:r>
+          </w:p>
+        </w:tc>
+        <w:tc>
+          <w:tcPr>
+            <w:tcW w:w="2200" w:type="dxa"/>
+            <w:vAlign w:val="center"/>
+          </w:tcPr>
+          <w:p>
+            <w:r>
+              <w:rPr>
+                <w:color w:val="000000"/>
+              </w:rPr>
+              <w:t>SKU existente</w:t>
+            </w:r>
+          </w:p>
+        </w:tc>
+        <w:tc>
+          <w:tcPr>
+            <w:tcW w:w="1400" w:type="dxa"/>
+            <w:vAlign w:val="center"/>
+          </w:tcPr>
+          <w:p>
+            <w:r>
+              <w:rPr>
+                <w:color w:val="000000"/>
+              </w:rPr>
               <w:t>Equivalencia</w:t>
             </w:r>
           </w:p>
@@ -7482,7 +7842,7 @@
               <w:rPr>
                 <w:color w:val="000000"/>
               </w:rPr>
-              <w:t>Pide llenarlos</w:t>
+              <w:t>Muestra ese producto</w:t>
             </w:r>
           </w:p>
         </w:tc>
@@ -7510,6 +7870,966 @@
               <w:rPr>
                 <w:color w:val="000000"/>
               </w:rPr>
+              <w:t>Aprobado</w:t>
+            </w:r>
+          </w:p>
+        </w:tc>
+      </w:tr>
+      <w:tr>
+        <w:tblPrEx>
+          <w:tblCellMar>
+            <w:top w:w="0" w:type="dxa"/>
+            <w:bottom w:w="0" w:type="dxa"/>
+          </w:tblCellMar>
+        </w:tblPrEx>
+        <w:tc>
+          <w:tcPr>
+            <w:tcW w:w="900" w:type="dxa"/>
+            <w:vAlign w:val="center"/>
+          </w:tcPr>
+          <w:p>
+            <w:r>
+              <w:rPr>
+                <w:color w:val="000000"/>
+              </w:rPr>
+              <w:t>CP-08</w:t>
+            </w:r>
+          </w:p>
+        </w:tc>
+        <w:tc>
+          <w:tcPr>
+            <w:tcW w:w="1500" w:type="dxa"/>
+            <w:vAlign w:val="center"/>
+          </w:tcPr>
+          <w:p>
+            <w:r>
+              <w:rPr>
+                <w:color w:val="000000"/>
+              </w:rPr>
+              <w:t>HU-04</w:t>
+            </w:r>
+          </w:p>
+        </w:tc>
+        <w:tc>
+          <w:tcPr>
+            <w:tcW w:w="2200" w:type="dxa"/>
+            <w:vAlign w:val="center"/>
+          </w:tcPr>
+          <w:p>
+            <w:r>
+              <w:rPr>
+                <w:color w:val="000000"/>
+              </w:rPr>
+              <w:t>SKU inexistente</w:t>
+            </w:r>
+          </w:p>
+        </w:tc>
+        <w:tc>
+          <w:tcPr>
+            <w:tcW w:w="1400" w:type="dxa"/>
+            <w:vAlign w:val="center"/>
+          </w:tcPr>
+          <w:p>
+            <w:r>
+              <w:rPr>
+                <w:color w:val="000000"/>
+              </w:rPr>
+              <w:t>Equivalencia</w:t>
+            </w:r>
+          </w:p>
+        </w:tc>
+        <w:tc>
+          <w:tcPr>
+            <w:tcW w:w="900" w:type="dxa"/>
+            <w:vAlign w:val="center"/>
+          </w:tcPr>
+          <w:p>
+            <w:r>
+              <w:rPr>
+                <w:color w:val="000000"/>
+              </w:rPr>
+              <w:t>Media</w:t>
+            </w:r>
+          </w:p>
+        </w:tc>
+        <w:tc>
+          <w:tcPr>
+            <w:tcW w:w="2600" w:type="dxa"/>
+            <w:vAlign w:val="center"/>
+          </w:tcPr>
+          <w:p>
+            <w:r>
+              <w:rPr>
+                <w:color w:val="000000"/>
+              </w:rPr>
+              <w:t>Avisa sin resultados</w:t>
+            </w:r>
+          </w:p>
+        </w:tc>
+        <w:tc>
+          <w:tcPr>
+            <w:tcW w:w="900" w:type="dxa"/>
+            <w:vAlign w:val="center"/>
+          </w:tcPr>
+          <w:p>
+            <w:r>
+              <w:rPr>
+                <w:color w:val="000000"/>
+              </w:rPr>
+              <w:t>—</w:t>
+            </w:r>
+          </w:p>
+        </w:tc>
+        <w:tc>
+          <w:tcPr>
+            <w:tcW w:w="1400" w:type="dxa"/>
+            <w:vAlign w:val="center"/>
+          </w:tcPr>
+          <w:p>
+            <w:r>
+              <w:rPr>
+                <w:color w:val="000000"/>
+              </w:rPr>
+              <w:t>Aprobado</w:t>
+            </w:r>
+          </w:p>
+        </w:tc>
+      </w:tr>
+      <w:tr>
+        <w:tblPrEx>
+          <w:tblCellMar>
+            <w:top w:w="0" w:type="dxa"/>
+            <w:bottom w:w="0" w:type="dxa"/>
+          </w:tblCellMar>
+        </w:tblPrEx>
+        <w:tc>
+          <w:tcPr>
+            <w:tcW w:w="900" w:type="dxa"/>
+            <w:vAlign w:val="center"/>
+          </w:tcPr>
+          <w:p>
+            <w:r>
+              <w:rPr>
+                <w:color w:val="000000"/>
+              </w:rPr>
+              <w:t>CP-09</w:t>
+            </w:r>
+          </w:p>
+        </w:tc>
+        <w:tc>
+          <w:tcPr>
+            <w:tcW w:w="1500" w:type="dxa"/>
+            <w:vAlign w:val="center"/>
+          </w:tcPr>
+          <w:p>
+            <w:r>
+              <w:rPr>
+                <w:color w:val="000000"/>
+              </w:rPr>
+              <w:t>HU-05 / RN-02</w:t>
+            </w:r>
+          </w:p>
+        </w:tc>
+        <w:tc>
+          <w:tcPr>
+            <w:tcW w:w="2200" w:type="dxa"/>
+            <w:vAlign w:val="center"/>
+          </w:tcPr>
+          <w:p>
+            <w:r>
+              <w:rPr>
+                <w:color w:val="000000"/>
+              </w:rPr>
+              <w:t>Cantidad 1</w:t>
+            </w:r>
+          </w:p>
+        </w:tc>
+        <w:tc>
+          <w:tcPr>
+            <w:tcW w:w="1400" w:type="dxa"/>
+            <w:vAlign w:val="center"/>
+          </w:tcPr>
+          <w:p>
+            <w:r>
+              <w:rPr>
+                <w:color w:val="000000"/>
+              </w:rPr>
+              <w:t>Valores límite</w:t>
+            </w:r>
+          </w:p>
+        </w:tc>
+        <w:tc>
+          <w:tcPr>
+            <w:tcW w:w="900" w:type="dxa"/>
+            <w:vAlign w:val="center"/>
+          </w:tcPr>
+          <w:p>
+            <w:r>
+              <w:rPr>
+                <w:color w:val="000000"/>
+              </w:rPr>
+              <w:t>Alta</w:t>
+            </w:r>
+          </w:p>
+        </w:tc>
+        <w:tc>
+          <w:tcPr>
+            <w:tcW w:w="2600" w:type="dxa"/>
+            <w:vAlign w:val="center"/>
+          </w:tcPr>
+          <w:p>
+            <w:r>
+              <w:rPr>
+                <w:color w:val="000000"/>
+              </w:rPr>
+              <w:t>Lo agrega</w:t>
+            </w:r>
+          </w:p>
+        </w:tc>
+        <w:tc>
+          <w:tcPr>
+            <w:tcW w:w="900" w:type="dxa"/>
+            <w:vAlign w:val="center"/>
+          </w:tcPr>
+          <w:p>
+            <w:r>
+              <w:rPr>
+                <w:color w:val="000000"/>
+              </w:rPr>
+              <w:t>R-02</w:t>
+            </w:r>
+          </w:p>
+        </w:tc>
+        <w:tc>
+          <w:tcPr>
+            <w:tcW w:w="1400" w:type="dxa"/>
+            <w:vAlign w:val="center"/>
+          </w:tcPr>
+          <w:p>
+            <w:r>
+              <w:rPr>
+                <w:color w:val="000000"/>
+              </w:rPr>
+              <w:t>Aprobado</w:t>
+            </w:r>
+          </w:p>
+        </w:tc>
+      </w:tr>
+      <w:tr>
+        <w:tblPrEx>
+          <w:tblCellMar>
+            <w:top w:w="0" w:type="dxa"/>
+            <w:bottom w:w="0" w:type="dxa"/>
+          </w:tblCellMar>
+        </w:tblPrEx>
+        <w:tc>
+          <w:tcPr>
+            <w:tcW w:w="900" w:type="dxa"/>
+            <w:vAlign w:val="center"/>
+          </w:tcPr>
+          <w:p>
+            <w:r>
+              <w:rPr>
+                <w:color w:val="000000"/>
+              </w:rPr>
+              <w:t>CP-10</w:t>
+            </w:r>
+          </w:p>
+        </w:tc>
+        <w:tc>
+          <w:tcPr>
+            <w:tcW w:w="1500" w:type="dxa"/>
+            <w:vAlign w:val="center"/>
+          </w:tcPr>
+          <w:p>
+            <w:r>
+              <w:rPr>
+                <w:color w:val="000000"/>
+              </w:rPr>
+              <w:t>HU-05 / RN-02</w:t>
+            </w:r>
+          </w:p>
+        </w:tc>
+        <w:tc>
+          <w:tcPr>
+            <w:tcW w:w="2200" w:type="dxa"/>
+            <w:vAlign w:val="center"/>
+          </w:tcPr>
+          <w:p>
+            <w:r>
+              <w:rPr>
+                <w:color w:val="000000"/>
+              </w:rPr>
+              <w:t>Cantidad 99</w:t>
+            </w:r>
+          </w:p>
+        </w:tc>
+        <w:tc>
+          <w:tcPr>
+            <w:tcW w:w="1400" w:type="dxa"/>
+            <w:vAlign w:val="center"/>
+          </w:tcPr>
+          <w:p>
+            <w:r>
+              <w:rPr>
+                <w:color w:val="000000"/>
+              </w:rPr>
+              <w:t>Valores límite</w:t>
+            </w:r>
+          </w:p>
+        </w:tc>
+        <w:tc>
+          <w:tcPr>
+            <w:tcW w:w="900" w:type="dxa"/>
+            <w:vAlign w:val="center"/>
+          </w:tcPr>
+          <w:p>
+            <w:r>
+              <w:rPr>
+                <w:color w:val="000000"/>
+              </w:rPr>
+              <w:t>Alta</w:t>
+            </w:r>
+          </w:p>
+        </w:tc>
+        <w:tc>
+          <w:tcPr>
+            <w:tcW w:w="2600" w:type="dxa"/>
+            <w:vAlign w:val="center"/>
+          </w:tcPr>
+          <w:p>
+            <w:r>
+              <w:rPr>
+                <w:color w:val="000000"/>
+              </w:rPr>
+              <w:t>Lo agrega</w:t>
+            </w:r>
+          </w:p>
+        </w:tc>
+        <w:tc>
+          <w:tcPr>
+            <w:tcW w:w="900" w:type="dxa"/>
+            <w:vAlign w:val="center"/>
+          </w:tcPr>
+          <w:p>
+            <w:r>
+              <w:rPr>
+                <w:color w:val="000000"/>
+              </w:rPr>
+              <w:t>R-02</w:t>
+            </w:r>
+          </w:p>
+        </w:tc>
+        <w:tc>
+          <w:tcPr>
+            <w:tcW w:w="1400" w:type="dxa"/>
+            <w:vAlign w:val="center"/>
+          </w:tcPr>
+          <w:p>
+            <w:r>
+              <w:rPr>
+                <w:color w:val="000000"/>
+              </w:rPr>
+              <w:t>Aprobado</w:t>
+            </w:r>
+          </w:p>
+        </w:tc>
+      </w:tr>
+      <w:tr>
+        <w:tblPrEx>
+          <w:tblCellMar>
+            <w:top w:w="0" w:type="dxa"/>
+            <w:bottom w:w="0" w:type="dxa"/>
+          </w:tblCellMar>
+        </w:tblPrEx>
+        <w:tc>
+          <w:tcPr>
+            <w:tcW w:w="900" w:type="dxa"/>
+            <w:vAlign w:val="center"/>
+          </w:tcPr>
+          <w:p>
+            <w:r>
+              <w:rPr>
+                <w:color w:val="000000"/>
+              </w:rPr>
+              <w:t>CP-11</w:t>
+            </w:r>
+          </w:p>
+        </w:tc>
+        <w:tc>
+          <w:tcPr>
+            <w:tcW w:w="1500" w:type="dxa"/>
+            <w:vAlign w:val="center"/>
+          </w:tcPr>
+          <w:p>
+            <w:r>
+              <w:rPr>
+                <w:color w:val="000000"/>
+              </w:rPr>
+              <w:t>HU-05 / RN-02</w:t>
+            </w:r>
+          </w:p>
+        </w:tc>
+        <w:tc>
+          <w:tcPr>
+            <w:tcW w:w="2200" w:type="dxa"/>
+            <w:vAlign w:val="center"/>
+          </w:tcPr>
+          <w:p>
+            <w:r>
+              <w:rPr>
+                <w:color w:val="000000"/>
+              </w:rPr>
+              <w:t>Cantidad 0</w:t>
+            </w:r>
+          </w:p>
+        </w:tc>
+        <w:tc>
+          <w:tcPr>
+            <w:tcW w:w="1400" w:type="dxa"/>
+            <w:vAlign w:val="center"/>
+          </w:tcPr>
+          <w:p>
+            <w:r>
+              <w:rPr>
+                <w:color w:val="000000"/>
+              </w:rPr>
+              <w:t>Valores límite</w:t>
+            </w:r>
+          </w:p>
+        </w:tc>
+        <w:tc>
+          <w:tcPr>
+            <w:tcW w:w="900" w:type="dxa"/>
+            <w:vAlign w:val="center"/>
+          </w:tcPr>
+          <w:p>
+            <w:r>
+              <w:rPr>
+                <w:color w:val="000000"/>
+              </w:rPr>
+              <w:t>Alta</w:t>
+            </w:r>
+          </w:p>
+        </w:tc>
+        <w:tc>
+          <w:tcPr>
+            <w:tcW w:w="2600" w:type="dxa"/>
+            <w:vAlign w:val="center"/>
+          </w:tcPr>
+          <w:p>
+            <w:r>
+              <w:rPr>
+                <w:color w:val="000000"/>
+              </w:rPr>
+              <w:t>Lo rechaza</w:t>
+            </w:r>
+          </w:p>
+        </w:tc>
+        <w:tc>
+          <w:tcPr>
+            <w:tcW w:w="900" w:type="dxa"/>
+            <w:vAlign w:val="center"/>
+          </w:tcPr>
+          <w:p>
+            <w:r>
+              <w:rPr>
+                <w:color w:val="000000"/>
+              </w:rPr>
+              <w:t>R-02</w:t>
+            </w:r>
+          </w:p>
+        </w:tc>
+        <w:tc>
+          <w:tcPr>
+            <w:tcW w:w="1400" w:type="dxa"/>
+            <w:vAlign w:val="center"/>
+          </w:tcPr>
+          <w:p>
+            <w:r>
+              <w:rPr>
+                <w:color w:val="000000"/>
+              </w:rPr>
+              <w:t>Aprobado</w:t>
+            </w:r>
+          </w:p>
+        </w:tc>
+      </w:tr>
+      <w:tr>
+        <w:tblPrEx>
+          <w:tblCellMar>
+            <w:top w:w="0" w:type="dxa"/>
+            <w:bottom w:w="0" w:type="dxa"/>
+          </w:tblCellMar>
+        </w:tblPrEx>
+        <w:tc>
+          <w:tcPr>
+            <w:tcW w:w="900" w:type="dxa"/>
+            <w:vAlign w:val="center"/>
+          </w:tcPr>
+          <w:p>
+            <w:r>
+              <w:rPr>
+                <w:color w:val="000000"/>
+              </w:rPr>
+              <w:t>CP-12</w:t>
+            </w:r>
+          </w:p>
+        </w:tc>
+        <w:tc>
+          <w:tcPr>
+            <w:tcW w:w="1500" w:type="dxa"/>
+            <w:vAlign w:val="center"/>
+          </w:tcPr>
+          <w:p>
+            <w:r>
+              <w:rPr>
+                <w:color w:val="000000"/>
+              </w:rPr>
+              <w:t>HU-05 / RN-02</w:t>
+            </w:r>
+          </w:p>
+        </w:tc>
+        <w:tc>
+          <w:tcPr>
+            <w:tcW w:w="2200" w:type="dxa"/>
+            <w:vAlign w:val="center"/>
+          </w:tcPr>
+          <w:p>
+            <w:r>
+              <w:rPr>
+                <w:color w:val="000000"/>
+              </w:rPr>
+              <w:t>Cantidad 100</w:t>
+            </w:r>
+          </w:p>
+        </w:tc>
+        <w:tc>
+          <w:tcPr>
+            <w:tcW w:w="1400" w:type="dxa"/>
+            <w:vAlign w:val="center"/>
+          </w:tcPr>
+          <w:p>
+            <w:r>
+              <w:rPr>
+                <w:color w:val="000000"/>
+              </w:rPr>
+              <w:t>Valores límite</w:t>
+            </w:r>
+          </w:p>
+        </w:tc>
+        <w:tc>
+          <w:tcPr>
+            <w:tcW w:w="900" w:type="dxa"/>
+            <w:vAlign w:val="center"/>
+          </w:tcPr>
+          <w:p>
+            <w:r>
+              <w:rPr>
+                <w:color w:val="000000"/>
+              </w:rPr>
+              <w:t>Alta</w:t>
+            </w:r>
+          </w:p>
+        </w:tc>
+        <w:tc>
+          <w:tcPr>
+            <w:tcW w:w="2600" w:type="dxa"/>
+            <w:vAlign w:val="center"/>
+          </w:tcPr>
+          <w:p>
+            <w:r>
+              <w:rPr>
+                <w:color w:val="000000"/>
+              </w:rPr>
+              <w:t>Lo rechaza</w:t>
+            </w:r>
+          </w:p>
+        </w:tc>
+        <w:tc>
+          <w:tcPr>
+            <w:tcW w:w="900" w:type="dxa"/>
+            <w:vAlign w:val="center"/>
+          </w:tcPr>
+          <w:p>
+            <w:r>
+              <w:rPr>
+                <w:color w:val="000000"/>
+              </w:rPr>
+              <w:t>R-02</w:t>
+            </w:r>
+          </w:p>
+        </w:tc>
+        <w:tc>
+          <w:tcPr>
+            <w:tcW w:w="1400" w:type="dxa"/>
+            <w:vAlign w:val="center"/>
+          </w:tcPr>
+          <w:p>
+            <w:r>
+              <w:rPr>
+                <w:color w:val="000000"/>
+              </w:rPr>
+              <w:t>Aprobado</w:t>
+            </w:r>
+          </w:p>
+        </w:tc>
+      </w:tr>
+      <w:tr>
+        <w:tblPrEx>
+          <w:tblCellMar>
+            <w:top w:w="0" w:type="dxa"/>
+            <w:bottom w:w="0" w:type="dxa"/>
+          </w:tblCellMar>
+        </w:tblPrEx>
+        <w:tc>
+          <w:tcPr>
+            <w:tcW w:w="900" w:type="dxa"/>
+            <w:vAlign w:val="center"/>
+          </w:tcPr>
+          <w:p>
+            <w:r>
+              <w:rPr>
+                <w:color w:val="000000"/>
+              </w:rPr>
+              <w:t>CP-13</w:t>
+            </w:r>
+          </w:p>
+        </w:tc>
+        <w:tc>
+          <w:tcPr>
+            <w:tcW w:w="1500" w:type="dxa"/>
+            <w:vAlign w:val="center"/>
+          </w:tcPr>
+          <w:p>
+            <w:r>
+              <w:rPr>
+                <w:color w:val="000000"/>
+              </w:rPr>
+              <w:t>HU-05 / RN-02</w:t>
+            </w:r>
+          </w:p>
+        </w:tc>
+        <w:tc>
+          <w:tcPr>
+            <w:tcW w:w="2200" w:type="dxa"/>
+            <w:vAlign w:val="center"/>
+          </w:tcPr>
+          <w:p>
+            <w:r>
+              <w:rPr>
+                <w:color w:val="000000"/>
+              </w:rPr>
+              <w:t>Cantidad con letras</w:t>
+            </w:r>
+          </w:p>
+        </w:tc>
+        <w:tc>
+          <w:tcPr>
+            <w:tcW w:w="1400" w:type="dxa"/>
+            <w:vAlign w:val="center"/>
+          </w:tcPr>
+          <w:p>
+            <w:r>
+              <w:rPr>
+                <w:color w:val="000000"/>
+              </w:rPr>
+              <w:t>Equivalencia</w:t>
+            </w:r>
+          </w:p>
+        </w:tc>
+        <w:tc>
+          <w:tcPr>
+            <w:tcW w:w="900" w:type="dxa"/>
+            <w:vAlign w:val="center"/>
+          </w:tcPr>
+          <w:p>
+            <w:r>
+              <w:rPr>
+                <w:color w:val="000000"/>
+              </w:rPr>
+              <w:t>Media</w:t>
+            </w:r>
+          </w:p>
+        </w:tc>
+        <w:tc>
+          <w:tcPr>
+            <w:tcW w:w="2600" w:type="dxa"/>
+            <w:vAlign w:val="center"/>
+          </w:tcPr>
+          <w:p>
+            <w:r>
+              <w:rPr>
+                <w:color w:val="000000"/>
+              </w:rPr>
+              <w:t>Lo rechaza</w:t>
+            </w:r>
+          </w:p>
+        </w:tc>
+        <w:tc>
+          <w:tcPr>
+            <w:tcW w:w="900" w:type="dxa"/>
+            <w:vAlign w:val="center"/>
+          </w:tcPr>
+          <w:p>
+            <w:r>
+              <w:rPr>
+                <w:color w:val="000000"/>
+              </w:rPr>
+              <w:t>R-02</w:t>
+            </w:r>
+          </w:p>
+        </w:tc>
+        <w:tc>
+          <w:tcPr>
+            <w:tcW w:w="1400" w:type="dxa"/>
+            <w:vAlign w:val="center"/>
+          </w:tcPr>
+          <w:p>
+            <w:r>
+              <w:rPr>
+                <w:color w:val="000000"/>
+              </w:rPr>
+              <w:t>Aprobado</w:t>
+            </w:r>
+          </w:p>
+        </w:tc>
+      </w:tr>
+      <w:tr>
+        <w:tblPrEx>
+          <w:tblCellMar>
+            <w:top w:w="0" w:type="dxa"/>
+            <w:bottom w:w="0" w:type="dxa"/>
+          </w:tblCellMar>
+        </w:tblPrEx>
+        <w:tc>
+          <w:tcPr>
+            <w:tcW w:w="900" w:type="dxa"/>
+            <w:vAlign w:val="center"/>
+          </w:tcPr>
+          <w:p>
+            <w:r>
+              <w:rPr>
+                <w:color w:val="000000"/>
+              </w:rPr>
+              <w:t>CP-14</w:t>
+            </w:r>
+          </w:p>
+        </w:tc>
+        <w:tc>
+          <w:tcPr>
+            <w:tcW w:w="1500" w:type="dxa"/>
+            <w:vAlign w:val="center"/>
+          </w:tcPr>
+          <w:p>
+            <w:r>
+              <w:rPr>
+                <w:color w:val="000000"/>
+              </w:rPr>
+              <w:t>HU-05 / RN-03</w:t>
+            </w:r>
+          </w:p>
+        </w:tc>
+        <w:tc>
+          <w:tcPr>
+            <w:tcW w:w="2200" w:type="dxa"/>
+            <w:vAlign w:val="center"/>
+          </w:tcPr>
+          <w:p>
+            <w:r>
+              <w:rPr>
+                <w:color w:val="000000"/>
+              </w:rPr>
+              <w:t>Producto agotado</w:t>
+            </w:r>
+          </w:p>
+        </w:tc>
+        <w:tc>
+          <w:tcPr>
+            <w:tcW w:w="1400" w:type="dxa"/>
+            <w:vAlign w:val="center"/>
+          </w:tcPr>
+          <w:p>
+            <w:r>
+              <w:rPr>
+                <w:color w:val="000000"/>
+              </w:rPr>
+              <w:t>Negativa</w:t>
+            </w:r>
+          </w:p>
+        </w:tc>
+        <w:tc>
+          <w:tcPr>
+            <w:tcW w:w="900" w:type="dxa"/>
+            <w:vAlign w:val="center"/>
+          </w:tcPr>
+          <w:p>
+            <w:r>
+              <w:rPr>
+                <w:color w:val="000000"/>
+              </w:rPr>
+              <w:t>Alta</w:t>
+            </w:r>
+          </w:p>
+        </w:tc>
+        <w:tc>
+          <w:tcPr>
+            <w:tcW w:w="2600" w:type="dxa"/>
+            <w:vAlign w:val="center"/>
+          </w:tcPr>
+          <w:p>
+            <w:r>
+              <w:rPr>
+                <w:color w:val="000000"/>
+              </w:rPr>
+              <w:t>No lo agrega</w:t>
+            </w:r>
+          </w:p>
+        </w:tc>
+        <w:tc>
+          <w:tcPr>
+            <w:tcW w:w="900" w:type="dxa"/>
+            <w:vAlign w:val="center"/>
+          </w:tcPr>
+          <w:p>
+            <w:r>
+              <w:rPr>
+                <w:color w:val="000000"/>
+              </w:rPr>
+              <w:t>R-06</w:t>
+            </w:r>
+          </w:p>
+        </w:tc>
+        <w:tc>
+          <w:tcPr>
+            <w:tcW w:w="1400" w:type="dxa"/>
+            <w:vAlign w:val="center"/>
+          </w:tcPr>
+          <w:p>
+            <w:r>
+              <w:rPr>
+                <w:color w:val="000000"/>
+              </w:rPr>
+              <w:t>Aprobado</w:t>
+            </w:r>
+          </w:p>
+        </w:tc>
+      </w:tr>
+      <w:tr>
+        <w:tblPrEx>
+          <w:tblCellMar>
+            <w:top w:w="0" w:type="dxa"/>
+            <w:bottom w:w="0" w:type="dxa"/>
+          </w:tblCellMar>
+        </w:tblPrEx>
+        <w:tc>
+          <w:tcPr>
+            <w:tcW w:w="900" w:type="dxa"/>
+            <w:vAlign w:val="center"/>
+          </w:tcPr>
+          <w:p>
+            <w:r>
+              <w:rPr>
+                <w:color w:val="000000"/>
+              </w:rPr>
+              <w:t>CP-15</w:t>
+            </w:r>
+          </w:p>
+        </w:tc>
+        <w:tc>
+          <w:tcPr>
+            <w:tcW w:w="1500" w:type="dxa"/>
+            <w:vAlign w:val="center"/>
+          </w:tcPr>
+          <w:p>
+            <w:r>
+              <w:rPr>
+                <w:color w:val="000000"/>
+              </w:rPr>
+              <w:t>HU-06</w:t>
+            </w:r>
+          </w:p>
+        </w:tc>
+        <w:tc>
+          <w:tcPr>
+            <w:tcW w:w="2200" w:type="dxa"/>
+            <w:vAlign w:val="center"/>
+          </w:tcPr>
+          <w:p>
+            <w:r>
+              <w:rPr>
+                <w:color w:val="000000"/>
+              </w:rPr>
+              <w:t>Eliminar una línea</w:t>
+            </w:r>
+          </w:p>
+        </w:tc>
+        <w:tc>
+          <w:tcPr>
+            <w:tcW w:w="1400" w:type="dxa"/>
+            <w:vAlign w:val="center"/>
+          </w:tcPr>
+          <w:p>
+            <w:r>
+              <w:rPr>
+                <w:color w:val="000000"/>
+              </w:rPr>
+              <w:t>Positiva</w:t>
+            </w:r>
+          </w:p>
+        </w:tc>
+        <w:tc>
+          <w:tcPr>
+            <w:tcW w:w="900" w:type="dxa"/>
+            <w:vAlign w:val="center"/>
+          </w:tcPr>
+          <w:p>
+            <w:r>
+              <w:rPr>
+                <w:color w:val="000000"/>
+              </w:rPr>
+              <w:t>Alta</w:t>
+            </w:r>
+          </w:p>
+        </w:tc>
+        <w:tc>
+          <w:tcPr>
+            <w:tcW w:w="2600" w:type="dxa"/>
+            <w:vAlign w:val="center"/>
+          </w:tcPr>
+          <w:p>
+            <w:r>
+              <w:rPr>
+                <w:color w:val="000000"/>
+              </w:rPr>
+              <w:t>Recalcula el total</w:t>
+            </w:r>
+          </w:p>
+        </w:tc>
+        <w:tc>
+          <w:tcPr>
+            <w:tcW w:w="900" w:type="dxa"/>
+            <w:vAlign w:val="center"/>
+          </w:tcPr>
+          <w:p>
+            <w:r>
+              <w:rPr>
+                <w:color w:val="000000"/>
+              </w:rPr>
+              <w:t>R-07</w:t>
+            </w:r>
+          </w:p>
+        </w:tc>
+        <w:tc>
+          <w:tcPr>
+            <w:tcW w:w="1400" w:type="dxa"/>
+            <w:vAlign w:val="center"/>
+          </w:tcPr>
+          <w:p>
+            <w:r>
+              <w:rPr>
+                <w:color w:val="000000"/>
+              </w:rPr>
               <w:t>No ejecutado</w:t>
             </w:r>
           </w:p>
@@ -7532,7 +8852,7 @@
               <w:rPr>
                 <w:color w:val="000000"/>
               </w:rPr>
-              <w:t>CP-05</w:t>
+              <w:t>CP-16</w:t>
             </w:r>
           </w:p>
         </w:tc>
@@ -7546,7 +8866,7 @@
               <w:rPr>
                 <w:color w:val="000000"/>
               </w:rPr>
-              <w:t>HU-02</w:t>
+              <w:t>HU-07 / RN-01</w:t>
             </w:r>
           </w:p>
         </w:tc>
@@ -7560,7 +8880,7 @@
               <w:rPr>
                 <w:color w:val="000000"/>
               </w:rPr>
-              <w:t>URL sin sesión</w:t>
+              <w:t>Enviar con Q399.99</w:t>
             </w:r>
           </w:p>
         </w:tc>
@@ -7574,7 +8894,7 @@
               <w:rPr>
                 <w:color w:val="000000"/>
               </w:rPr>
-              <w:t>Negativa</w:t>
+              <w:t>Valores límite</w:t>
             </w:r>
           </w:p>
         </w:tc>
@@ -7588,7 +8908,7 @@
               <w:rPr>
                 <w:color w:val="000000"/>
               </w:rPr>
-              <w:t>Alta</w:t>
+              <w:t>Crítica</w:t>
             </w:r>
           </w:p>
         </w:tc>
@@ -7602,7 +8922,7 @@
               <w:rPr>
                 <w:color w:val="000000"/>
               </w:rPr>
-              <w:t>Manda al login</w:t>
+              <w:t>No deja, dice cuánto falta</w:t>
             </w:r>
           </w:p>
         </w:tc>
@@ -7616,7 +8936,7 @@
               <w:rPr>
                 <w:color w:val="000000"/>
               </w:rPr>
-              <w:t>R-04</w:t>
+              <w:t>R-01</w:t>
             </w:r>
           </w:p>
         </w:tc>
@@ -7630,7 +8950,7 @@
               <w:rPr>
                 <w:color w:val="000000"/>
               </w:rPr>
-              <w:t>No ejecutado</w:t>
+              <w:t>Aprobado</w:t>
             </w:r>
           </w:p>
         </w:tc>
@@ -7652,7 +8972,7 @@
               <w:rPr>
                 <w:color w:val="000000"/>
               </w:rPr>
-              <w:t>CP-06</w:t>
+              <w:t>CP-17</w:t>
             </w:r>
           </w:p>
         </w:tc>
@@ -7666,7 +8986,7 @@
               <w:rPr>
                 <w:color w:val="000000"/>
               </w:rPr>
-              <w:t>HU-03 / RN-03</w:t>
+              <w:t>HU-07 / RN-01</w:t>
             </w:r>
           </w:p>
         </w:tc>
@@ -7680,7 +9000,7 @@
               <w:rPr>
                 <w:color w:val="000000"/>
               </w:rPr>
-              <w:t>Agotados marcados</w:t>
+              <w:t>Enviar con Q400.00</w:t>
             </w:r>
           </w:p>
         </w:tc>
@@ -7694,7 +9014,7 @@
               <w:rPr>
                 <w:color w:val="000000"/>
               </w:rPr>
-              <w:t>Positiva</w:t>
+              <w:t>Valores límite</w:t>
             </w:r>
           </w:p>
         </w:tc>
@@ -7708,7 +9028,7 @@
               <w:rPr>
                 <w:color w:val="000000"/>
               </w:rPr>
-              <w:t>Media</w:t>
+              <w:t>Crítica</w:t>
             </w:r>
           </w:p>
         </w:tc>
@@ -7722,7 +9042,7 @@
               <w:rPr>
                 <w:color w:val="000000"/>
               </w:rPr>
-              <w:t>8 productos, 2 marcados</w:t>
+              <w:t>Envía y da el número</w:t>
             </w:r>
           </w:p>
         </w:tc>
@@ -7736,7 +9056,7 @@
               <w:rPr>
                 <w:color w:val="000000"/>
               </w:rPr>
-              <w:t>R-06</w:t>
+              <w:t>R-01</w:t>
             </w:r>
           </w:p>
         </w:tc>
@@ -7750,1327 +9070,7 @@
               <w:rPr>
                 <w:color w:val="000000"/>
               </w:rPr>
-              <w:t>No ejecutado</w:t>
-            </w:r>
-          </w:p>
-        </w:tc>
-      </w:tr>
-      <w:tr>
-        <w:tblPrEx>
-          <w:tblCellMar>
-            <w:top w:w="0" w:type="dxa"/>
-            <w:bottom w:w="0" w:type="dxa"/>
-          </w:tblCellMar>
-        </w:tblPrEx>
-        <w:tc>
-          <w:tcPr>
-            <w:tcW w:w="900" w:type="dxa"/>
-            <w:vAlign w:val="center"/>
-          </w:tcPr>
-          <w:p>
-            <w:r>
-              <w:rPr>
-                <w:color w:val="000000"/>
-              </w:rPr>
-              <w:t>CP-07</w:t>
-            </w:r>
-          </w:p>
-        </w:tc>
-        <w:tc>
-          <w:tcPr>
-            <w:tcW w:w="1500" w:type="dxa"/>
-            <w:vAlign w:val="center"/>
-          </w:tcPr>
-          <w:p>
-            <w:r>
-              <w:rPr>
-                <w:color w:val="000000"/>
-              </w:rPr>
-              <w:t>HU-04</w:t>
-            </w:r>
-          </w:p>
-        </w:tc>
-        <w:tc>
-          <w:tcPr>
-            <w:tcW w:w="2200" w:type="dxa"/>
-            <w:vAlign w:val="center"/>
-          </w:tcPr>
-          <w:p>
-            <w:r>
-              <w:rPr>
-                <w:color w:val="000000"/>
-              </w:rPr>
-              <w:t>SKU existente</w:t>
-            </w:r>
-          </w:p>
-        </w:tc>
-        <w:tc>
-          <w:tcPr>
-            <w:tcW w:w="1400" w:type="dxa"/>
-            <w:vAlign w:val="center"/>
-          </w:tcPr>
-          <w:p>
-            <w:r>
-              <w:rPr>
-                <w:color w:val="000000"/>
-              </w:rPr>
-              <w:t>Equivalencia</w:t>
-            </w:r>
-          </w:p>
-        </w:tc>
-        <w:tc>
-          <w:tcPr>
-            <w:tcW w:w="900" w:type="dxa"/>
-            <w:vAlign w:val="center"/>
-          </w:tcPr>
-          <w:p>
-            <w:r>
-              <w:rPr>
-                <w:color w:val="000000"/>
-              </w:rPr>
-              <w:t>Media</w:t>
-            </w:r>
-          </w:p>
-        </w:tc>
-        <w:tc>
-          <w:tcPr>
-            <w:tcW w:w="2600" w:type="dxa"/>
-            <w:vAlign w:val="center"/>
-          </w:tcPr>
-          <w:p>
-            <w:r>
-              <w:rPr>
-                <w:color w:val="000000"/>
-              </w:rPr>
-              <w:t>Muestra ese producto</w:t>
-            </w:r>
-          </w:p>
-        </w:tc>
-        <w:tc>
-          <w:tcPr>
-            <w:tcW w:w="900" w:type="dxa"/>
-            <w:vAlign w:val="center"/>
-          </w:tcPr>
-          <w:p>
-            <w:r>
-              <w:rPr>
-                <w:color w:val="000000"/>
-              </w:rPr>
-              <w:t>—</w:t>
-            </w:r>
-          </w:p>
-        </w:tc>
-        <w:tc>
-          <w:tcPr>
-            <w:tcW w:w="1400" w:type="dxa"/>
-            <w:vAlign w:val="center"/>
-          </w:tcPr>
-          <w:p>
-            <w:r>
-              <w:rPr>
-                <w:color w:val="000000"/>
-              </w:rPr>
-              <w:t>No ejecutado</w:t>
-            </w:r>
-          </w:p>
-        </w:tc>
-      </w:tr>
-      <w:tr>
-        <w:tblPrEx>
-          <w:tblCellMar>
-            <w:top w:w="0" w:type="dxa"/>
-            <w:bottom w:w="0" w:type="dxa"/>
-          </w:tblCellMar>
-        </w:tblPrEx>
-        <w:tc>
-          <w:tcPr>
-            <w:tcW w:w="900" w:type="dxa"/>
-            <w:vAlign w:val="center"/>
-          </w:tcPr>
-          <w:p>
-            <w:r>
-              <w:rPr>
-                <w:color w:val="000000"/>
-              </w:rPr>
-              <w:t>CP-08</w:t>
-            </w:r>
-          </w:p>
-        </w:tc>
-        <w:tc>
-          <w:tcPr>
-            <w:tcW w:w="1500" w:type="dxa"/>
-            <w:vAlign w:val="center"/>
-          </w:tcPr>
-          <w:p>
-            <w:r>
-              <w:rPr>
-                <w:color w:val="000000"/>
-              </w:rPr>
-              <w:t>HU-04</w:t>
-            </w:r>
-          </w:p>
-        </w:tc>
-        <w:tc>
-          <w:tcPr>
-            <w:tcW w:w="2200" w:type="dxa"/>
-            <w:vAlign w:val="center"/>
-          </w:tcPr>
-          <w:p>
-            <w:r>
-              <w:rPr>
-                <w:color w:val="000000"/>
-              </w:rPr>
-              <w:t>SKU inexistente</w:t>
-            </w:r>
-          </w:p>
-        </w:tc>
-        <w:tc>
-          <w:tcPr>
-            <w:tcW w:w="1400" w:type="dxa"/>
-            <w:vAlign w:val="center"/>
-          </w:tcPr>
-          <w:p>
-            <w:r>
-              <w:rPr>
-                <w:color w:val="000000"/>
-              </w:rPr>
-              <w:t>Equivalencia</w:t>
-            </w:r>
-          </w:p>
-        </w:tc>
-        <w:tc>
-          <w:tcPr>
-            <w:tcW w:w="900" w:type="dxa"/>
-            <w:vAlign w:val="center"/>
-          </w:tcPr>
-          <w:p>
-            <w:r>
-              <w:rPr>
-                <w:color w:val="000000"/>
-              </w:rPr>
-              <w:t>Media</w:t>
-            </w:r>
-          </w:p>
-        </w:tc>
-        <w:tc>
-          <w:tcPr>
-            <w:tcW w:w="2600" w:type="dxa"/>
-            <w:vAlign w:val="center"/>
-          </w:tcPr>
-          <w:p>
-            <w:r>
-              <w:rPr>
-                <w:color w:val="000000"/>
-              </w:rPr>
-              <w:t>Avisa sin resultados</w:t>
-            </w:r>
-          </w:p>
-        </w:tc>
-        <w:tc>
-          <w:tcPr>
-            <w:tcW w:w="900" w:type="dxa"/>
-            <w:vAlign w:val="center"/>
-          </w:tcPr>
-          <w:p>
-            <w:r>
-              <w:rPr>
-                <w:color w:val="000000"/>
-              </w:rPr>
-              <w:t>—</w:t>
-            </w:r>
-          </w:p>
-        </w:tc>
-        <w:tc>
-          <w:tcPr>
-            <w:tcW w:w="1400" w:type="dxa"/>
-            <w:vAlign w:val="center"/>
-          </w:tcPr>
-          <w:p>
-            <w:r>
-              <w:rPr>
-                <w:color w:val="000000"/>
-              </w:rPr>
-              <w:t>No ejecutado</w:t>
-            </w:r>
-          </w:p>
-        </w:tc>
-      </w:tr>
-      <w:tr>
-        <w:tblPrEx>
-          <w:tblCellMar>
-            <w:top w:w="0" w:type="dxa"/>
-            <w:bottom w:w="0" w:type="dxa"/>
-          </w:tblCellMar>
-        </w:tblPrEx>
-        <w:tc>
-          <w:tcPr>
-            <w:tcW w:w="900" w:type="dxa"/>
-            <w:vAlign w:val="center"/>
-          </w:tcPr>
-          <w:p>
-            <w:r>
-              <w:rPr>
-                <w:color w:val="000000"/>
-              </w:rPr>
-              <w:t>CP-09</w:t>
-            </w:r>
-          </w:p>
-        </w:tc>
-        <w:tc>
-          <w:tcPr>
-            <w:tcW w:w="1500" w:type="dxa"/>
-            <w:vAlign w:val="center"/>
-          </w:tcPr>
-          <w:p>
-            <w:r>
-              <w:rPr>
-                <w:color w:val="000000"/>
-              </w:rPr>
-              <w:t>HU-05 / RN-02</w:t>
-            </w:r>
-          </w:p>
-        </w:tc>
-        <w:tc>
-          <w:tcPr>
-            <w:tcW w:w="2200" w:type="dxa"/>
-            <w:vAlign w:val="center"/>
-          </w:tcPr>
-          <w:p>
-            <w:r>
-              <w:rPr>
-                <w:color w:val="000000"/>
-              </w:rPr>
-              <w:t>Cantidad 1</w:t>
-            </w:r>
-          </w:p>
-        </w:tc>
-        <w:tc>
-          <w:tcPr>
-            <w:tcW w:w="1400" w:type="dxa"/>
-            <w:vAlign w:val="center"/>
-          </w:tcPr>
-          <w:p>
-            <w:r>
-              <w:rPr>
-                <w:color w:val="000000"/>
-              </w:rPr>
-              <w:t>Valores límite</w:t>
-            </w:r>
-          </w:p>
-        </w:tc>
-        <w:tc>
-          <w:tcPr>
-            <w:tcW w:w="900" w:type="dxa"/>
-            <w:vAlign w:val="center"/>
-          </w:tcPr>
-          <w:p>
-            <w:r>
-              <w:rPr>
-                <w:color w:val="000000"/>
-              </w:rPr>
-              <w:t>Alta</w:t>
-            </w:r>
-          </w:p>
-        </w:tc>
-        <w:tc>
-          <w:tcPr>
-            <w:tcW w:w="2600" w:type="dxa"/>
-            <w:vAlign w:val="center"/>
-          </w:tcPr>
-          <w:p>
-            <w:r>
-              <w:rPr>
-                <w:color w:val="000000"/>
-              </w:rPr>
-              <w:t>Lo agrega</w:t>
-            </w:r>
-          </w:p>
-        </w:tc>
-        <w:tc>
-          <w:tcPr>
-            <w:tcW w:w="900" w:type="dxa"/>
-            <w:vAlign w:val="center"/>
-          </w:tcPr>
-          <w:p>
-            <w:r>
-              <w:rPr>
-                <w:color w:val="000000"/>
-              </w:rPr>
-              <w:t>R-02</w:t>
-            </w:r>
-          </w:p>
-        </w:tc>
-        <w:tc>
-          <w:tcPr>
-            <w:tcW w:w="1400" w:type="dxa"/>
-            <w:vAlign w:val="center"/>
-          </w:tcPr>
-          <w:p>
-            <w:r>
-              <w:rPr>
-                <w:color w:val="000000"/>
-              </w:rPr>
-              <w:t>No ejecutado</w:t>
-            </w:r>
-          </w:p>
-        </w:tc>
-      </w:tr>
-      <w:tr>
-        <w:tblPrEx>
-          <w:tblCellMar>
-            <w:top w:w="0" w:type="dxa"/>
-            <w:bottom w:w="0" w:type="dxa"/>
-          </w:tblCellMar>
-        </w:tblPrEx>
-        <w:tc>
-          <w:tcPr>
-            <w:tcW w:w="900" w:type="dxa"/>
-            <w:vAlign w:val="center"/>
-          </w:tcPr>
-          <w:p>
-            <w:r>
-              <w:rPr>
-                <w:color w:val="000000"/>
-              </w:rPr>
-              <w:t>CP-10</w:t>
-            </w:r>
-          </w:p>
-        </w:tc>
-        <w:tc>
-          <w:tcPr>
-            <w:tcW w:w="1500" w:type="dxa"/>
-            <w:vAlign w:val="center"/>
-          </w:tcPr>
-          <w:p>
-            <w:r>
-              <w:rPr>
-                <w:color w:val="000000"/>
-              </w:rPr>
-              <w:t>HU-05 / RN-02</w:t>
-            </w:r>
-          </w:p>
-        </w:tc>
-        <w:tc>
-          <w:tcPr>
-            <w:tcW w:w="2200" w:type="dxa"/>
-            <w:vAlign w:val="center"/>
-          </w:tcPr>
-          <w:p>
-            <w:r>
-              <w:rPr>
-                <w:color w:val="000000"/>
-              </w:rPr>
-              <w:t>Cantidad 99</w:t>
-            </w:r>
-          </w:p>
-        </w:tc>
-        <w:tc>
-          <w:tcPr>
-            <w:tcW w:w="1400" w:type="dxa"/>
-            <w:vAlign w:val="center"/>
-          </w:tcPr>
-          <w:p>
-            <w:r>
-              <w:rPr>
-                <w:color w:val="000000"/>
-              </w:rPr>
-              <w:t>Valores límite</w:t>
-            </w:r>
-          </w:p>
-        </w:tc>
-        <w:tc>
-          <w:tcPr>
-            <w:tcW w:w="900" w:type="dxa"/>
-            <w:vAlign w:val="center"/>
-          </w:tcPr>
-          <w:p>
-            <w:r>
-              <w:rPr>
-                <w:color w:val="000000"/>
-              </w:rPr>
-              <w:t>Alta</w:t>
-            </w:r>
-          </w:p>
-        </w:tc>
-        <w:tc>
-          <w:tcPr>
-            <w:tcW w:w="2600" w:type="dxa"/>
-            <w:vAlign w:val="center"/>
-          </w:tcPr>
-          <w:p>
-            <w:r>
-              <w:rPr>
-                <w:color w:val="000000"/>
-              </w:rPr>
-              <w:t>Lo agrega</w:t>
-            </w:r>
-          </w:p>
-        </w:tc>
-        <w:tc>
-          <w:tcPr>
-            <w:tcW w:w="900" w:type="dxa"/>
-            <w:vAlign w:val="center"/>
-          </w:tcPr>
-          <w:p>
-            <w:r>
-              <w:rPr>
-                <w:color w:val="000000"/>
-              </w:rPr>
-              <w:t>R-02</w:t>
-            </w:r>
-          </w:p>
-        </w:tc>
-        <w:tc>
-          <w:tcPr>
-            <w:tcW w:w="1400" w:type="dxa"/>
-            <w:vAlign w:val="center"/>
-          </w:tcPr>
-          <w:p>
-            <w:r>
-              <w:rPr>
-                <w:color w:val="000000"/>
-              </w:rPr>
-              <w:t>No ejecutado</w:t>
-            </w:r>
-          </w:p>
-        </w:tc>
-      </w:tr>
-      <w:tr>
-        <w:tblPrEx>
-          <w:tblCellMar>
-            <w:top w:w="0" w:type="dxa"/>
-            <w:bottom w:w="0" w:type="dxa"/>
-          </w:tblCellMar>
-        </w:tblPrEx>
-        <w:tc>
-          <w:tcPr>
-            <w:tcW w:w="900" w:type="dxa"/>
-            <w:vAlign w:val="center"/>
-          </w:tcPr>
-          <w:p>
-            <w:r>
-              <w:rPr>
-                <w:color w:val="000000"/>
-              </w:rPr>
-              <w:t>CP-11</w:t>
-            </w:r>
-          </w:p>
-        </w:tc>
-        <w:tc>
-          <w:tcPr>
-            <w:tcW w:w="1500" w:type="dxa"/>
-            <w:vAlign w:val="center"/>
-          </w:tcPr>
-          <w:p>
-            <w:r>
-              <w:rPr>
-                <w:color w:val="000000"/>
-              </w:rPr>
-              <w:t>HU-05 / RN-02</w:t>
-            </w:r>
-          </w:p>
-        </w:tc>
-        <w:tc>
-          <w:tcPr>
-            <w:tcW w:w="2200" w:type="dxa"/>
-            <w:vAlign w:val="center"/>
-          </w:tcPr>
-          <w:p>
-            <w:r>
-              <w:rPr>
-                <w:color w:val="000000"/>
-              </w:rPr>
-              <w:t>Cantidad 0</w:t>
-            </w:r>
-          </w:p>
-        </w:tc>
-        <w:tc>
-          <w:tcPr>
-            <w:tcW w:w="1400" w:type="dxa"/>
-            <w:vAlign w:val="center"/>
-          </w:tcPr>
-          <w:p>
-            <w:r>
-              <w:rPr>
-                <w:color w:val="000000"/>
-              </w:rPr>
-              <w:t>Valores límite</w:t>
-            </w:r>
-          </w:p>
-        </w:tc>
-        <w:tc>
-          <w:tcPr>
-            <w:tcW w:w="900" w:type="dxa"/>
-            <w:vAlign w:val="center"/>
-          </w:tcPr>
-          <w:p>
-            <w:r>
-              <w:rPr>
-                <w:color w:val="000000"/>
-              </w:rPr>
-              <w:t>Alta</w:t>
-            </w:r>
-          </w:p>
-        </w:tc>
-        <w:tc>
-          <w:tcPr>
-            <w:tcW w:w="2600" w:type="dxa"/>
-            <w:vAlign w:val="center"/>
-          </w:tcPr>
-          <w:p>
-            <w:r>
-              <w:rPr>
-                <w:color w:val="000000"/>
-              </w:rPr>
-              <w:t>Lo rechaza</w:t>
-            </w:r>
-          </w:p>
-        </w:tc>
-        <w:tc>
-          <w:tcPr>
-            <w:tcW w:w="900" w:type="dxa"/>
-            <w:vAlign w:val="center"/>
-          </w:tcPr>
-          <w:p>
-            <w:r>
-              <w:rPr>
-                <w:color w:val="000000"/>
-              </w:rPr>
-              <w:t>R-02</w:t>
-            </w:r>
-          </w:p>
-        </w:tc>
-        <w:tc>
-          <w:tcPr>
-            <w:tcW w:w="1400" w:type="dxa"/>
-            <w:vAlign w:val="center"/>
-          </w:tcPr>
-          <w:p>
-            <w:r>
-              <w:rPr>
-                <w:color w:val="000000"/>
-              </w:rPr>
-              <w:t>No ejecutado</w:t>
-            </w:r>
-          </w:p>
-        </w:tc>
-      </w:tr>
-      <w:tr>
-        <w:tblPrEx>
-          <w:tblCellMar>
-            <w:top w:w="0" w:type="dxa"/>
-            <w:bottom w:w="0" w:type="dxa"/>
-          </w:tblCellMar>
-        </w:tblPrEx>
-        <w:tc>
-          <w:tcPr>
-            <w:tcW w:w="900" w:type="dxa"/>
-            <w:vAlign w:val="center"/>
-          </w:tcPr>
-          <w:p>
-            <w:r>
-              <w:rPr>
-                <w:color w:val="000000"/>
-              </w:rPr>
-              <w:t>CP-12</w:t>
-            </w:r>
-          </w:p>
-        </w:tc>
-        <w:tc>
-          <w:tcPr>
-            <w:tcW w:w="1500" w:type="dxa"/>
-            <w:vAlign w:val="center"/>
-          </w:tcPr>
-          <w:p>
-            <w:r>
-              <w:rPr>
-                <w:color w:val="000000"/>
-              </w:rPr>
-              <w:t>HU-05 / RN-02</w:t>
-            </w:r>
-          </w:p>
-        </w:tc>
-        <w:tc>
-          <w:tcPr>
-            <w:tcW w:w="2200" w:type="dxa"/>
-            <w:vAlign w:val="center"/>
-          </w:tcPr>
-          <w:p>
-            <w:r>
-              <w:rPr>
-                <w:color w:val="000000"/>
-              </w:rPr>
-              <w:t>Cantidad 100</w:t>
-            </w:r>
-          </w:p>
-        </w:tc>
-        <w:tc>
-          <w:tcPr>
-            <w:tcW w:w="1400" w:type="dxa"/>
-            <w:vAlign w:val="center"/>
-          </w:tcPr>
-          <w:p>
-            <w:r>
-              <w:rPr>
-                <w:color w:val="000000"/>
-              </w:rPr>
-              <w:t>Valores límite</w:t>
-            </w:r>
-          </w:p>
-        </w:tc>
-        <w:tc>
-          <w:tcPr>
-            <w:tcW w:w="900" w:type="dxa"/>
-            <w:vAlign w:val="center"/>
-          </w:tcPr>
-          <w:p>
-            <w:r>
-              <w:rPr>
-                <w:color w:val="000000"/>
-              </w:rPr>
-              <w:t>Alta</w:t>
-            </w:r>
-          </w:p>
-        </w:tc>
-        <w:tc>
-          <w:tcPr>
-            <w:tcW w:w="2600" w:type="dxa"/>
-            <w:vAlign w:val="center"/>
-          </w:tcPr>
-          <w:p>
-            <w:r>
-              <w:rPr>
-                <w:color w:val="000000"/>
-              </w:rPr>
-              <w:t>Lo rechaza</w:t>
-            </w:r>
-          </w:p>
-        </w:tc>
-        <w:tc>
-          <w:tcPr>
-            <w:tcW w:w="900" w:type="dxa"/>
-            <w:vAlign w:val="center"/>
-          </w:tcPr>
-          <w:p>
-            <w:r>
-              <w:rPr>
-                <w:color w:val="000000"/>
-              </w:rPr>
-              <w:t>R-02</w:t>
-            </w:r>
-          </w:p>
-        </w:tc>
-        <w:tc>
-          <w:tcPr>
-            <w:tcW w:w="1400" w:type="dxa"/>
-            <w:vAlign w:val="center"/>
-          </w:tcPr>
-          <w:p>
-            <w:r>
-              <w:rPr>
-                <w:color w:val="000000"/>
-              </w:rPr>
-              <w:t>No ejecutado</w:t>
-            </w:r>
-          </w:p>
-        </w:tc>
-      </w:tr>
-      <w:tr>
-        <w:tblPrEx>
-          <w:tblCellMar>
-            <w:top w:w="0" w:type="dxa"/>
-            <w:bottom w:w="0" w:type="dxa"/>
-          </w:tblCellMar>
-        </w:tblPrEx>
-        <w:tc>
-          <w:tcPr>
-            <w:tcW w:w="900" w:type="dxa"/>
-            <w:vAlign w:val="center"/>
-          </w:tcPr>
-          <w:p>
-            <w:r>
-              <w:rPr>
-                <w:color w:val="000000"/>
-              </w:rPr>
-              <w:t>CP-13</w:t>
-            </w:r>
-          </w:p>
-        </w:tc>
-        <w:tc>
-          <w:tcPr>
-            <w:tcW w:w="1500" w:type="dxa"/>
-            <w:vAlign w:val="center"/>
-          </w:tcPr>
-          <w:p>
-            <w:r>
-              <w:rPr>
-                <w:color w:val="000000"/>
-              </w:rPr>
-              <w:t>HU-05 / RN-02</w:t>
-            </w:r>
-          </w:p>
-        </w:tc>
-        <w:tc>
-          <w:tcPr>
-            <w:tcW w:w="2200" w:type="dxa"/>
-            <w:vAlign w:val="center"/>
-          </w:tcPr>
-          <w:p>
-            <w:r>
-              <w:rPr>
-                <w:color w:val="000000"/>
-              </w:rPr>
-              <w:t>Cantidad con letras</w:t>
-            </w:r>
-          </w:p>
-        </w:tc>
-        <w:tc>
-          <w:tcPr>
-            <w:tcW w:w="1400" w:type="dxa"/>
-            <w:vAlign w:val="center"/>
-          </w:tcPr>
-          <w:p>
-            <w:r>
-              <w:rPr>
-                <w:color w:val="000000"/>
-              </w:rPr>
-              <w:t>Equivalencia</w:t>
-            </w:r>
-          </w:p>
-        </w:tc>
-        <w:tc>
-          <w:tcPr>
-            <w:tcW w:w="900" w:type="dxa"/>
-            <w:vAlign w:val="center"/>
-          </w:tcPr>
-          <w:p>
-            <w:r>
-              <w:rPr>
-                <w:color w:val="000000"/>
-              </w:rPr>
-              <w:t>Media</w:t>
-            </w:r>
-          </w:p>
-        </w:tc>
-        <w:tc>
-          <w:tcPr>
-            <w:tcW w:w="2600" w:type="dxa"/>
-            <w:vAlign w:val="center"/>
-          </w:tcPr>
-          <w:p>
-            <w:r>
-              <w:rPr>
-                <w:color w:val="000000"/>
-              </w:rPr>
-              <w:t>Lo rechaza</w:t>
-            </w:r>
-          </w:p>
-        </w:tc>
-        <w:tc>
-          <w:tcPr>
-            <w:tcW w:w="900" w:type="dxa"/>
-            <w:vAlign w:val="center"/>
-          </w:tcPr>
-          <w:p>
-            <w:r>
-              <w:rPr>
-                <w:color w:val="000000"/>
-              </w:rPr>
-              <w:t>R-02</w:t>
-            </w:r>
-          </w:p>
-        </w:tc>
-        <w:tc>
-          <w:tcPr>
-            <w:tcW w:w="1400" w:type="dxa"/>
-            <w:vAlign w:val="center"/>
-          </w:tcPr>
-          <w:p>
-            <w:r>
-              <w:rPr>
-                <w:color w:val="000000"/>
-              </w:rPr>
-              <w:t>No ejecutado</w:t>
-            </w:r>
-          </w:p>
-        </w:tc>
-      </w:tr>
-      <w:tr>
-        <w:tblPrEx>
-          <w:tblCellMar>
-            <w:top w:w="0" w:type="dxa"/>
-            <w:bottom w:w="0" w:type="dxa"/>
-          </w:tblCellMar>
-        </w:tblPrEx>
-        <w:tc>
-          <w:tcPr>
-            <w:tcW w:w="900" w:type="dxa"/>
-            <w:vAlign w:val="center"/>
-          </w:tcPr>
-          <w:p>
-            <w:r>
-              <w:rPr>
-                <w:color w:val="000000"/>
-              </w:rPr>
-              <w:t>CP-14</w:t>
-            </w:r>
-          </w:p>
-        </w:tc>
-        <w:tc>
-          <w:tcPr>
-            <w:tcW w:w="1500" w:type="dxa"/>
-            <w:vAlign w:val="center"/>
-          </w:tcPr>
-          <w:p>
-            <w:r>
-              <w:rPr>
-                <w:color w:val="000000"/>
-              </w:rPr>
-              <w:t>HU-05 / RN-03</w:t>
-            </w:r>
-          </w:p>
-        </w:tc>
-        <w:tc>
-          <w:tcPr>
-            <w:tcW w:w="2200" w:type="dxa"/>
-            <w:vAlign w:val="center"/>
-          </w:tcPr>
-          <w:p>
-            <w:r>
-              <w:rPr>
-                <w:color w:val="000000"/>
-              </w:rPr>
-              <w:t>Producto agotado</w:t>
-            </w:r>
-          </w:p>
-        </w:tc>
-        <w:tc>
-          <w:tcPr>
-            <w:tcW w:w="1400" w:type="dxa"/>
-            <w:vAlign w:val="center"/>
-          </w:tcPr>
-          <w:p>
-            <w:r>
-              <w:rPr>
-                <w:color w:val="000000"/>
-              </w:rPr>
-              <w:t>Negativa</w:t>
-            </w:r>
-          </w:p>
-        </w:tc>
-        <w:tc>
-          <w:tcPr>
-            <w:tcW w:w="900" w:type="dxa"/>
-            <w:vAlign w:val="center"/>
-          </w:tcPr>
-          <w:p>
-            <w:r>
-              <w:rPr>
-                <w:color w:val="000000"/>
-              </w:rPr>
-              <w:t>Alta</w:t>
-            </w:r>
-          </w:p>
-        </w:tc>
-        <w:tc>
-          <w:tcPr>
-            <w:tcW w:w="2600" w:type="dxa"/>
-            <w:vAlign w:val="center"/>
-          </w:tcPr>
-          <w:p>
-            <w:r>
-              <w:rPr>
-                <w:color w:val="000000"/>
-              </w:rPr>
-              <w:t>No lo agrega</w:t>
-            </w:r>
-          </w:p>
-        </w:tc>
-        <w:tc>
-          <w:tcPr>
-            <w:tcW w:w="900" w:type="dxa"/>
-            <w:vAlign w:val="center"/>
-          </w:tcPr>
-          <w:p>
-            <w:r>
-              <w:rPr>
-                <w:color w:val="000000"/>
-              </w:rPr>
-              <w:t>R-06</w:t>
-            </w:r>
-          </w:p>
-        </w:tc>
-        <w:tc>
-          <w:tcPr>
-            <w:tcW w:w="1400" w:type="dxa"/>
-            <w:vAlign w:val="center"/>
-          </w:tcPr>
-          <w:p>
-            <w:r>
-              <w:rPr>
-                <w:color w:val="000000"/>
-              </w:rPr>
-              <w:t>No ejecutado</w:t>
-            </w:r>
-          </w:p>
-        </w:tc>
-      </w:tr>
-      <w:tr>
-        <w:tblPrEx>
-          <w:tblCellMar>
-            <w:top w:w="0" w:type="dxa"/>
-            <w:bottom w:w="0" w:type="dxa"/>
-          </w:tblCellMar>
-        </w:tblPrEx>
-        <w:tc>
-          <w:tcPr>
-            <w:tcW w:w="900" w:type="dxa"/>
-            <w:vAlign w:val="center"/>
-          </w:tcPr>
-          <w:p>
-            <w:r>
-              <w:rPr>
-                <w:color w:val="000000"/>
-              </w:rPr>
-              <w:t>CP-15</w:t>
-            </w:r>
-          </w:p>
-        </w:tc>
-        <w:tc>
-          <w:tcPr>
-            <w:tcW w:w="1500" w:type="dxa"/>
-            <w:vAlign w:val="center"/>
-          </w:tcPr>
-          <w:p>
-            <w:r>
-              <w:rPr>
-                <w:color w:val="000000"/>
-              </w:rPr>
-              <w:t>HU-06</w:t>
-            </w:r>
-          </w:p>
-        </w:tc>
-        <w:tc>
-          <w:tcPr>
-            <w:tcW w:w="2200" w:type="dxa"/>
-            <w:vAlign w:val="center"/>
-          </w:tcPr>
-          <w:p>
-            <w:r>
-              <w:rPr>
-                <w:color w:val="000000"/>
-              </w:rPr>
-              <w:t>Eliminar una línea</w:t>
-            </w:r>
-          </w:p>
-        </w:tc>
-        <w:tc>
-          <w:tcPr>
-            <w:tcW w:w="1400" w:type="dxa"/>
-            <w:vAlign w:val="center"/>
-          </w:tcPr>
-          <w:p>
-            <w:r>
-              <w:rPr>
-                <w:color w:val="000000"/>
-              </w:rPr>
-              <w:t>Positiva</w:t>
-            </w:r>
-          </w:p>
-        </w:tc>
-        <w:tc>
-          <w:tcPr>
-            <w:tcW w:w="900" w:type="dxa"/>
-            <w:vAlign w:val="center"/>
-          </w:tcPr>
-          <w:p>
-            <w:r>
-              <w:rPr>
-                <w:color w:val="000000"/>
-              </w:rPr>
-              <w:t>Alta</w:t>
-            </w:r>
-          </w:p>
-        </w:tc>
-        <w:tc>
-          <w:tcPr>
-            <w:tcW w:w="2600" w:type="dxa"/>
-            <w:vAlign w:val="center"/>
-          </w:tcPr>
-          <w:p>
-            <w:r>
-              <w:rPr>
-                <w:color w:val="000000"/>
-              </w:rPr>
-              <w:t>Recalcula el total</w:t>
-            </w:r>
-          </w:p>
-        </w:tc>
-        <w:tc>
-          <w:tcPr>
-            <w:tcW w:w="900" w:type="dxa"/>
-            <w:vAlign w:val="center"/>
-          </w:tcPr>
-          <w:p>
-            <w:r>
-              <w:rPr>
-                <w:color w:val="000000"/>
-              </w:rPr>
-              <w:t>R-07</w:t>
-            </w:r>
-          </w:p>
-        </w:tc>
-        <w:tc>
-          <w:tcPr>
-            <w:tcW w:w="1400" w:type="dxa"/>
-            <w:vAlign w:val="center"/>
-          </w:tcPr>
-          <w:p>
-            <w:r>
-              <w:rPr>
-                <w:color w:val="000000"/>
-              </w:rPr>
-              <w:t>No ejecutado</w:t>
-            </w:r>
-          </w:p>
-        </w:tc>
-      </w:tr>
-      <w:tr>
-        <w:tblPrEx>
-          <w:tblCellMar>
-            <w:top w:w="0" w:type="dxa"/>
-            <w:bottom w:w="0" w:type="dxa"/>
-          </w:tblCellMar>
-        </w:tblPrEx>
-        <w:tc>
-          <w:tcPr>
-            <w:tcW w:w="900" w:type="dxa"/>
-            <w:vAlign w:val="center"/>
-          </w:tcPr>
-          <w:p>
-            <w:r>
-              <w:rPr>
-                <w:color w:val="000000"/>
-              </w:rPr>
-              <w:t>CP-16</w:t>
-            </w:r>
-          </w:p>
-        </w:tc>
-        <w:tc>
-          <w:tcPr>
-            <w:tcW w:w="1500" w:type="dxa"/>
-            <w:vAlign w:val="center"/>
-          </w:tcPr>
-          <w:p>
-            <w:r>
-              <w:rPr>
-                <w:color w:val="000000"/>
-              </w:rPr>
-              <w:t>HU-07 / RN-01</w:t>
-            </w:r>
-          </w:p>
-        </w:tc>
-        <w:tc>
-          <w:tcPr>
-            <w:tcW w:w="2200" w:type="dxa"/>
-            <w:vAlign w:val="center"/>
-          </w:tcPr>
-          <w:p>
-            <w:r>
-              <w:rPr>
-                <w:color w:val="000000"/>
-              </w:rPr>
-              <w:t>Enviar con Q399.99</w:t>
-            </w:r>
-          </w:p>
-        </w:tc>
-        <w:tc>
-          <w:tcPr>
-            <w:tcW w:w="1400" w:type="dxa"/>
-            <w:vAlign w:val="center"/>
-          </w:tcPr>
-          <w:p>
-            <w:r>
-              <w:rPr>
-                <w:color w:val="000000"/>
-              </w:rPr>
-              <w:t>Valores límite</w:t>
-            </w:r>
-          </w:p>
-        </w:tc>
-        <w:tc>
-          <w:tcPr>
-            <w:tcW w:w="900" w:type="dxa"/>
-            <w:vAlign w:val="center"/>
-          </w:tcPr>
-          <w:p>
-            <w:r>
-              <w:rPr>
-                <w:color w:val="000000"/>
-              </w:rPr>
-              <w:t>Crítica</w:t>
-            </w:r>
-          </w:p>
-        </w:tc>
-        <w:tc>
-          <w:tcPr>
-            <w:tcW w:w="2600" w:type="dxa"/>
-            <w:vAlign w:val="center"/>
-          </w:tcPr>
-          <w:p>
-            <w:r>
-              <w:rPr>
-                <w:color w:val="000000"/>
-              </w:rPr>
-              <w:t>No deja, dice cuánto falta</w:t>
-            </w:r>
-          </w:p>
-        </w:tc>
-        <w:tc>
-          <w:tcPr>
-            <w:tcW w:w="900" w:type="dxa"/>
-            <w:vAlign w:val="center"/>
-          </w:tcPr>
-          <w:p>
-            <w:r>
-              <w:rPr>
-                <w:color w:val="000000"/>
-              </w:rPr>
-              <w:t>R-01</w:t>
-            </w:r>
-          </w:p>
-        </w:tc>
-        <w:tc>
-          <w:tcPr>
-            <w:tcW w:w="1400" w:type="dxa"/>
-            <w:vAlign w:val="center"/>
-          </w:tcPr>
-          <w:p>
-            <w:r>
-              <w:rPr>
-                <w:color w:val="000000"/>
-              </w:rPr>
-              <w:t>No ejecutado</w:t>
-            </w:r>
-          </w:p>
-        </w:tc>
-      </w:tr>
-      <w:tr>
-        <w:tblPrEx>
-          <w:tblCellMar>
-            <w:top w:w="0" w:type="dxa"/>
-            <w:bottom w:w="0" w:type="dxa"/>
-          </w:tblCellMar>
-        </w:tblPrEx>
-        <w:tc>
-          <w:tcPr>
-            <w:tcW w:w="900" w:type="dxa"/>
-            <w:vAlign w:val="center"/>
-          </w:tcPr>
-          <w:p>
-            <w:r>
-              <w:rPr>
-                <w:color w:val="000000"/>
-              </w:rPr>
-              <w:t>CP-17</w:t>
-            </w:r>
-          </w:p>
-        </w:tc>
-        <w:tc>
-          <w:tcPr>
-            <w:tcW w:w="1500" w:type="dxa"/>
-            <w:vAlign w:val="center"/>
-          </w:tcPr>
-          <w:p>
-            <w:r>
-              <w:rPr>
-                <w:color w:val="000000"/>
-              </w:rPr>
-              <w:t>HU-07 / RN-01</w:t>
-            </w:r>
-          </w:p>
-        </w:tc>
-        <w:tc>
-          <w:tcPr>
-            <w:tcW w:w="2200" w:type="dxa"/>
-            <w:vAlign w:val="center"/>
-          </w:tcPr>
-          <w:p>
-            <w:r>
-              <w:rPr>
-                <w:color w:val="000000"/>
-              </w:rPr>
-              <w:t>Enviar con Q400.00</w:t>
-            </w:r>
-          </w:p>
-        </w:tc>
-        <w:tc>
-          <w:tcPr>
-            <w:tcW w:w="1400" w:type="dxa"/>
-            <w:vAlign w:val="center"/>
-          </w:tcPr>
-          <w:p>
-            <w:r>
-              <w:rPr>
-                <w:color w:val="000000"/>
-              </w:rPr>
-              <w:t>Valores límite</w:t>
-            </w:r>
-          </w:p>
-        </w:tc>
-        <w:tc>
-          <w:tcPr>
-            <w:tcW w:w="900" w:type="dxa"/>
-            <w:vAlign w:val="center"/>
-          </w:tcPr>
-          <w:p>
-            <w:r>
-              <w:rPr>
-                <w:color w:val="000000"/>
-              </w:rPr>
-              <w:t>Crítica</w:t>
-            </w:r>
-          </w:p>
-        </w:tc>
-        <w:tc>
-          <w:tcPr>
-            <w:tcW w:w="2600" w:type="dxa"/>
-            <w:vAlign w:val="center"/>
-          </w:tcPr>
-          <w:p>
-            <w:r>
-              <w:rPr>
-                <w:color w:val="000000"/>
-              </w:rPr>
-              <w:t>Envía y da el número</w:t>
-            </w:r>
-          </w:p>
-        </w:tc>
-        <w:tc>
-          <w:tcPr>
-            <w:tcW w:w="900" w:type="dxa"/>
-            <w:vAlign w:val="center"/>
-          </w:tcPr>
-          <w:p>
-            <w:r>
-              <w:rPr>
-                <w:color w:val="000000"/>
-              </w:rPr>
-              <w:t>R-01</w:t>
-            </w:r>
-          </w:p>
-        </w:tc>
-        <w:tc>
-          <w:tcPr>
-            <w:tcW w:w="1400" w:type="dxa"/>
-            <w:vAlign w:val="center"/>
-          </w:tcPr>
-          <w:p>
-            <w:r>
-              <w:rPr>
-                <w:color w:val="000000"/>
-              </w:rPr>
-              <w:t>No ejecutado</w:t>
+              <w:t>Aprobado</w:t>
             </w:r>
           </w:p>
         </w:tc>
@@ -9326,7 +9326,7 @@
           <w:iCs/>
           <w:color w:val="555555"/>
         </w:rPr>
-        <w:t>Cada caso está ligado a una historia de usuario, a la regla que verifica y al riesgo que ayuda a controlar. La columna Estado se llena al ejecutar las pruebas — sigue pendiente de completar.</w:t>
+        <w:t>Cada caso está ligado a una historia de usuario, a la regla que verifica y al riesgo que ayuda a controlar. La columna Estado se actualizó el 12 de octubre de 2026 solo con lo que se ejecutó de verdad. CP-03, CP-04, CP-07 y CP-08 se aprobaron con las pruebas de Playwright (npm run test:e2e). CP-09 a CP-14, CP-16 y CP-17 se aprobaron con las pruebas unitarias (npm test), que revisan la regla de negocio en el código y no la pantalla. CP-02 quedó como No ejecutado porque solo se corrió con una respuesta simulada de Supabase. Las pruebas del filtro CP-20 a CP-30 (HU-09) también están aprobadas con npm test; el detalle está en docs/rtm-estado.md del repositorio.</w:t>
       </w:r>
     </w:p>
     <w:p>

</xml_diff>

<commit_message>
docs: actualizar RTM y evolucion con casos automatizados y compatibilidad
</commit_message>
<xml_diff>
--- a/docs/Hito-Integracion-SQA.docx.docx
+++ b/docs/Hito-Integracion-SQA.docx.docx
@@ -7150,6 +7150,126 @@
               <w:rPr>
                 <w:color w:val="000000"/>
               </w:rPr>
+              <w:t>Aprobado</w:t>
+            </w:r>
+          </w:p>
+        </w:tc>
+      </w:tr>
+      <w:tr>
+        <w:tblPrEx>
+          <w:tblCellMar>
+            <w:top w:w="0" w:type="dxa"/>
+            <w:bottom w:w="0" w:type="dxa"/>
+          </w:tblCellMar>
+        </w:tblPrEx>
+        <w:tc>
+          <w:tcPr>
+            <w:tcW w:w="900" w:type="dxa"/>
+            <w:vAlign w:val="center"/>
+          </w:tcPr>
+          <w:p>
+            <w:r>
+              <w:rPr>
+                <w:color w:val="000000"/>
+              </w:rPr>
+              <w:t>CP-02</w:t>
+            </w:r>
+          </w:p>
+        </w:tc>
+        <w:tc>
+          <w:tcPr>
+            <w:tcW w:w="1500" w:type="dxa"/>
+            <w:vAlign w:val="center"/>
+          </w:tcPr>
+          <w:p>
+            <w:r>
+              <w:rPr>
+                <w:color w:val="000000"/>
+              </w:rPr>
+              <w:t>HU-02</w:t>
+            </w:r>
+          </w:p>
+        </w:tc>
+        <w:tc>
+          <w:tcPr>
+            <w:tcW w:w="2200" w:type="dxa"/>
+            <w:vAlign w:val="center"/>
+          </w:tcPr>
+          <w:p>
+            <w:r>
+              <w:rPr>
+                <w:color w:val="000000"/>
+              </w:rPr>
+              <w:t>Login correcto</w:t>
+            </w:r>
+          </w:p>
+        </w:tc>
+        <w:tc>
+          <w:tcPr>
+            <w:tcW w:w="1400" w:type="dxa"/>
+            <w:vAlign w:val="center"/>
+          </w:tcPr>
+          <w:p>
+            <w:r>
+              <w:rPr>
+                <w:color w:val="000000"/>
+              </w:rPr>
+              <w:t>Equivalencia</w:t>
+            </w:r>
+          </w:p>
+        </w:tc>
+        <w:tc>
+          <w:tcPr>
+            <w:tcW w:w="900" w:type="dxa"/>
+            <w:vAlign w:val="center"/>
+          </w:tcPr>
+          <w:p>
+            <w:r>
+              <w:rPr>
+                <w:color w:val="000000"/>
+              </w:rPr>
+              <w:t>Alta</w:t>
+            </w:r>
+          </w:p>
+        </w:tc>
+        <w:tc>
+          <w:tcPr>
+            <w:tcW w:w="2600" w:type="dxa"/>
+            <w:vAlign w:val="center"/>
+          </w:tcPr>
+          <w:p>
+            <w:r>
+              <w:rPr>
+                <w:color w:val="000000"/>
+              </w:rPr>
+              <w:t>Entra al dashboard</w:t>
+            </w:r>
+          </w:p>
+        </w:tc>
+        <w:tc>
+          <w:tcPr>
+            <w:tcW w:w="900" w:type="dxa"/>
+            <w:vAlign w:val="center"/>
+          </w:tcPr>
+          <w:p>
+            <w:r>
+              <w:rPr>
+                <w:color w:val="000000"/>
+              </w:rPr>
+              <w:t>—</w:t>
+            </w:r>
+          </w:p>
+        </w:tc>
+        <w:tc>
+          <w:tcPr>
+            <w:tcW w:w="1400" w:type="dxa"/>
+            <w:vAlign w:val="center"/>
+          </w:tcPr>
+          <w:p>
+            <w:r>
+              <w:rPr>
+                <w:color w:val="000000"/>
+              </w:rPr>
               <w:t>No ejecutado</w:t>
             </w:r>
           </w:p>
@@ -7172,7 +7292,7 @@
               <w:rPr>
                 <w:color w:val="000000"/>
               </w:rPr>
-              <w:t>CP-02</w:t>
+              <w:t>CP-03</w:t>
             </w:r>
           </w:p>
         </w:tc>
@@ -7200,7 +7320,7 @@
               <w:rPr>
                 <w:color w:val="000000"/>
               </w:rPr>
-              <w:t>Login correcto</w:t>
+              <w:t>Contraseña incorrecta</w:t>
             </w:r>
           </w:p>
         </w:tc>
@@ -7242,7 +7362,7 @@
               <w:rPr>
                 <w:color w:val="000000"/>
               </w:rPr>
-              <w:t>Entra al dashboard</w:t>
+              <w:t>No entra y avisa</w:t>
             </w:r>
           </w:p>
         </w:tc>
@@ -7270,6 +7390,1806 @@
               <w:rPr>
                 <w:color w:val="000000"/>
               </w:rPr>
+              <w:t>Aprobado</w:t>
+            </w:r>
+          </w:p>
+        </w:tc>
+      </w:tr>
+      <w:tr>
+        <w:tblPrEx>
+          <w:tblCellMar>
+            <w:top w:w="0" w:type="dxa"/>
+            <w:bottom w:w="0" w:type="dxa"/>
+          </w:tblCellMar>
+        </w:tblPrEx>
+        <w:tc>
+          <w:tcPr>
+            <w:tcW w:w="900" w:type="dxa"/>
+            <w:vAlign w:val="center"/>
+          </w:tcPr>
+          <w:p>
+            <w:r>
+              <w:rPr>
+                <w:color w:val="000000"/>
+              </w:rPr>
+              <w:t>CP-04</w:t>
+            </w:r>
+          </w:p>
+        </w:tc>
+        <w:tc>
+          <w:tcPr>
+            <w:tcW w:w="1500" w:type="dxa"/>
+            <w:vAlign w:val="center"/>
+          </w:tcPr>
+          <w:p>
+            <w:r>
+              <w:rPr>
+                <w:color w:val="000000"/>
+              </w:rPr>
+              <w:t>HU-02</w:t>
+            </w:r>
+          </w:p>
+        </w:tc>
+        <w:tc>
+          <w:tcPr>
+            <w:tcW w:w="2200" w:type="dxa"/>
+            <w:vAlign w:val="center"/>
+          </w:tcPr>
+          <w:p>
+            <w:r>
+              <w:rPr>
+                <w:color w:val="000000"/>
+              </w:rPr>
+              <w:t>Campos vacíos</w:t>
+            </w:r>
+          </w:p>
+        </w:tc>
+        <w:tc>
+          <w:tcPr>
+            <w:tcW w:w="1400" w:type="dxa"/>
+            <w:vAlign w:val="center"/>
+          </w:tcPr>
+          <w:p>
+            <w:r>
+              <w:rPr>
+                <w:color w:val="000000"/>
+              </w:rPr>
+              <w:t>Equivalencia</w:t>
+            </w:r>
+          </w:p>
+        </w:tc>
+        <w:tc>
+          <w:tcPr>
+            <w:tcW w:w="900" w:type="dxa"/>
+            <w:vAlign w:val="center"/>
+          </w:tcPr>
+          <w:p>
+            <w:r>
+              <w:rPr>
+                <w:color w:val="000000"/>
+              </w:rPr>
+              <w:t>Media</w:t>
+            </w:r>
+          </w:p>
+        </w:tc>
+        <w:tc>
+          <w:tcPr>
+            <w:tcW w:w="2600" w:type="dxa"/>
+            <w:vAlign w:val="center"/>
+          </w:tcPr>
+          <w:p>
+            <w:r>
+              <w:rPr>
+                <w:color w:val="000000"/>
+              </w:rPr>
+              <w:t>Pide llenarlos</w:t>
+            </w:r>
+          </w:p>
+        </w:tc>
+        <w:tc>
+          <w:tcPr>
+            <w:tcW w:w="900" w:type="dxa"/>
+            <w:vAlign w:val="center"/>
+          </w:tcPr>
+          <w:p>
+            <w:r>
+              <w:rPr>
+                <w:color w:val="000000"/>
+              </w:rPr>
+              <w:t>—</w:t>
+            </w:r>
+          </w:p>
+        </w:tc>
+        <w:tc>
+          <w:tcPr>
+            <w:tcW w:w="1400" w:type="dxa"/>
+            <w:vAlign w:val="center"/>
+          </w:tcPr>
+          <w:p>
+            <w:r>
+              <w:rPr>
+                <w:color w:val="000000"/>
+              </w:rPr>
+              <w:t>Aprobado</w:t>
+            </w:r>
+          </w:p>
+        </w:tc>
+      </w:tr>
+      <w:tr>
+        <w:tblPrEx>
+          <w:tblCellMar>
+            <w:top w:w="0" w:type="dxa"/>
+            <w:bottom w:w="0" w:type="dxa"/>
+          </w:tblCellMar>
+        </w:tblPrEx>
+        <w:tc>
+          <w:tcPr>
+            <w:tcW w:w="900" w:type="dxa"/>
+            <w:vAlign w:val="center"/>
+          </w:tcPr>
+          <w:p>
+            <w:r>
+              <w:rPr>
+                <w:color w:val="000000"/>
+              </w:rPr>
+              <w:t>CP-05</w:t>
+            </w:r>
+          </w:p>
+        </w:tc>
+        <w:tc>
+          <w:tcPr>
+            <w:tcW w:w="1500" w:type="dxa"/>
+            <w:vAlign w:val="center"/>
+          </w:tcPr>
+          <w:p>
+            <w:r>
+              <w:rPr>
+                <w:color w:val="000000"/>
+              </w:rPr>
+              <w:t>HU-02</w:t>
+            </w:r>
+          </w:p>
+        </w:tc>
+        <w:tc>
+          <w:tcPr>
+            <w:tcW w:w="2200" w:type="dxa"/>
+            <w:vAlign w:val="center"/>
+          </w:tcPr>
+          <w:p>
+            <w:r>
+              <w:rPr>
+                <w:color w:val="000000"/>
+              </w:rPr>
+              <w:t>URL sin sesión</w:t>
+            </w:r>
+          </w:p>
+        </w:tc>
+        <w:tc>
+          <w:tcPr>
+            <w:tcW w:w="1400" w:type="dxa"/>
+            <w:vAlign w:val="center"/>
+          </w:tcPr>
+          <w:p>
+            <w:r>
+              <w:rPr>
+                <w:color w:val="000000"/>
+              </w:rPr>
+              <w:t>Negativa</w:t>
+            </w:r>
+          </w:p>
+        </w:tc>
+        <w:tc>
+          <w:tcPr>
+            <w:tcW w:w="900" w:type="dxa"/>
+            <w:vAlign w:val="center"/>
+          </w:tcPr>
+          <w:p>
+            <w:r>
+              <w:rPr>
+                <w:color w:val="000000"/>
+              </w:rPr>
+              <w:t>Alta</w:t>
+            </w:r>
+          </w:p>
+        </w:tc>
+        <w:tc>
+          <w:tcPr>
+            <w:tcW w:w="2600" w:type="dxa"/>
+            <w:vAlign w:val="center"/>
+          </w:tcPr>
+          <w:p>
+            <w:r>
+              <w:rPr>
+                <w:color w:val="000000"/>
+              </w:rPr>
+              <w:t>Manda al login</w:t>
+            </w:r>
+          </w:p>
+        </w:tc>
+        <w:tc>
+          <w:tcPr>
+            <w:tcW w:w="900" w:type="dxa"/>
+            <w:vAlign w:val="center"/>
+          </w:tcPr>
+          <w:p>
+            <w:r>
+              <w:rPr>
+                <w:color w:val="000000"/>
+              </w:rPr>
+              <w:t>R-04</w:t>
+            </w:r>
+          </w:p>
+        </w:tc>
+        <w:tc>
+          <w:tcPr>
+            <w:tcW w:w="1400" w:type="dxa"/>
+            <w:vAlign w:val="center"/>
+          </w:tcPr>
+          <w:p>
+            <w:r>
+              <w:rPr>
+                <w:color w:val="000000"/>
+              </w:rPr>
+              <w:t>Aprobado</w:t>
+            </w:r>
+          </w:p>
+        </w:tc>
+      </w:tr>
+      <w:tr>
+        <w:tblPrEx>
+          <w:tblCellMar>
+            <w:top w:w="0" w:type="dxa"/>
+            <w:bottom w:w="0" w:type="dxa"/>
+          </w:tblCellMar>
+        </w:tblPrEx>
+        <w:tc>
+          <w:tcPr>
+            <w:tcW w:w="900" w:type="dxa"/>
+            <w:vAlign w:val="center"/>
+          </w:tcPr>
+          <w:p>
+            <w:r>
+              <w:rPr>
+                <w:color w:val="000000"/>
+              </w:rPr>
+              <w:t>CP-06</w:t>
+            </w:r>
+          </w:p>
+        </w:tc>
+        <w:tc>
+          <w:tcPr>
+            <w:tcW w:w="1500" w:type="dxa"/>
+            <w:vAlign w:val="center"/>
+          </w:tcPr>
+          <w:p>
+            <w:r>
+              <w:rPr>
+                <w:color w:val="000000"/>
+              </w:rPr>
+              <w:t>HU-03 / RN-03</w:t>
+            </w:r>
+          </w:p>
+        </w:tc>
+        <w:tc>
+          <w:tcPr>
+            <w:tcW w:w="2200" w:type="dxa"/>
+            <w:vAlign w:val="center"/>
+          </w:tcPr>
+          <w:p>
+            <w:r>
+              <w:rPr>
+                <w:color w:val="000000"/>
+              </w:rPr>
+              <w:t>Agotados marcados</w:t>
+            </w:r>
+          </w:p>
+        </w:tc>
+        <w:tc>
+          <w:tcPr>
+            <w:tcW w:w="1400" w:type="dxa"/>
+            <w:vAlign w:val="center"/>
+          </w:tcPr>
+          <w:p>
+            <w:r>
+              <w:rPr>
+                <w:color w:val="000000"/>
+              </w:rPr>
+              <w:t>Positiva</w:t>
+            </w:r>
+          </w:p>
+        </w:tc>
+        <w:tc>
+          <w:tcPr>
+            <w:tcW w:w="900" w:type="dxa"/>
+            <w:vAlign w:val="center"/>
+          </w:tcPr>
+          <w:p>
+            <w:r>
+              <w:rPr>
+                <w:color w:val="000000"/>
+              </w:rPr>
+              <w:t>Media</w:t>
+            </w:r>
+          </w:p>
+        </w:tc>
+        <w:tc>
+          <w:tcPr>
+            <w:tcW w:w="2600" w:type="dxa"/>
+            <w:vAlign w:val="center"/>
+          </w:tcPr>
+          <w:p>
+            <w:r>
+              <w:rPr>
+                <w:color w:val="000000"/>
+              </w:rPr>
+              <w:t>16 productos, 3 marcados</w:t>
+            </w:r>
+          </w:p>
+        </w:tc>
+        <w:tc>
+          <w:tcPr>
+            <w:tcW w:w="900" w:type="dxa"/>
+            <w:vAlign w:val="center"/>
+          </w:tcPr>
+          <w:p>
+            <w:r>
+              <w:rPr>
+                <w:color w:val="000000"/>
+              </w:rPr>
+              <w:t>R-06</w:t>
+            </w:r>
+          </w:p>
+        </w:tc>
+        <w:tc>
+          <w:tcPr>
+            <w:tcW w:w="1400" w:type="dxa"/>
+            <w:vAlign w:val="center"/>
+          </w:tcPr>
+          <w:p>
+            <w:r>
+              <w:rPr>
+                <w:color w:val="000000"/>
+              </w:rPr>
+              <w:t>Aprobado</w:t>
+            </w:r>
+          </w:p>
+        </w:tc>
+      </w:tr>
+      <w:tr>
+        <w:tblPrEx>
+          <w:tblCellMar>
+            <w:top w:w="0" w:type="dxa"/>
+            <w:bottom w:w="0" w:type="dxa"/>
+          </w:tblCellMar>
+        </w:tblPrEx>
+        <w:tc>
+          <w:tcPr>
+            <w:tcW w:w="900" w:type="dxa"/>
+            <w:vAlign w:val="center"/>
+          </w:tcPr>
+          <w:p>
+            <w:r>
+              <w:rPr>
+                <w:color w:val="000000"/>
+              </w:rPr>
+              <w:t>CP-07</w:t>
+            </w:r>
+          </w:p>
+        </w:tc>
+        <w:tc>
+          <w:tcPr>
+            <w:tcW w:w="1500" w:type="dxa"/>
+            <w:vAlign w:val="center"/>
+          </w:tcPr>
+          <w:p>
+            <w:r>
+              <w:rPr>
+                <w:color w:val="000000"/>
+              </w:rPr>
+              <w:t>HU-04</w:t>
+            </w:r>
+          </w:p>
+        </w:tc>
+        <w:tc>
+          <w:tcPr>
+            <w:tcW w:w="2200" w:type="dxa"/>
+            <w:vAlign w:val="center"/>
+          </w:tcPr>
+          <w:p>
+            <w:r>
+              <w:rPr>
+                <w:color w:val="000000"/>
+              </w:rPr>
+              <w:t>SKU existente</w:t>
+            </w:r>
+          </w:p>
+        </w:tc>
+        <w:tc>
+          <w:tcPr>
+            <w:tcW w:w="1400" w:type="dxa"/>
+            <w:vAlign w:val="center"/>
+          </w:tcPr>
+          <w:p>
+            <w:r>
+              <w:rPr>
+                <w:color w:val="000000"/>
+              </w:rPr>
+              <w:t>Equivalencia</w:t>
+            </w:r>
+          </w:p>
+        </w:tc>
+        <w:tc>
+          <w:tcPr>
+            <w:tcW w:w="900" w:type="dxa"/>
+            <w:vAlign w:val="center"/>
+          </w:tcPr>
+          <w:p>
+            <w:r>
+              <w:rPr>
+                <w:color w:val="000000"/>
+              </w:rPr>
+              <w:t>Media</w:t>
+            </w:r>
+          </w:p>
+        </w:tc>
+        <w:tc>
+          <w:tcPr>
+            <w:tcW w:w="2600" w:type="dxa"/>
+            <w:vAlign w:val="center"/>
+          </w:tcPr>
+          <w:p>
+            <w:r>
+              <w:rPr>
+                <w:color w:val="000000"/>
+              </w:rPr>
+              <w:t>Muestra ese producto</w:t>
+            </w:r>
+          </w:p>
+        </w:tc>
+        <w:tc>
+          <w:tcPr>
+            <w:tcW w:w="900" w:type="dxa"/>
+            <w:vAlign w:val="center"/>
+          </w:tcPr>
+          <w:p>
+            <w:r>
+              <w:rPr>
+                <w:color w:val="000000"/>
+              </w:rPr>
+              <w:t>—</w:t>
+            </w:r>
+          </w:p>
+        </w:tc>
+        <w:tc>
+          <w:tcPr>
+            <w:tcW w:w="1400" w:type="dxa"/>
+            <w:vAlign w:val="center"/>
+          </w:tcPr>
+          <w:p>
+            <w:r>
+              <w:rPr>
+                <w:color w:val="000000"/>
+              </w:rPr>
+              <w:t>Aprobado</w:t>
+            </w:r>
+          </w:p>
+        </w:tc>
+      </w:tr>
+      <w:tr>
+        <w:tblPrEx>
+          <w:tblCellMar>
+            <w:top w:w="0" w:type="dxa"/>
+            <w:bottom w:w="0" w:type="dxa"/>
+          </w:tblCellMar>
+        </w:tblPrEx>
+        <w:tc>
+          <w:tcPr>
+            <w:tcW w:w="900" w:type="dxa"/>
+            <w:vAlign w:val="center"/>
+          </w:tcPr>
+          <w:p>
+            <w:r>
+              <w:rPr>
+                <w:color w:val="000000"/>
+              </w:rPr>
+              <w:t>CP-08</w:t>
+            </w:r>
+          </w:p>
+        </w:tc>
+        <w:tc>
+          <w:tcPr>
+            <w:tcW w:w="1500" w:type="dxa"/>
+            <w:vAlign w:val="center"/>
+          </w:tcPr>
+          <w:p>
+            <w:r>
+              <w:rPr>
+                <w:color w:val="000000"/>
+              </w:rPr>
+              <w:t>HU-04</w:t>
+            </w:r>
+          </w:p>
+        </w:tc>
+        <w:tc>
+          <w:tcPr>
+            <w:tcW w:w="2200" w:type="dxa"/>
+            <w:vAlign w:val="center"/>
+          </w:tcPr>
+          <w:p>
+            <w:r>
+              <w:rPr>
+                <w:color w:val="000000"/>
+              </w:rPr>
+              <w:t>SKU inexistente</w:t>
+            </w:r>
+          </w:p>
+        </w:tc>
+        <w:tc>
+          <w:tcPr>
+            <w:tcW w:w="1400" w:type="dxa"/>
+            <w:vAlign w:val="center"/>
+          </w:tcPr>
+          <w:p>
+            <w:r>
+              <w:rPr>
+                <w:color w:val="000000"/>
+              </w:rPr>
+              <w:t>Equivalencia</w:t>
+            </w:r>
+          </w:p>
+        </w:tc>
+        <w:tc>
+          <w:tcPr>
+            <w:tcW w:w="900" w:type="dxa"/>
+            <w:vAlign w:val="center"/>
+          </w:tcPr>
+          <w:p>
+            <w:r>
+              <w:rPr>
+                <w:color w:val="000000"/>
+              </w:rPr>
+              <w:t>Media</w:t>
+            </w:r>
+          </w:p>
+        </w:tc>
+        <w:tc>
+          <w:tcPr>
+            <w:tcW w:w="2600" w:type="dxa"/>
+            <w:vAlign w:val="center"/>
+          </w:tcPr>
+          <w:p>
+            <w:r>
+              <w:rPr>
+                <w:color w:val="000000"/>
+              </w:rPr>
+              <w:t>Avisa sin resultados</w:t>
+            </w:r>
+          </w:p>
+        </w:tc>
+        <w:tc>
+          <w:tcPr>
+            <w:tcW w:w="900" w:type="dxa"/>
+            <w:vAlign w:val="center"/>
+          </w:tcPr>
+          <w:p>
+            <w:r>
+              <w:rPr>
+                <w:color w:val="000000"/>
+              </w:rPr>
+              <w:t>—</w:t>
+            </w:r>
+          </w:p>
+        </w:tc>
+        <w:tc>
+          <w:tcPr>
+            <w:tcW w:w="1400" w:type="dxa"/>
+            <w:vAlign w:val="center"/>
+          </w:tcPr>
+          <w:p>
+            <w:r>
+              <w:rPr>
+                <w:color w:val="000000"/>
+              </w:rPr>
+              <w:t>Aprobado</w:t>
+            </w:r>
+          </w:p>
+        </w:tc>
+      </w:tr>
+      <w:tr>
+        <w:tblPrEx>
+          <w:tblCellMar>
+            <w:top w:w="0" w:type="dxa"/>
+            <w:bottom w:w="0" w:type="dxa"/>
+          </w:tblCellMar>
+        </w:tblPrEx>
+        <w:tc>
+          <w:tcPr>
+            <w:tcW w:w="900" w:type="dxa"/>
+            <w:vAlign w:val="center"/>
+          </w:tcPr>
+          <w:p>
+            <w:r>
+              <w:rPr>
+                <w:color w:val="000000"/>
+              </w:rPr>
+              <w:t>CP-09</w:t>
+            </w:r>
+          </w:p>
+        </w:tc>
+        <w:tc>
+          <w:tcPr>
+            <w:tcW w:w="1500" w:type="dxa"/>
+            <w:vAlign w:val="center"/>
+          </w:tcPr>
+          <w:p>
+            <w:r>
+              <w:rPr>
+                <w:color w:val="000000"/>
+              </w:rPr>
+              <w:t>HU-05 / RN-02</w:t>
+            </w:r>
+          </w:p>
+        </w:tc>
+        <w:tc>
+          <w:tcPr>
+            <w:tcW w:w="2200" w:type="dxa"/>
+            <w:vAlign w:val="center"/>
+          </w:tcPr>
+          <w:p>
+            <w:r>
+              <w:rPr>
+                <w:color w:val="000000"/>
+              </w:rPr>
+              <w:t>Cantidad 1</w:t>
+            </w:r>
+          </w:p>
+        </w:tc>
+        <w:tc>
+          <w:tcPr>
+            <w:tcW w:w="1400" w:type="dxa"/>
+            <w:vAlign w:val="center"/>
+          </w:tcPr>
+          <w:p>
+            <w:r>
+              <w:rPr>
+                <w:color w:val="000000"/>
+              </w:rPr>
+              <w:t>Valores límite</w:t>
+            </w:r>
+          </w:p>
+        </w:tc>
+        <w:tc>
+          <w:tcPr>
+            <w:tcW w:w="900" w:type="dxa"/>
+            <w:vAlign w:val="center"/>
+          </w:tcPr>
+          <w:p>
+            <w:r>
+              <w:rPr>
+                <w:color w:val="000000"/>
+              </w:rPr>
+              <w:t>Alta</w:t>
+            </w:r>
+          </w:p>
+        </w:tc>
+        <w:tc>
+          <w:tcPr>
+            <w:tcW w:w="2600" w:type="dxa"/>
+            <w:vAlign w:val="center"/>
+          </w:tcPr>
+          <w:p>
+            <w:r>
+              <w:rPr>
+                <w:color w:val="000000"/>
+              </w:rPr>
+              <w:t>Lo agrega</w:t>
+            </w:r>
+          </w:p>
+        </w:tc>
+        <w:tc>
+          <w:tcPr>
+            <w:tcW w:w="900" w:type="dxa"/>
+            <w:vAlign w:val="center"/>
+          </w:tcPr>
+          <w:p>
+            <w:r>
+              <w:rPr>
+                <w:color w:val="000000"/>
+              </w:rPr>
+              <w:t>R-02</w:t>
+            </w:r>
+          </w:p>
+        </w:tc>
+        <w:tc>
+          <w:tcPr>
+            <w:tcW w:w="1400" w:type="dxa"/>
+            <w:vAlign w:val="center"/>
+          </w:tcPr>
+          <w:p>
+            <w:r>
+              <w:rPr>
+                <w:color w:val="000000"/>
+              </w:rPr>
+              <w:t>Aprobado</w:t>
+            </w:r>
+          </w:p>
+        </w:tc>
+      </w:tr>
+      <w:tr>
+        <w:tblPrEx>
+          <w:tblCellMar>
+            <w:top w:w="0" w:type="dxa"/>
+            <w:bottom w:w="0" w:type="dxa"/>
+          </w:tblCellMar>
+        </w:tblPrEx>
+        <w:tc>
+          <w:tcPr>
+            <w:tcW w:w="900" w:type="dxa"/>
+            <w:vAlign w:val="center"/>
+          </w:tcPr>
+          <w:p>
+            <w:r>
+              <w:rPr>
+                <w:color w:val="000000"/>
+              </w:rPr>
+              <w:t>CP-10</w:t>
+            </w:r>
+          </w:p>
+        </w:tc>
+        <w:tc>
+          <w:tcPr>
+            <w:tcW w:w="1500" w:type="dxa"/>
+            <w:vAlign w:val="center"/>
+          </w:tcPr>
+          <w:p>
+            <w:r>
+              <w:rPr>
+                <w:color w:val="000000"/>
+              </w:rPr>
+              <w:t>HU-05 / RN-02</w:t>
+            </w:r>
+          </w:p>
+        </w:tc>
+        <w:tc>
+          <w:tcPr>
+            <w:tcW w:w="2200" w:type="dxa"/>
+            <w:vAlign w:val="center"/>
+          </w:tcPr>
+          <w:p>
+            <w:r>
+              <w:rPr>
+                <w:color w:val="000000"/>
+              </w:rPr>
+              <w:t>Cantidad 99</w:t>
+            </w:r>
+          </w:p>
+        </w:tc>
+        <w:tc>
+          <w:tcPr>
+            <w:tcW w:w="1400" w:type="dxa"/>
+            <w:vAlign w:val="center"/>
+          </w:tcPr>
+          <w:p>
+            <w:r>
+              <w:rPr>
+                <w:color w:val="000000"/>
+              </w:rPr>
+              <w:t>Valores límite</w:t>
+            </w:r>
+          </w:p>
+        </w:tc>
+        <w:tc>
+          <w:tcPr>
+            <w:tcW w:w="900" w:type="dxa"/>
+            <w:vAlign w:val="center"/>
+          </w:tcPr>
+          <w:p>
+            <w:r>
+              <w:rPr>
+                <w:color w:val="000000"/>
+              </w:rPr>
+              <w:t>Alta</w:t>
+            </w:r>
+          </w:p>
+        </w:tc>
+        <w:tc>
+          <w:tcPr>
+            <w:tcW w:w="2600" w:type="dxa"/>
+            <w:vAlign w:val="center"/>
+          </w:tcPr>
+          <w:p>
+            <w:r>
+              <w:rPr>
+                <w:color w:val="000000"/>
+              </w:rPr>
+              <w:t>Lo agrega</w:t>
+            </w:r>
+          </w:p>
+        </w:tc>
+        <w:tc>
+          <w:tcPr>
+            <w:tcW w:w="900" w:type="dxa"/>
+            <w:vAlign w:val="center"/>
+          </w:tcPr>
+          <w:p>
+            <w:r>
+              <w:rPr>
+                <w:color w:val="000000"/>
+              </w:rPr>
+              <w:t>R-02</w:t>
+            </w:r>
+          </w:p>
+        </w:tc>
+        <w:tc>
+          <w:tcPr>
+            <w:tcW w:w="1400" w:type="dxa"/>
+            <w:vAlign w:val="center"/>
+          </w:tcPr>
+          <w:p>
+            <w:r>
+              <w:rPr>
+                <w:color w:val="000000"/>
+              </w:rPr>
+              <w:t>Aprobado</w:t>
+            </w:r>
+          </w:p>
+        </w:tc>
+      </w:tr>
+      <w:tr>
+        <w:tblPrEx>
+          <w:tblCellMar>
+            <w:top w:w="0" w:type="dxa"/>
+            <w:bottom w:w="0" w:type="dxa"/>
+          </w:tblCellMar>
+        </w:tblPrEx>
+        <w:tc>
+          <w:tcPr>
+            <w:tcW w:w="900" w:type="dxa"/>
+            <w:vAlign w:val="center"/>
+          </w:tcPr>
+          <w:p>
+            <w:r>
+              <w:rPr>
+                <w:color w:val="000000"/>
+              </w:rPr>
+              <w:t>CP-11</w:t>
+            </w:r>
+          </w:p>
+        </w:tc>
+        <w:tc>
+          <w:tcPr>
+            <w:tcW w:w="1500" w:type="dxa"/>
+            <w:vAlign w:val="center"/>
+          </w:tcPr>
+          <w:p>
+            <w:r>
+              <w:rPr>
+                <w:color w:val="000000"/>
+              </w:rPr>
+              <w:t>HU-05 / RN-02</w:t>
+            </w:r>
+          </w:p>
+        </w:tc>
+        <w:tc>
+          <w:tcPr>
+            <w:tcW w:w="2200" w:type="dxa"/>
+            <w:vAlign w:val="center"/>
+          </w:tcPr>
+          <w:p>
+            <w:r>
+              <w:rPr>
+                <w:color w:val="000000"/>
+              </w:rPr>
+              <w:t>Cantidad 0</w:t>
+            </w:r>
+          </w:p>
+        </w:tc>
+        <w:tc>
+          <w:tcPr>
+            <w:tcW w:w="1400" w:type="dxa"/>
+            <w:vAlign w:val="center"/>
+          </w:tcPr>
+          <w:p>
+            <w:r>
+              <w:rPr>
+                <w:color w:val="000000"/>
+              </w:rPr>
+              <w:t>Valores límite</w:t>
+            </w:r>
+          </w:p>
+        </w:tc>
+        <w:tc>
+          <w:tcPr>
+            <w:tcW w:w="900" w:type="dxa"/>
+            <w:vAlign w:val="center"/>
+          </w:tcPr>
+          <w:p>
+            <w:r>
+              <w:rPr>
+                <w:color w:val="000000"/>
+              </w:rPr>
+              <w:t>Alta</w:t>
+            </w:r>
+          </w:p>
+        </w:tc>
+        <w:tc>
+          <w:tcPr>
+            <w:tcW w:w="2600" w:type="dxa"/>
+            <w:vAlign w:val="center"/>
+          </w:tcPr>
+          <w:p>
+            <w:r>
+              <w:rPr>
+                <w:color w:val="000000"/>
+              </w:rPr>
+              <w:t>Lo rechaza</w:t>
+            </w:r>
+          </w:p>
+        </w:tc>
+        <w:tc>
+          <w:tcPr>
+            <w:tcW w:w="900" w:type="dxa"/>
+            <w:vAlign w:val="center"/>
+          </w:tcPr>
+          <w:p>
+            <w:r>
+              <w:rPr>
+                <w:color w:val="000000"/>
+              </w:rPr>
+              <w:t>R-02</w:t>
+            </w:r>
+          </w:p>
+        </w:tc>
+        <w:tc>
+          <w:tcPr>
+            <w:tcW w:w="1400" w:type="dxa"/>
+            <w:vAlign w:val="center"/>
+          </w:tcPr>
+          <w:p>
+            <w:r>
+              <w:rPr>
+                <w:color w:val="000000"/>
+              </w:rPr>
+              <w:t>Aprobado</w:t>
+            </w:r>
+          </w:p>
+        </w:tc>
+      </w:tr>
+      <w:tr>
+        <w:tblPrEx>
+          <w:tblCellMar>
+            <w:top w:w="0" w:type="dxa"/>
+            <w:bottom w:w="0" w:type="dxa"/>
+          </w:tblCellMar>
+        </w:tblPrEx>
+        <w:tc>
+          <w:tcPr>
+            <w:tcW w:w="900" w:type="dxa"/>
+            <w:vAlign w:val="center"/>
+          </w:tcPr>
+          <w:p>
+            <w:r>
+              <w:rPr>
+                <w:color w:val="000000"/>
+              </w:rPr>
+              <w:t>CP-12</w:t>
+            </w:r>
+          </w:p>
+        </w:tc>
+        <w:tc>
+          <w:tcPr>
+            <w:tcW w:w="1500" w:type="dxa"/>
+            <w:vAlign w:val="center"/>
+          </w:tcPr>
+          <w:p>
+            <w:r>
+              <w:rPr>
+                <w:color w:val="000000"/>
+              </w:rPr>
+              <w:t>HU-05 / RN-02</w:t>
+            </w:r>
+          </w:p>
+        </w:tc>
+        <w:tc>
+          <w:tcPr>
+            <w:tcW w:w="2200" w:type="dxa"/>
+            <w:vAlign w:val="center"/>
+          </w:tcPr>
+          <w:p>
+            <w:r>
+              <w:rPr>
+                <w:color w:val="000000"/>
+              </w:rPr>
+              <w:t>Cantidad 100</w:t>
+            </w:r>
+          </w:p>
+        </w:tc>
+        <w:tc>
+          <w:tcPr>
+            <w:tcW w:w="1400" w:type="dxa"/>
+            <w:vAlign w:val="center"/>
+          </w:tcPr>
+          <w:p>
+            <w:r>
+              <w:rPr>
+                <w:color w:val="000000"/>
+              </w:rPr>
+              <w:t>Valores límite</w:t>
+            </w:r>
+          </w:p>
+        </w:tc>
+        <w:tc>
+          <w:tcPr>
+            <w:tcW w:w="900" w:type="dxa"/>
+            <w:vAlign w:val="center"/>
+          </w:tcPr>
+          <w:p>
+            <w:r>
+              <w:rPr>
+                <w:color w:val="000000"/>
+              </w:rPr>
+              <w:t>Alta</w:t>
+            </w:r>
+          </w:p>
+        </w:tc>
+        <w:tc>
+          <w:tcPr>
+            <w:tcW w:w="2600" w:type="dxa"/>
+            <w:vAlign w:val="center"/>
+          </w:tcPr>
+          <w:p>
+            <w:r>
+              <w:rPr>
+                <w:color w:val="000000"/>
+              </w:rPr>
+              <w:t>Lo rechaza</w:t>
+            </w:r>
+          </w:p>
+        </w:tc>
+        <w:tc>
+          <w:tcPr>
+            <w:tcW w:w="900" w:type="dxa"/>
+            <w:vAlign w:val="center"/>
+          </w:tcPr>
+          <w:p>
+            <w:r>
+              <w:rPr>
+                <w:color w:val="000000"/>
+              </w:rPr>
+              <w:t>R-02</w:t>
+            </w:r>
+          </w:p>
+        </w:tc>
+        <w:tc>
+          <w:tcPr>
+            <w:tcW w:w="1400" w:type="dxa"/>
+            <w:vAlign w:val="center"/>
+          </w:tcPr>
+          <w:p>
+            <w:r>
+              <w:rPr>
+                <w:color w:val="000000"/>
+              </w:rPr>
+              <w:t>Aprobado</w:t>
+            </w:r>
+          </w:p>
+        </w:tc>
+      </w:tr>
+      <w:tr>
+        <w:tblPrEx>
+          <w:tblCellMar>
+            <w:top w:w="0" w:type="dxa"/>
+            <w:bottom w:w="0" w:type="dxa"/>
+          </w:tblCellMar>
+        </w:tblPrEx>
+        <w:tc>
+          <w:tcPr>
+            <w:tcW w:w="900" w:type="dxa"/>
+            <w:vAlign w:val="center"/>
+          </w:tcPr>
+          <w:p>
+            <w:r>
+              <w:rPr>
+                <w:color w:val="000000"/>
+              </w:rPr>
+              <w:t>CP-13</w:t>
+            </w:r>
+          </w:p>
+        </w:tc>
+        <w:tc>
+          <w:tcPr>
+            <w:tcW w:w="1500" w:type="dxa"/>
+            <w:vAlign w:val="center"/>
+          </w:tcPr>
+          <w:p>
+            <w:r>
+              <w:rPr>
+                <w:color w:val="000000"/>
+              </w:rPr>
+              <w:t>HU-05 / RN-02</w:t>
+            </w:r>
+          </w:p>
+        </w:tc>
+        <w:tc>
+          <w:tcPr>
+            <w:tcW w:w="2200" w:type="dxa"/>
+            <w:vAlign w:val="center"/>
+          </w:tcPr>
+          <w:p>
+            <w:r>
+              <w:rPr>
+                <w:color w:val="000000"/>
+              </w:rPr>
+              <w:t>Cantidad con letras</w:t>
+            </w:r>
+          </w:p>
+        </w:tc>
+        <w:tc>
+          <w:tcPr>
+            <w:tcW w:w="1400" w:type="dxa"/>
+            <w:vAlign w:val="center"/>
+          </w:tcPr>
+          <w:p>
+            <w:r>
+              <w:rPr>
+                <w:color w:val="000000"/>
+              </w:rPr>
+              <w:t>Equivalencia</w:t>
+            </w:r>
+          </w:p>
+        </w:tc>
+        <w:tc>
+          <w:tcPr>
+            <w:tcW w:w="900" w:type="dxa"/>
+            <w:vAlign w:val="center"/>
+          </w:tcPr>
+          <w:p>
+            <w:r>
+              <w:rPr>
+                <w:color w:val="000000"/>
+              </w:rPr>
+              <w:t>Media</w:t>
+            </w:r>
+          </w:p>
+        </w:tc>
+        <w:tc>
+          <w:tcPr>
+            <w:tcW w:w="2600" w:type="dxa"/>
+            <w:vAlign w:val="center"/>
+          </w:tcPr>
+          <w:p>
+            <w:r>
+              <w:rPr>
+                <w:color w:val="000000"/>
+              </w:rPr>
+              <w:t>Lo rechaza</w:t>
+            </w:r>
+          </w:p>
+        </w:tc>
+        <w:tc>
+          <w:tcPr>
+            <w:tcW w:w="900" w:type="dxa"/>
+            <w:vAlign w:val="center"/>
+          </w:tcPr>
+          <w:p>
+            <w:r>
+              <w:rPr>
+                <w:color w:val="000000"/>
+              </w:rPr>
+              <w:t>R-02</w:t>
+            </w:r>
+          </w:p>
+        </w:tc>
+        <w:tc>
+          <w:tcPr>
+            <w:tcW w:w="1400" w:type="dxa"/>
+            <w:vAlign w:val="center"/>
+          </w:tcPr>
+          <w:p>
+            <w:r>
+              <w:rPr>
+                <w:color w:val="000000"/>
+              </w:rPr>
+              <w:t>Aprobado</w:t>
+            </w:r>
+          </w:p>
+        </w:tc>
+      </w:tr>
+      <w:tr>
+        <w:tblPrEx>
+          <w:tblCellMar>
+            <w:top w:w="0" w:type="dxa"/>
+            <w:bottom w:w="0" w:type="dxa"/>
+          </w:tblCellMar>
+        </w:tblPrEx>
+        <w:tc>
+          <w:tcPr>
+            <w:tcW w:w="900" w:type="dxa"/>
+            <w:vAlign w:val="center"/>
+          </w:tcPr>
+          <w:p>
+            <w:r>
+              <w:rPr>
+                <w:color w:val="000000"/>
+              </w:rPr>
+              <w:t>CP-14</w:t>
+            </w:r>
+          </w:p>
+        </w:tc>
+        <w:tc>
+          <w:tcPr>
+            <w:tcW w:w="1500" w:type="dxa"/>
+            <w:vAlign w:val="center"/>
+          </w:tcPr>
+          <w:p>
+            <w:r>
+              <w:rPr>
+                <w:color w:val="000000"/>
+              </w:rPr>
+              <w:t>HU-05 / RN-03</w:t>
+            </w:r>
+          </w:p>
+        </w:tc>
+        <w:tc>
+          <w:tcPr>
+            <w:tcW w:w="2200" w:type="dxa"/>
+            <w:vAlign w:val="center"/>
+          </w:tcPr>
+          <w:p>
+            <w:r>
+              <w:rPr>
+                <w:color w:val="000000"/>
+              </w:rPr>
+              <w:t>Producto agotado</w:t>
+            </w:r>
+          </w:p>
+        </w:tc>
+        <w:tc>
+          <w:tcPr>
+            <w:tcW w:w="1400" w:type="dxa"/>
+            <w:vAlign w:val="center"/>
+          </w:tcPr>
+          <w:p>
+            <w:r>
+              <w:rPr>
+                <w:color w:val="000000"/>
+              </w:rPr>
+              <w:t>Negativa</w:t>
+            </w:r>
+          </w:p>
+        </w:tc>
+        <w:tc>
+          <w:tcPr>
+            <w:tcW w:w="900" w:type="dxa"/>
+            <w:vAlign w:val="center"/>
+          </w:tcPr>
+          <w:p>
+            <w:r>
+              <w:rPr>
+                <w:color w:val="000000"/>
+              </w:rPr>
+              <w:t>Alta</w:t>
+            </w:r>
+          </w:p>
+        </w:tc>
+        <w:tc>
+          <w:tcPr>
+            <w:tcW w:w="2600" w:type="dxa"/>
+            <w:vAlign w:val="center"/>
+          </w:tcPr>
+          <w:p>
+            <w:r>
+              <w:rPr>
+                <w:color w:val="000000"/>
+              </w:rPr>
+              <w:t>No lo agrega</w:t>
+            </w:r>
+          </w:p>
+        </w:tc>
+        <w:tc>
+          <w:tcPr>
+            <w:tcW w:w="900" w:type="dxa"/>
+            <w:vAlign w:val="center"/>
+          </w:tcPr>
+          <w:p>
+            <w:r>
+              <w:rPr>
+                <w:color w:val="000000"/>
+              </w:rPr>
+              <w:t>R-06</w:t>
+            </w:r>
+          </w:p>
+        </w:tc>
+        <w:tc>
+          <w:tcPr>
+            <w:tcW w:w="1400" w:type="dxa"/>
+            <w:vAlign w:val="center"/>
+          </w:tcPr>
+          <w:p>
+            <w:r>
+              <w:rPr>
+                <w:color w:val="000000"/>
+              </w:rPr>
+              <w:t>Aprobado</w:t>
+            </w:r>
+          </w:p>
+        </w:tc>
+      </w:tr>
+      <w:tr>
+        <w:tblPrEx>
+          <w:tblCellMar>
+            <w:top w:w="0" w:type="dxa"/>
+            <w:bottom w:w="0" w:type="dxa"/>
+          </w:tblCellMar>
+        </w:tblPrEx>
+        <w:tc>
+          <w:tcPr>
+            <w:tcW w:w="900" w:type="dxa"/>
+            <w:vAlign w:val="center"/>
+          </w:tcPr>
+          <w:p>
+            <w:r>
+              <w:rPr>
+                <w:color w:val="000000"/>
+              </w:rPr>
+              <w:t>CP-15</w:t>
+            </w:r>
+          </w:p>
+        </w:tc>
+        <w:tc>
+          <w:tcPr>
+            <w:tcW w:w="1500" w:type="dxa"/>
+            <w:vAlign w:val="center"/>
+          </w:tcPr>
+          <w:p>
+            <w:r>
+              <w:rPr>
+                <w:color w:val="000000"/>
+              </w:rPr>
+              <w:t>HU-06</w:t>
+            </w:r>
+          </w:p>
+        </w:tc>
+        <w:tc>
+          <w:tcPr>
+            <w:tcW w:w="2200" w:type="dxa"/>
+            <w:vAlign w:val="center"/>
+          </w:tcPr>
+          <w:p>
+            <w:r>
+              <w:rPr>
+                <w:color w:val="000000"/>
+              </w:rPr>
+              <w:t>Eliminar una línea</w:t>
+            </w:r>
+          </w:p>
+        </w:tc>
+        <w:tc>
+          <w:tcPr>
+            <w:tcW w:w="1400" w:type="dxa"/>
+            <w:vAlign w:val="center"/>
+          </w:tcPr>
+          <w:p>
+            <w:r>
+              <w:rPr>
+                <w:color w:val="000000"/>
+              </w:rPr>
+              <w:t>Positiva</w:t>
+            </w:r>
+          </w:p>
+        </w:tc>
+        <w:tc>
+          <w:tcPr>
+            <w:tcW w:w="900" w:type="dxa"/>
+            <w:vAlign w:val="center"/>
+          </w:tcPr>
+          <w:p>
+            <w:r>
+              <w:rPr>
+                <w:color w:val="000000"/>
+              </w:rPr>
+              <w:t>Alta</w:t>
+            </w:r>
+          </w:p>
+        </w:tc>
+        <w:tc>
+          <w:tcPr>
+            <w:tcW w:w="2600" w:type="dxa"/>
+            <w:vAlign w:val="center"/>
+          </w:tcPr>
+          <w:p>
+            <w:r>
+              <w:rPr>
+                <w:color w:val="000000"/>
+              </w:rPr>
+              <w:t>Recalcula el total</w:t>
+            </w:r>
+          </w:p>
+        </w:tc>
+        <w:tc>
+          <w:tcPr>
+            <w:tcW w:w="900" w:type="dxa"/>
+            <w:vAlign w:val="center"/>
+          </w:tcPr>
+          <w:p>
+            <w:r>
+              <w:rPr>
+                <w:color w:val="000000"/>
+              </w:rPr>
+              <w:t>R-07</w:t>
+            </w:r>
+          </w:p>
+        </w:tc>
+        <w:tc>
+          <w:tcPr>
+            <w:tcW w:w="1400" w:type="dxa"/>
+            <w:vAlign w:val="center"/>
+          </w:tcPr>
+          <w:p>
+            <w:r>
+              <w:rPr>
+                <w:color w:val="000000"/>
+              </w:rPr>
+              <w:t>Aprobado</w:t>
+            </w:r>
+          </w:p>
+        </w:tc>
+      </w:tr>
+      <w:tr>
+        <w:tblPrEx>
+          <w:tblCellMar>
+            <w:top w:w="0" w:type="dxa"/>
+            <w:bottom w:w="0" w:type="dxa"/>
+          </w:tblCellMar>
+        </w:tblPrEx>
+        <w:tc>
+          <w:tcPr>
+            <w:tcW w:w="900" w:type="dxa"/>
+            <w:vAlign w:val="center"/>
+          </w:tcPr>
+          <w:p>
+            <w:r>
+              <w:rPr>
+                <w:color w:val="000000"/>
+              </w:rPr>
+              <w:t>CP-16</w:t>
+            </w:r>
+          </w:p>
+        </w:tc>
+        <w:tc>
+          <w:tcPr>
+            <w:tcW w:w="1500" w:type="dxa"/>
+            <w:vAlign w:val="center"/>
+          </w:tcPr>
+          <w:p>
+            <w:r>
+              <w:rPr>
+                <w:color w:val="000000"/>
+              </w:rPr>
+              <w:t>HU-07 / RN-01</w:t>
+            </w:r>
+          </w:p>
+        </w:tc>
+        <w:tc>
+          <w:tcPr>
+            <w:tcW w:w="2200" w:type="dxa"/>
+            <w:vAlign w:val="center"/>
+          </w:tcPr>
+          <w:p>
+            <w:r>
+              <w:rPr>
+                <w:color w:val="000000"/>
+              </w:rPr>
+              <w:t>Enviar con Q399.99</w:t>
+            </w:r>
+          </w:p>
+        </w:tc>
+        <w:tc>
+          <w:tcPr>
+            <w:tcW w:w="1400" w:type="dxa"/>
+            <w:vAlign w:val="center"/>
+          </w:tcPr>
+          <w:p>
+            <w:r>
+              <w:rPr>
+                <w:color w:val="000000"/>
+              </w:rPr>
+              <w:t>Valores límite</w:t>
+            </w:r>
+          </w:p>
+        </w:tc>
+        <w:tc>
+          <w:tcPr>
+            <w:tcW w:w="900" w:type="dxa"/>
+            <w:vAlign w:val="center"/>
+          </w:tcPr>
+          <w:p>
+            <w:r>
+              <w:rPr>
+                <w:color w:val="000000"/>
+              </w:rPr>
+              <w:t>Crítica</w:t>
+            </w:r>
+          </w:p>
+        </w:tc>
+        <w:tc>
+          <w:tcPr>
+            <w:tcW w:w="2600" w:type="dxa"/>
+            <w:vAlign w:val="center"/>
+          </w:tcPr>
+          <w:p>
+            <w:r>
+              <w:rPr>
+                <w:color w:val="000000"/>
+              </w:rPr>
+              <w:t>No deja, dice cuánto falta</w:t>
+            </w:r>
+          </w:p>
+        </w:tc>
+        <w:tc>
+          <w:tcPr>
+            <w:tcW w:w="900" w:type="dxa"/>
+            <w:vAlign w:val="center"/>
+          </w:tcPr>
+          <w:p>
+            <w:r>
+              <w:rPr>
+                <w:color w:val="000000"/>
+              </w:rPr>
+              <w:t>R-01</w:t>
+            </w:r>
+          </w:p>
+        </w:tc>
+        <w:tc>
+          <w:tcPr>
+            <w:tcW w:w="1400" w:type="dxa"/>
+            <w:vAlign w:val="center"/>
+          </w:tcPr>
+          <w:p>
+            <w:r>
+              <w:rPr>
+                <w:color w:val="000000"/>
+              </w:rPr>
+              <w:t>Aprobado</w:t>
+            </w:r>
+          </w:p>
+        </w:tc>
+      </w:tr>
+      <w:tr>
+        <w:tblPrEx>
+          <w:tblCellMar>
+            <w:top w:w="0" w:type="dxa"/>
+            <w:bottom w:w="0" w:type="dxa"/>
+          </w:tblCellMar>
+        </w:tblPrEx>
+        <w:tc>
+          <w:tcPr>
+            <w:tcW w:w="900" w:type="dxa"/>
+            <w:vAlign w:val="center"/>
+          </w:tcPr>
+          <w:p>
+            <w:r>
+              <w:rPr>
+                <w:color w:val="000000"/>
+              </w:rPr>
+              <w:t>CP-17</w:t>
+            </w:r>
+          </w:p>
+        </w:tc>
+        <w:tc>
+          <w:tcPr>
+            <w:tcW w:w="1500" w:type="dxa"/>
+            <w:vAlign w:val="center"/>
+          </w:tcPr>
+          <w:p>
+            <w:r>
+              <w:rPr>
+                <w:color w:val="000000"/>
+              </w:rPr>
+              <w:t>HU-07 / RN-01</w:t>
+            </w:r>
+          </w:p>
+        </w:tc>
+        <w:tc>
+          <w:tcPr>
+            <w:tcW w:w="2200" w:type="dxa"/>
+            <w:vAlign w:val="center"/>
+          </w:tcPr>
+          <w:p>
+            <w:r>
+              <w:rPr>
+                <w:color w:val="000000"/>
+              </w:rPr>
+              <w:t>Enviar con Q400.00</w:t>
+            </w:r>
+          </w:p>
+        </w:tc>
+        <w:tc>
+          <w:tcPr>
+            <w:tcW w:w="1400" w:type="dxa"/>
+            <w:vAlign w:val="center"/>
+          </w:tcPr>
+          <w:p>
+            <w:r>
+              <w:rPr>
+                <w:color w:val="000000"/>
+              </w:rPr>
+              <w:t>Valores límite</w:t>
+            </w:r>
+          </w:p>
+        </w:tc>
+        <w:tc>
+          <w:tcPr>
+            <w:tcW w:w="900" w:type="dxa"/>
+            <w:vAlign w:val="center"/>
+          </w:tcPr>
+          <w:p>
+            <w:r>
+              <w:rPr>
+                <w:color w:val="000000"/>
+              </w:rPr>
+              <w:t>Crítica</w:t>
+            </w:r>
+          </w:p>
+        </w:tc>
+        <w:tc>
+          <w:tcPr>
+            <w:tcW w:w="2600" w:type="dxa"/>
+            <w:vAlign w:val="center"/>
+          </w:tcPr>
+          <w:p>
+            <w:r>
+              <w:rPr>
+                <w:color w:val="000000"/>
+              </w:rPr>
+              <w:t>Envía y da el número</w:t>
+            </w:r>
+          </w:p>
+        </w:tc>
+        <w:tc>
+          <w:tcPr>
+            <w:tcW w:w="900" w:type="dxa"/>
+            <w:vAlign w:val="center"/>
+          </w:tcPr>
+          <w:p>
+            <w:r>
+              <w:rPr>
+                <w:color w:val="000000"/>
+              </w:rPr>
+              <w:t>R-01</w:t>
+            </w:r>
+          </w:p>
+        </w:tc>
+        <w:tc>
+          <w:tcPr>
+            <w:tcW w:w="1400" w:type="dxa"/>
+            <w:vAlign w:val="center"/>
+          </w:tcPr>
+          <w:p>
+            <w:r>
+              <w:rPr>
+                <w:color w:val="000000"/>
+              </w:rPr>
+              <w:t>Aprobado</w:t>
+            </w:r>
+          </w:p>
+        </w:tc>
+      </w:tr>
+      <w:tr>
+        <w:tblPrEx>
+          <w:tblCellMar>
+            <w:top w:w="0" w:type="dxa"/>
+            <w:bottom w:w="0" w:type="dxa"/>
+          </w:tblCellMar>
+        </w:tblPrEx>
+        <w:tc>
+          <w:tcPr>
+            <w:tcW w:w="900" w:type="dxa"/>
+            <w:vAlign w:val="center"/>
+          </w:tcPr>
+          <w:p>
+            <w:r>
+              <w:rPr>
+                <w:color w:val="000000"/>
+              </w:rPr>
+              <w:t>CP-18</w:t>
+            </w:r>
+          </w:p>
+        </w:tc>
+        <w:tc>
+          <w:tcPr>
+            <w:tcW w:w="1500" w:type="dxa"/>
+            <w:vAlign w:val="center"/>
+          </w:tcPr>
+          <w:p>
+            <w:r>
+              <w:rPr>
+                <w:color w:val="000000"/>
+              </w:rPr>
+              <w:t>HU-07</w:t>
+            </w:r>
+          </w:p>
+        </w:tc>
+        <w:tc>
+          <w:tcPr>
+            <w:tcW w:w="2200" w:type="dxa"/>
+            <w:vAlign w:val="center"/>
+          </w:tcPr>
+          <w:p>
+            <w:r>
+              <w:rPr>
+                <w:color w:val="000000"/>
+              </w:rPr>
+              <w:t>Doble clic en enviar</w:t>
+            </w:r>
+          </w:p>
+        </w:tc>
+        <w:tc>
+          <w:tcPr>
+            <w:tcW w:w="1400" w:type="dxa"/>
+            <w:vAlign w:val="center"/>
+          </w:tcPr>
+          <w:p>
+            <w:r>
+              <w:rPr>
+                <w:color w:val="000000"/>
+              </w:rPr>
+              <w:t>Estim. de errores</w:t>
+            </w:r>
+          </w:p>
+        </w:tc>
+        <w:tc>
+          <w:tcPr>
+            <w:tcW w:w="900" w:type="dxa"/>
+            <w:vAlign w:val="center"/>
+          </w:tcPr>
+          <w:p>
+            <w:r>
+              <w:rPr>
+                <w:color w:val="000000"/>
+              </w:rPr>
+              <w:t>Crítica</w:t>
+            </w:r>
+          </w:p>
+        </w:tc>
+        <w:tc>
+          <w:tcPr>
+            <w:tcW w:w="2600" w:type="dxa"/>
+            <w:vAlign w:val="center"/>
+          </w:tcPr>
+          <w:p>
+            <w:r>
+              <w:rPr>
+                <w:color w:val="000000"/>
+              </w:rPr>
+              <w:t>Un solo pedido</w:t>
+            </w:r>
+          </w:p>
+        </w:tc>
+        <w:tc>
+          <w:tcPr>
+            <w:tcW w:w="900" w:type="dxa"/>
+            <w:vAlign w:val="center"/>
+          </w:tcPr>
+          <w:p>
+            <w:r>
+              <w:rPr>
+                <w:color w:val="000000"/>
+              </w:rPr>
+              <w:t>R-03</w:t>
+            </w:r>
+          </w:p>
+        </w:tc>
+        <w:tc>
+          <w:tcPr>
+            <w:tcW w:w="1400" w:type="dxa"/>
+            <w:vAlign w:val="center"/>
+          </w:tcPr>
+          <w:p>
+            <w:r>
+              <w:rPr>
+                <w:color w:val="000000"/>
+              </w:rPr>
               <w:t>No ejecutado</w:t>
             </w:r>
           </w:p>
@@ -7292,7 +9212,7 @@
               <w:rPr>
                 <w:color w:val="000000"/>
               </w:rPr>
-              <w:t>CP-03</w:t>
+              <w:t>CP-19</w:t>
             </w:r>
           </w:p>
         </w:tc>
@@ -7306,7 +9226,7 @@
               <w:rPr>
                 <w:color w:val="000000"/>
               </w:rPr>
-              <w:t>HU-02</w:t>
+              <w:t>HU-08</w:t>
             </w:r>
           </w:p>
         </w:tc>
@@ -7320,7 +9240,7 @@
               <w:rPr>
                 <w:color w:val="000000"/>
               </w:rPr>
-              <w:t>Contraseña incorrecta</w:t>
+              <w:t>Botón atrás tras salir</w:t>
             </w:r>
           </w:p>
         </w:tc>
@@ -7334,7 +9254,7 @@
               <w:rPr>
                 <w:color w:val="000000"/>
               </w:rPr>
-              <w:t>Equivalencia</w:t>
+              <w:t>Estim. de errores</w:t>
             </w:r>
           </w:p>
         </w:tc>
@@ -7348,7 +9268,7 @@
               <w:rPr>
                 <w:color w:val="000000"/>
               </w:rPr>
-              <w:t>Alta</w:t>
+              <w:t>Media</w:t>
             </w:r>
           </w:p>
         </w:tc>
@@ -7362,7 +9282,7 @@
               <w:rPr>
                 <w:color w:val="000000"/>
               </w:rPr>
-              <w:t>No entra y avisa</w:t>
+              <w:t>No vuelve a entrar</w:t>
             </w:r>
           </w:p>
         </w:tc>
@@ -7376,7 +9296,7 @@
               <w:rPr>
                 <w:color w:val="000000"/>
               </w:rPr>
-              <w:t>—</w:t>
+              <w:t>R-05</w:t>
             </w:r>
           </w:p>
         </w:tc>
@@ -7391,1926 +9311,6 @@
                 <w:color w:val="000000"/>
               </w:rPr>
               <w:t>Aprobado</w:t>
-            </w:r>
-          </w:p>
-        </w:tc>
-      </w:tr>
-      <w:tr>
-        <w:tblPrEx>
-          <w:tblCellMar>
-            <w:top w:w="0" w:type="dxa"/>
-            <w:bottom w:w="0" w:type="dxa"/>
-          </w:tblCellMar>
-        </w:tblPrEx>
-        <w:tc>
-          <w:tcPr>
-            <w:tcW w:w="900" w:type="dxa"/>
-            <w:vAlign w:val="center"/>
-          </w:tcPr>
-          <w:p>
-            <w:r>
-              <w:rPr>
-                <w:color w:val="000000"/>
-              </w:rPr>
-              <w:t>CP-04</w:t>
-            </w:r>
-          </w:p>
-        </w:tc>
-        <w:tc>
-          <w:tcPr>
-            <w:tcW w:w="1500" w:type="dxa"/>
-            <w:vAlign w:val="center"/>
-          </w:tcPr>
-          <w:p>
-            <w:r>
-              <w:rPr>
-                <w:color w:val="000000"/>
-              </w:rPr>
-              <w:t>HU-02</w:t>
-            </w:r>
-          </w:p>
-        </w:tc>
-        <w:tc>
-          <w:tcPr>
-            <w:tcW w:w="2200" w:type="dxa"/>
-            <w:vAlign w:val="center"/>
-          </w:tcPr>
-          <w:p>
-            <w:r>
-              <w:rPr>
-                <w:color w:val="000000"/>
-              </w:rPr>
-              <w:t>Campos vacíos</w:t>
-            </w:r>
-          </w:p>
-        </w:tc>
-        <w:tc>
-          <w:tcPr>
-            <w:tcW w:w="1400" w:type="dxa"/>
-            <w:vAlign w:val="center"/>
-          </w:tcPr>
-          <w:p>
-            <w:r>
-              <w:rPr>
-                <w:color w:val="000000"/>
-              </w:rPr>
-              <w:t>Equivalencia</w:t>
-            </w:r>
-          </w:p>
-        </w:tc>
-        <w:tc>
-          <w:tcPr>
-            <w:tcW w:w="900" w:type="dxa"/>
-            <w:vAlign w:val="center"/>
-          </w:tcPr>
-          <w:p>
-            <w:r>
-              <w:rPr>
-                <w:color w:val="000000"/>
-              </w:rPr>
-              <w:t>Media</w:t>
-            </w:r>
-          </w:p>
-        </w:tc>
-        <w:tc>
-          <w:tcPr>
-            <w:tcW w:w="2600" w:type="dxa"/>
-            <w:vAlign w:val="center"/>
-          </w:tcPr>
-          <w:p>
-            <w:r>
-              <w:rPr>
-                <w:color w:val="000000"/>
-              </w:rPr>
-              <w:t>Pide llenarlos</w:t>
-            </w:r>
-          </w:p>
-        </w:tc>
-        <w:tc>
-          <w:tcPr>
-            <w:tcW w:w="900" w:type="dxa"/>
-            <w:vAlign w:val="center"/>
-          </w:tcPr>
-          <w:p>
-            <w:r>
-              <w:rPr>
-                <w:color w:val="000000"/>
-              </w:rPr>
-              <w:t>—</w:t>
-            </w:r>
-          </w:p>
-        </w:tc>
-        <w:tc>
-          <w:tcPr>
-            <w:tcW w:w="1400" w:type="dxa"/>
-            <w:vAlign w:val="center"/>
-          </w:tcPr>
-          <w:p>
-            <w:r>
-              <w:rPr>
-                <w:color w:val="000000"/>
-              </w:rPr>
-              <w:t>Aprobado</w:t>
-            </w:r>
-          </w:p>
-        </w:tc>
-      </w:tr>
-      <w:tr>
-        <w:tblPrEx>
-          <w:tblCellMar>
-            <w:top w:w="0" w:type="dxa"/>
-            <w:bottom w:w="0" w:type="dxa"/>
-          </w:tblCellMar>
-        </w:tblPrEx>
-        <w:tc>
-          <w:tcPr>
-            <w:tcW w:w="900" w:type="dxa"/>
-            <w:vAlign w:val="center"/>
-          </w:tcPr>
-          <w:p>
-            <w:r>
-              <w:rPr>
-                <w:color w:val="000000"/>
-              </w:rPr>
-              <w:t>CP-05</w:t>
-            </w:r>
-          </w:p>
-        </w:tc>
-        <w:tc>
-          <w:tcPr>
-            <w:tcW w:w="1500" w:type="dxa"/>
-            <w:vAlign w:val="center"/>
-          </w:tcPr>
-          <w:p>
-            <w:r>
-              <w:rPr>
-                <w:color w:val="000000"/>
-              </w:rPr>
-              <w:t>HU-02</w:t>
-            </w:r>
-          </w:p>
-        </w:tc>
-        <w:tc>
-          <w:tcPr>
-            <w:tcW w:w="2200" w:type="dxa"/>
-            <w:vAlign w:val="center"/>
-          </w:tcPr>
-          <w:p>
-            <w:r>
-              <w:rPr>
-                <w:color w:val="000000"/>
-              </w:rPr>
-              <w:t>URL sin sesión</w:t>
-            </w:r>
-          </w:p>
-        </w:tc>
-        <w:tc>
-          <w:tcPr>
-            <w:tcW w:w="1400" w:type="dxa"/>
-            <w:vAlign w:val="center"/>
-          </w:tcPr>
-          <w:p>
-            <w:r>
-              <w:rPr>
-                <w:color w:val="000000"/>
-              </w:rPr>
-              <w:t>Negativa</w:t>
-            </w:r>
-          </w:p>
-        </w:tc>
-        <w:tc>
-          <w:tcPr>
-            <w:tcW w:w="900" w:type="dxa"/>
-            <w:vAlign w:val="center"/>
-          </w:tcPr>
-          <w:p>
-            <w:r>
-              <w:rPr>
-                <w:color w:val="000000"/>
-              </w:rPr>
-              <w:t>Alta</w:t>
-            </w:r>
-          </w:p>
-        </w:tc>
-        <w:tc>
-          <w:tcPr>
-            <w:tcW w:w="2600" w:type="dxa"/>
-            <w:vAlign w:val="center"/>
-          </w:tcPr>
-          <w:p>
-            <w:r>
-              <w:rPr>
-                <w:color w:val="000000"/>
-              </w:rPr>
-              <w:t>Manda al login</w:t>
-            </w:r>
-          </w:p>
-        </w:tc>
-        <w:tc>
-          <w:tcPr>
-            <w:tcW w:w="900" w:type="dxa"/>
-            <w:vAlign w:val="center"/>
-          </w:tcPr>
-          <w:p>
-            <w:r>
-              <w:rPr>
-                <w:color w:val="000000"/>
-              </w:rPr>
-              <w:t>R-04</w:t>
-            </w:r>
-          </w:p>
-        </w:tc>
-        <w:tc>
-          <w:tcPr>
-            <w:tcW w:w="1400" w:type="dxa"/>
-            <w:vAlign w:val="center"/>
-          </w:tcPr>
-          <w:p>
-            <w:r>
-              <w:rPr>
-                <w:color w:val="000000"/>
-              </w:rPr>
-              <w:t>No ejecutado</w:t>
-            </w:r>
-          </w:p>
-        </w:tc>
-      </w:tr>
-      <w:tr>
-        <w:tblPrEx>
-          <w:tblCellMar>
-            <w:top w:w="0" w:type="dxa"/>
-            <w:bottom w:w="0" w:type="dxa"/>
-          </w:tblCellMar>
-        </w:tblPrEx>
-        <w:tc>
-          <w:tcPr>
-            <w:tcW w:w="900" w:type="dxa"/>
-            <w:vAlign w:val="center"/>
-          </w:tcPr>
-          <w:p>
-            <w:r>
-              <w:rPr>
-                <w:color w:val="000000"/>
-              </w:rPr>
-              <w:t>CP-06</w:t>
-            </w:r>
-          </w:p>
-        </w:tc>
-        <w:tc>
-          <w:tcPr>
-            <w:tcW w:w="1500" w:type="dxa"/>
-            <w:vAlign w:val="center"/>
-          </w:tcPr>
-          <w:p>
-            <w:r>
-              <w:rPr>
-                <w:color w:val="000000"/>
-              </w:rPr>
-              <w:t>HU-03 / RN-03</w:t>
-            </w:r>
-          </w:p>
-        </w:tc>
-        <w:tc>
-          <w:tcPr>
-            <w:tcW w:w="2200" w:type="dxa"/>
-            <w:vAlign w:val="center"/>
-          </w:tcPr>
-          <w:p>
-            <w:r>
-              <w:rPr>
-                <w:color w:val="000000"/>
-              </w:rPr>
-              <w:t>Agotados marcados</w:t>
-            </w:r>
-          </w:p>
-        </w:tc>
-        <w:tc>
-          <w:tcPr>
-            <w:tcW w:w="1400" w:type="dxa"/>
-            <w:vAlign w:val="center"/>
-          </w:tcPr>
-          <w:p>
-            <w:r>
-              <w:rPr>
-                <w:color w:val="000000"/>
-              </w:rPr>
-              <w:t>Positiva</w:t>
-            </w:r>
-          </w:p>
-        </w:tc>
-        <w:tc>
-          <w:tcPr>
-            <w:tcW w:w="900" w:type="dxa"/>
-            <w:vAlign w:val="center"/>
-          </w:tcPr>
-          <w:p>
-            <w:r>
-              <w:rPr>
-                <w:color w:val="000000"/>
-              </w:rPr>
-              <w:t>Media</w:t>
-            </w:r>
-          </w:p>
-        </w:tc>
-        <w:tc>
-          <w:tcPr>
-            <w:tcW w:w="2600" w:type="dxa"/>
-            <w:vAlign w:val="center"/>
-          </w:tcPr>
-          <w:p>
-            <w:r>
-              <w:rPr>
-                <w:color w:val="000000"/>
-              </w:rPr>
-              <w:t>8 productos, 2 marcados</w:t>
-            </w:r>
-          </w:p>
-        </w:tc>
-        <w:tc>
-          <w:tcPr>
-            <w:tcW w:w="900" w:type="dxa"/>
-            <w:vAlign w:val="center"/>
-          </w:tcPr>
-          <w:p>
-            <w:r>
-              <w:rPr>
-                <w:color w:val="000000"/>
-              </w:rPr>
-              <w:t>R-06</w:t>
-            </w:r>
-          </w:p>
-        </w:tc>
-        <w:tc>
-          <w:tcPr>
-            <w:tcW w:w="1400" w:type="dxa"/>
-            <w:vAlign w:val="center"/>
-          </w:tcPr>
-          <w:p>
-            <w:r>
-              <w:rPr>
-                <w:color w:val="000000"/>
-              </w:rPr>
-              <w:t>No ejecutado</w:t>
-            </w:r>
-          </w:p>
-        </w:tc>
-      </w:tr>
-      <w:tr>
-        <w:tblPrEx>
-          <w:tblCellMar>
-            <w:top w:w="0" w:type="dxa"/>
-            <w:bottom w:w="0" w:type="dxa"/>
-          </w:tblCellMar>
-        </w:tblPrEx>
-        <w:tc>
-          <w:tcPr>
-            <w:tcW w:w="900" w:type="dxa"/>
-            <w:vAlign w:val="center"/>
-          </w:tcPr>
-          <w:p>
-            <w:r>
-              <w:rPr>
-                <w:color w:val="000000"/>
-              </w:rPr>
-              <w:t>CP-07</w:t>
-            </w:r>
-          </w:p>
-        </w:tc>
-        <w:tc>
-          <w:tcPr>
-            <w:tcW w:w="1500" w:type="dxa"/>
-            <w:vAlign w:val="center"/>
-          </w:tcPr>
-          <w:p>
-            <w:r>
-              <w:rPr>
-                <w:color w:val="000000"/>
-              </w:rPr>
-              <w:t>HU-04</w:t>
-            </w:r>
-          </w:p>
-        </w:tc>
-        <w:tc>
-          <w:tcPr>
-            <w:tcW w:w="2200" w:type="dxa"/>
-            <w:vAlign w:val="center"/>
-          </w:tcPr>
-          <w:p>
-            <w:r>
-              <w:rPr>
-                <w:color w:val="000000"/>
-              </w:rPr>
-              <w:t>SKU existente</w:t>
-            </w:r>
-          </w:p>
-        </w:tc>
-        <w:tc>
-          <w:tcPr>
-            <w:tcW w:w="1400" w:type="dxa"/>
-            <w:vAlign w:val="center"/>
-          </w:tcPr>
-          <w:p>
-            <w:r>
-              <w:rPr>
-                <w:color w:val="000000"/>
-              </w:rPr>
-              <w:t>Equivalencia</w:t>
-            </w:r>
-          </w:p>
-        </w:tc>
-        <w:tc>
-          <w:tcPr>
-            <w:tcW w:w="900" w:type="dxa"/>
-            <w:vAlign w:val="center"/>
-          </w:tcPr>
-          <w:p>
-            <w:r>
-              <w:rPr>
-                <w:color w:val="000000"/>
-              </w:rPr>
-              <w:t>Media</w:t>
-            </w:r>
-          </w:p>
-        </w:tc>
-        <w:tc>
-          <w:tcPr>
-            <w:tcW w:w="2600" w:type="dxa"/>
-            <w:vAlign w:val="center"/>
-          </w:tcPr>
-          <w:p>
-            <w:r>
-              <w:rPr>
-                <w:color w:val="000000"/>
-              </w:rPr>
-              <w:t>Muestra ese producto</w:t>
-            </w:r>
-          </w:p>
-        </w:tc>
-        <w:tc>
-          <w:tcPr>
-            <w:tcW w:w="900" w:type="dxa"/>
-            <w:vAlign w:val="center"/>
-          </w:tcPr>
-          <w:p>
-            <w:r>
-              <w:rPr>
-                <w:color w:val="000000"/>
-              </w:rPr>
-              <w:t>—</w:t>
-            </w:r>
-          </w:p>
-        </w:tc>
-        <w:tc>
-          <w:tcPr>
-            <w:tcW w:w="1400" w:type="dxa"/>
-            <w:vAlign w:val="center"/>
-          </w:tcPr>
-          <w:p>
-            <w:r>
-              <w:rPr>
-                <w:color w:val="000000"/>
-              </w:rPr>
-              <w:t>Aprobado</w:t>
-            </w:r>
-          </w:p>
-        </w:tc>
-      </w:tr>
-      <w:tr>
-        <w:tblPrEx>
-          <w:tblCellMar>
-            <w:top w:w="0" w:type="dxa"/>
-            <w:bottom w:w="0" w:type="dxa"/>
-          </w:tblCellMar>
-        </w:tblPrEx>
-        <w:tc>
-          <w:tcPr>
-            <w:tcW w:w="900" w:type="dxa"/>
-            <w:vAlign w:val="center"/>
-          </w:tcPr>
-          <w:p>
-            <w:r>
-              <w:rPr>
-                <w:color w:val="000000"/>
-              </w:rPr>
-              <w:t>CP-08</w:t>
-            </w:r>
-          </w:p>
-        </w:tc>
-        <w:tc>
-          <w:tcPr>
-            <w:tcW w:w="1500" w:type="dxa"/>
-            <w:vAlign w:val="center"/>
-          </w:tcPr>
-          <w:p>
-            <w:r>
-              <w:rPr>
-                <w:color w:val="000000"/>
-              </w:rPr>
-              <w:t>HU-04</w:t>
-            </w:r>
-          </w:p>
-        </w:tc>
-        <w:tc>
-          <w:tcPr>
-            <w:tcW w:w="2200" w:type="dxa"/>
-            <w:vAlign w:val="center"/>
-          </w:tcPr>
-          <w:p>
-            <w:r>
-              <w:rPr>
-                <w:color w:val="000000"/>
-              </w:rPr>
-              <w:t>SKU inexistente</w:t>
-            </w:r>
-          </w:p>
-        </w:tc>
-        <w:tc>
-          <w:tcPr>
-            <w:tcW w:w="1400" w:type="dxa"/>
-            <w:vAlign w:val="center"/>
-          </w:tcPr>
-          <w:p>
-            <w:r>
-              <w:rPr>
-                <w:color w:val="000000"/>
-              </w:rPr>
-              <w:t>Equivalencia</w:t>
-            </w:r>
-          </w:p>
-        </w:tc>
-        <w:tc>
-          <w:tcPr>
-            <w:tcW w:w="900" w:type="dxa"/>
-            <w:vAlign w:val="center"/>
-          </w:tcPr>
-          <w:p>
-            <w:r>
-              <w:rPr>
-                <w:color w:val="000000"/>
-              </w:rPr>
-              <w:t>Media</w:t>
-            </w:r>
-          </w:p>
-        </w:tc>
-        <w:tc>
-          <w:tcPr>
-            <w:tcW w:w="2600" w:type="dxa"/>
-            <w:vAlign w:val="center"/>
-          </w:tcPr>
-          <w:p>
-            <w:r>
-              <w:rPr>
-                <w:color w:val="000000"/>
-              </w:rPr>
-              <w:t>Avisa sin resultados</w:t>
-            </w:r>
-          </w:p>
-        </w:tc>
-        <w:tc>
-          <w:tcPr>
-            <w:tcW w:w="900" w:type="dxa"/>
-            <w:vAlign w:val="center"/>
-          </w:tcPr>
-          <w:p>
-            <w:r>
-              <w:rPr>
-                <w:color w:val="000000"/>
-              </w:rPr>
-              <w:t>—</w:t>
-            </w:r>
-          </w:p>
-        </w:tc>
-        <w:tc>
-          <w:tcPr>
-            <w:tcW w:w="1400" w:type="dxa"/>
-            <w:vAlign w:val="center"/>
-          </w:tcPr>
-          <w:p>
-            <w:r>
-              <w:rPr>
-                <w:color w:val="000000"/>
-              </w:rPr>
-              <w:t>Aprobado</w:t>
-            </w:r>
-          </w:p>
-        </w:tc>
-      </w:tr>
-      <w:tr>
-        <w:tblPrEx>
-          <w:tblCellMar>
-            <w:top w:w="0" w:type="dxa"/>
-            <w:bottom w:w="0" w:type="dxa"/>
-          </w:tblCellMar>
-        </w:tblPrEx>
-        <w:tc>
-          <w:tcPr>
-            <w:tcW w:w="900" w:type="dxa"/>
-            <w:vAlign w:val="center"/>
-          </w:tcPr>
-          <w:p>
-            <w:r>
-              <w:rPr>
-                <w:color w:val="000000"/>
-              </w:rPr>
-              <w:t>CP-09</w:t>
-            </w:r>
-          </w:p>
-        </w:tc>
-        <w:tc>
-          <w:tcPr>
-            <w:tcW w:w="1500" w:type="dxa"/>
-            <w:vAlign w:val="center"/>
-          </w:tcPr>
-          <w:p>
-            <w:r>
-              <w:rPr>
-                <w:color w:val="000000"/>
-              </w:rPr>
-              <w:t>HU-05 / RN-02</w:t>
-            </w:r>
-          </w:p>
-        </w:tc>
-        <w:tc>
-          <w:tcPr>
-            <w:tcW w:w="2200" w:type="dxa"/>
-            <w:vAlign w:val="center"/>
-          </w:tcPr>
-          <w:p>
-            <w:r>
-              <w:rPr>
-                <w:color w:val="000000"/>
-              </w:rPr>
-              <w:t>Cantidad 1</w:t>
-            </w:r>
-          </w:p>
-        </w:tc>
-        <w:tc>
-          <w:tcPr>
-            <w:tcW w:w="1400" w:type="dxa"/>
-            <w:vAlign w:val="center"/>
-          </w:tcPr>
-          <w:p>
-            <w:r>
-              <w:rPr>
-                <w:color w:val="000000"/>
-              </w:rPr>
-              <w:t>Valores límite</w:t>
-            </w:r>
-          </w:p>
-        </w:tc>
-        <w:tc>
-          <w:tcPr>
-            <w:tcW w:w="900" w:type="dxa"/>
-            <w:vAlign w:val="center"/>
-          </w:tcPr>
-          <w:p>
-            <w:r>
-              <w:rPr>
-                <w:color w:val="000000"/>
-              </w:rPr>
-              <w:t>Alta</w:t>
-            </w:r>
-          </w:p>
-        </w:tc>
-        <w:tc>
-          <w:tcPr>
-            <w:tcW w:w="2600" w:type="dxa"/>
-            <w:vAlign w:val="center"/>
-          </w:tcPr>
-          <w:p>
-            <w:r>
-              <w:rPr>
-                <w:color w:val="000000"/>
-              </w:rPr>
-              <w:t>Lo agrega</w:t>
-            </w:r>
-          </w:p>
-        </w:tc>
-        <w:tc>
-          <w:tcPr>
-            <w:tcW w:w="900" w:type="dxa"/>
-            <w:vAlign w:val="center"/>
-          </w:tcPr>
-          <w:p>
-            <w:r>
-              <w:rPr>
-                <w:color w:val="000000"/>
-              </w:rPr>
-              <w:t>R-02</w:t>
-            </w:r>
-          </w:p>
-        </w:tc>
-        <w:tc>
-          <w:tcPr>
-            <w:tcW w:w="1400" w:type="dxa"/>
-            <w:vAlign w:val="center"/>
-          </w:tcPr>
-          <w:p>
-            <w:r>
-              <w:rPr>
-                <w:color w:val="000000"/>
-              </w:rPr>
-              <w:t>Aprobado</w:t>
-            </w:r>
-          </w:p>
-        </w:tc>
-      </w:tr>
-      <w:tr>
-        <w:tblPrEx>
-          <w:tblCellMar>
-            <w:top w:w="0" w:type="dxa"/>
-            <w:bottom w:w="0" w:type="dxa"/>
-          </w:tblCellMar>
-        </w:tblPrEx>
-        <w:tc>
-          <w:tcPr>
-            <w:tcW w:w="900" w:type="dxa"/>
-            <w:vAlign w:val="center"/>
-          </w:tcPr>
-          <w:p>
-            <w:r>
-              <w:rPr>
-                <w:color w:val="000000"/>
-              </w:rPr>
-              <w:t>CP-10</w:t>
-            </w:r>
-          </w:p>
-        </w:tc>
-        <w:tc>
-          <w:tcPr>
-            <w:tcW w:w="1500" w:type="dxa"/>
-            <w:vAlign w:val="center"/>
-          </w:tcPr>
-          <w:p>
-            <w:r>
-              <w:rPr>
-                <w:color w:val="000000"/>
-              </w:rPr>
-              <w:t>HU-05 / RN-02</w:t>
-            </w:r>
-          </w:p>
-        </w:tc>
-        <w:tc>
-          <w:tcPr>
-            <w:tcW w:w="2200" w:type="dxa"/>
-            <w:vAlign w:val="center"/>
-          </w:tcPr>
-          <w:p>
-            <w:r>
-              <w:rPr>
-                <w:color w:val="000000"/>
-              </w:rPr>
-              <w:t>Cantidad 99</w:t>
-            </w:r>
-          </w:p>
-        </w:tc>
-        <w:tc>
-          <w:tcPr>
-            <w:tcW w:w="1400" w:type="dxa"/>
-            <w:vAlign w:val="center"/>
-          </w:tcPr>
-          <w:p>
-            <w:r>
-              <w:rPr>
-                <w:color w:val="000000"/>
-              </w:rPr>
-              <w:t>Valores límite</w:t>
-            </w:r>
-          </w:p>
-        </w:tc>
-        <w:tc>
-          <w:tcPr>
-            <w:tcW w:w="900" w:type="dxa"/>
-            <w:vAlign w:val="center"/>
-          </w:tcPr>
-          <w:p>
-            <w:r>
-              <w:rPr>
-                <w:color w:val="000000"/>
-              </w:rPr>
-              <w:t>Alta</w:t>
-            </w:r>
-          </w:p>
-        </w:tc>
-        <w:tc>
-          <w:tcPr>
-            <w:tcW w:w="2600" w:type="dxa"/>
-            <w:vAlign w:val="center"/>
-          </w:tcPr>
-          <w:p>
-            <w:r>
-              <w:rPr>
-                <w:color w:val="000000"/>
-              </w:rPr>
-              <w:t>Lo agrega</w:t>
-            </w:r>
-          </w:p>
-        </w:tc>
-        <w:tc>
-          <w:tcPr>
-            <w:tcW w:w="900" w:type="dxa"/>
-            <w:vAlign w:val="center"/>
-          </w:tcPr>
-          <w:p>
-            <w:r>
-              <w:rPr>
-                <w:color w:val="000000"/>
-              </w:rPr>
-              <w:t>R-02</w:t>
-            </w:r>
-          </w:p>
-        </w:tc>
-        <w:tc>
-          <w:tcPr>
-            <w:tcW w:w="1400" w:type="dxa"/>
-            <w:vAlign w:val="center"/>
-          </w:tcPr>
-          <w:p>
-            <w:r>
-              <w:rPr>
-                <w:color w:val="000000"/>
-              </w:rPr>
-              <w:t>Aprobado</w:t>
-            </w:r>
-          </w:p>
-        </w:tc>
-      </w:tr>
-      <w:tr>
-        <w:tblPrEx>
-          <w:tblCellMar>
-            <w:top w:w="0" w:type="dxa"/>
-            <w:bottom w:w="0" w:type="dxa"/>
-          </w:tblCellMar>
-        </w:tblPrEx>
-        <w:tc>
-          <w:tcPr>
-            <w:tcW w:w="900" w:type="dxa"/>
-            <w:vAlign w:val="center"/>
-          </w:tcPr>
-          <w:p>
-            <w:r>
-              <w:rPr>
-                <w:color w:val="000000"/>
-              </w:rPr>
-              <w:t>CP-11</w:t>
-            </w:r>
-          </w:p>
-        </w:tc>
-        <w:tc>
-          <w:tcPr>
-            <w:tcW w:w="1500" w:type="dxa"/>
-            <w:vAlign w:val="center"/>
-          </w:tcPr>
-          <w:p>
-            <w:r>
-              <w:rPr>
-                <w:color w:val="000000"/>
-              </w:rPr>
-              <w:t>HU-05 / RN-02</w:t>
-            </w:r>
-          </w:p>
-        </w:tc>
-        <w:tc>
-          <w:tcPr>
-            <w:tcW w:w="2200" w:type="dxa"/>
-            <w:vAlign w:val="center"/>
-          </w:tcPr>
-          <w:p>
-            <w:r>
-              <w:rPr>
-                <w:color w:val="000000"/>
-              </w:rPr>
-              <w:t>Cantidad 0</w:t>
-            </w:r>
-          </w:p>
-        </w:tc>
-        <w:tc>
-          <w:tcPr>
-            <w:tcW w:w="1400" w:type="dxa"/>
-            <w:vAlign w:val="center"/>
-          </w:tcPr>
-          <w:p>
-            <w:r>
-              <w:rPr>
-                <w:color w:val="000000"/>
-              </w:rPr>
-              <w:t>Valores límite</w:t>
-            </w:r>
-          </w:p>
-        </w:tc>
-        <w:tc>
-          <w:tcPr>
-            <w:tcW w:w="900" w:type="dxa"/>
-            <w:vAlign w:val="center"/>
-          </w:tcPr>
-          <w:p>
-            <w:r>
-              <w:rPr>
-                <w:color w:val="000000"/>
-              </w:rPr>
-              <w:t>Alta</w:t>
-            </w:r>
-          </w:p>
-        </w:tc>
-        <w:tc>
-          <w:tcPr>
-            <w:tcW w:w="2600" w:type="dxa"/>
-            <w:vAlign w:val="center"/>
-          </w:tcPr>
-          <w:p>
-            <w:r>
-              <w:rPr>
-                <w:color w:val="000000"/>
-              </w:rPr>
-              <w:t>Lo rechaza</w:t>
-            </w:r>
-          </w:p>
-        </w:tc>
-        <w:tc>
-          <w:tcPr>
-            <w:tcW w:w="900" w:type="dxa"/>
-            <w:vAlign w:val="center"/>
-          </w:tcPr>
-          <w:p>
-            <w:r>
-              <w:rPr>
-                <w:color w:val="000000"/>
-              </w:rPr>
-              <w:t>R-02</w:t>
-            </w:r>
-          </w:p>
-        </w:tc>
-        <w:tc>
-          <w:tcPr>
-            <w:tcW w:w="1400" w:type="dxa"/>
-            <w:vAlign w:val="center"/>
-          </w:tcPr>
-          <w:p>
-            <w:r>
-              <w:rPr>
-                <w:color w:val="000000"/>
-              </w:rPr>
-              <w:t>Aprobado</w:t>
-            </w:r>
-          </w:p>
-        </w:tc>
-      </w:tr>
-      <w:tr>
-        <w:tblPrEx>
-          <w:tblCellMar>
-            <w:top w:w="0" w:type="dxa"/>
-            <w:bottom w:w="0" w:type="dxa"/>
-          </w:tblCellMar>
-        </w:tblPrEx>
-        <w:tc>
-          <w:tcPr>
-            <w:tcW w:w="900" w:type="dxa"/>
-            <w:vAlign w:val="center"/>
-          </w:tcPr>
-          <w:p>
-            <w:r>
-              <w:rPr>
-                <w:color w:val="000000"/>
-              </w:rPr>
-              <w:t>CP-12</w:t>
-            </w:r>
-          </w:p>
-        </w:tc>
-        <w:tc>
-          <w:tcPr>
-            <w:tcW w:w="1500" w:type="dxa"/>
-            <w:vAlign w:val="center"/>
-          </w:tcPr>
-          <w:p>
-            <w:r>
-              <w:rPr>
-                <w:color w:val="000000"/>
-              </w:rPr>
-              <w:t>HU-05 / RN-02</w:t>
-            </w:r>
-          </w:p>
-        </w:tc>
-        <w:tc>
-          <w:tcPr>
-            <w:tcW w:w="2200" w:type="dxa"/>
-            <w:vAlign w:val="center"/>
-          </w:tcPr>
-          <w:p>
-            <w:r>
-              <w:rPr>
-                <w:color w:val="000000"/>
-              </w:rPr>
-              <w:t>Cantidad 100</w:t>
-            </w:r>
-          </w:p>
-        </w:tc>
-        <w:tc>
-          <w:tcPr>
-            <w:tcW w:w="1400" w:type="dxa"/>
-            <w:vAlign w:val="center"/>
-          </w:tcPr>
-          <w:p>
-            <w:r>
-              <w:rPr>
-                <w:color w:val="000000"/>
-              </w:rPr>
-              <w:t>Valores límite</w:t>
-            </w:r>
-          </w:p>
-        </w:tc>
-        <w:tc>
-          <w:tcPr>
-            <w:tcW w:w="900" w:type="dxa"/>
-            <w:vAlign w:val="center"/>
-          </w:tcPr>
-          <w:p>
-            <w:r>
-              <w:rPr>
-                <w:color w:val="000000"/>
-              </w:rPr>
-              <w:t>Alta</w:t>
-            </w:r>
-          </w:p>
-        </w:tc>
-        <w:tc>
-          <w:tcPr>
-            <w:tcW w:w="2600" w:type="dxa"/>
-            <w:vAlign w:val="center"/>
-          </w:tcPr>
-          <w:p>
-            <w:r>
-              <w:rPr>
-                <w:color w:val="000000"/>
-              </w:rPr>
-              <w:t>Lo rechaza</w:t>
-            </w:r>
-          </w:p>
-        </w:tc>
-        <w:tc>
-          <w:tcPr>
-            <w:tcW w:w="900" w:type="dxa"/>
-            <w:vAlign w:val="center"/>
-          </w:tcPr>
-          <w:p>
-            <w:r>
-              <w:rPr>
-                <w:color w:val="000000"/>
-              </w:rPr>
-              <w:t>R-02</w:t>
-            </w:r>
-          </w:p>
-        </w:tc>
-        <w:tc>
-          <w:tcPr>
-            <w:tcW w:w="1400" w:type="dxa"/>
-            <w:vAlign w:val="center"/>
-          </w:tcPr>
-          <w:p>
-            <w:r>
-              <w:rPr>
-                <w:color w:val="000000"/>
-              </w:rPr>
-              <w:t>Aprobado</w:t>
-            </w:r>
-          </w:p>
-        </w:tc>
-      </w:tr>
-      <w:tr>
-        <w:tblPrEx>
-          <w:tblCellMar>
-            <w:top w:w="0" w:type="dxa"/>
-            <w:bottom w:w="0" w:type="dxa"/>
-          </w:tblCellMar>
-        </w:tblPrEx>
-        <w:tc>
-          <w:tcPr>
-            <w:tcW w:w="900" w:type="dxa"/>
-            <w:vAlign w:val="center"/>
-          </w:tcPr>
-          <w:p>
-            <w:r>
-              <w:rPr>
-                <w:color w:val="000000"/>
-              </w:rPr>
-              <w:t>CP-13</w:t>
-            </w:r>
-          </w:p>
-        </w:tc>
-        <w:tc>
-          <w:tcPr>
-            <w:tcW w:w="1500" w:type="dxa"/>
-            <w:vAlign w:val="center"/>
-          </w:tcPr>
-          <w:p>
-            <w:r>
-              <w:rPr>
-                <w:color w:val="000000"/>
-              </w:rPr>
-              <w:t>HU-05 / RN-02</w:t>
-            </w:r>
-          </w:p>
-        </w:tc>
-        <w:tc>
-          <w:tcPr>
-            <w:tcW w:w="2200" w:type="dxa"/>
-            <w:vAlign w:val="center"/>
-          </w:tcPr>
-          <w:p>
-            <w:r>
-              <w:rPr>
-                <w:color w:val="000000"/>
-              </w:rPr>
-              <w:t>Cantidad con letras</w:t>
-            </w:r>
-          </w:p>
-        </w:tc>
-        <w:tc>
-          <w:tcPr>
-            <w:tcW w:w="1400" w:type="dxa"/>
-            <w:vAlign w:val="center"/>
-          </w:tcPr>
-          <w:p>
-            <w:r>
-              <w:rPr>
-                <w:color w:val="000000"/>
-              </w:rPr>
-              <w:t>Equivalencia</w:t>
-            </w:r>
-          </w:p>
-        </w:tc>
-        <w:tc>
-          <w:tcPr>
-            <w:tcW w:w="900" w:type="dxa"/>
-            <w:vAlign w:val="center"/>
-          </w:tcPr>
-          <w:p>
-            <w:r>
-              <w:rPr>
-                <w:color w:val="000000"/>
-              </w:rPr>
-              <w:t>Media</w:t>
-            </w:r>
-          </w:p>
-        </w:tc>
-        <w:tc>
-          <w:tcPr>
-            <w:tcW w:w="2600" w:type="dxa"/>
-            <w:vAlign w:val="center"/>
-          </w:tcPr>
-          <w:p>
-            <w:r>
-              <w:rPr>
-                <w:color w:val="000000"/>
-              </w:rPr>
-              <w:t>Lo rechaza</w:t>
-            </w:r>
-          </w:p>
-        </w:tc>
-        <w:tc>
-          <w:tcPr>
-            <w:tcW w:w="900" w:type="dxa"/>
-            <w:vAlign w:val="center"/>
-          </w:tcPr>
-          <w:p>
-            <w:r>
-              <w:rPr>
-                <w:color w:val="000000"/>
-              </w:rPr>
-              <w:t>R-02</w:t>
-            </w:r>
-          </w:p>
-        </w:tc>
-        <w:tc>
-          <w:tcPr>
-            <w:tcW w:w="1400" w:type="dxa"/>
-            <w:vAlign w:val="center"/>
-          </w:tcPr>
-          <w:p>
-            <w:r>
-              <w:rPr>
-                <w:color w:val="000000"/>
-              </w:rPr>
-              <w:t>Aprobado</w:t>
-            </w:r>
-          </w:p>
-        </w:tc>
-      </w:tr>
-      <w:tr>
-        <w:tblPrEx>
-          <w:tblCellMar>
-            <w:top w:w="0" w:type="dxa"/>
-            <w:bottom w:w="0" w:type="dxa"/>
-          </w:tblCellMar>
-        </w:tblPrEx>
-        <w:tc>
-          <w:tcPr>
-            <w:tcW w:w="900" w:type="dxa"/>
-            <w:vAlign w:val="center"/>
-          </w:tcPr>
-          <w:p>
-            <w:r>
-              <w:rPr>
-                <w:color w:val="000000"/>
-              </w:rPr>
-              <w:t>CP-14</w:t>
-            </w:r>
-          </w:p>
-        </w:tc>
-        <w:tc>
-          <w:tcPr>
-            <w:tcW w:w="1500" w:type="dxa"/>
-            <w:vAlign w:val="center"/>
-          </w:tcPr>
-          <w:p>
-            <w:r>
-              <w:rPr>
-                <w:color w:val="000000"/>
-              </w:rPr>
-              <w:t>HU-05 / RN-03</w:t>
-            </w:r>
-          </w:p>
-        </w:tc>
-        <w:tc>
-          <w:tcPr>
-            <w:tcW w:w="2200" w:type="dxa"/>
-            <w:vAlign w:val="center"/>
-          </w:tcPr>
-          <w:p>
-            <w:r>
-              <w:rPr>
-                <w:color w:val="000000"/>
-              </w:rPr>
-              <w:t>Producto agotado</w:t>
-            </w:r>
-          </w:p>
-        </w:tc>
-        <w:tc>
-          <w:tcPr>
-            <w:tcW w:w="1400" w:type="dxa"/>
-            <w:vAlign w:val="center"/>
-          </w:tcPr>
-          <w:p>
-            <w:r>
-              <w:rPr>
-                <w:color w:val="000000"/>
-              </w:rPr>
-              <w:t>Negativa</w:t>
-            </w:r>
-          </w:p>
-        </w:tc>
-        <w:tc>
-          <w:tcPr>
-            <w:tcW w:w="900" w:type="dxa"/>
-            <w:vAlign w:val="center"/>
-          </w:tcPr>
-          <w:p>
-            <w:r>
-              <w:rPr>
-                <w:color w:val="000000"/>
-              </w:rPr>
-              <w:t>Alta</w:t>
-            </w:r>
-          </w:p>
-        </w:tc>
-        <w:tc>
-          <w:tcPr>
-            <w:tcW w:w="2600" w:type="dxa"/>
-            <w:vAlign w:val="center"/>
-          </w:tcPr>
-          <w:p>
-            <w:r>
-              <w:rPr>
-                <w:color w:val="000000"/>
-              </w:rPr>
-              <w:t>No lo agrega</w:t>
-            </w:r>
-          </w:p>
-        </w:tc>
-        <w:tc>
-          <w:tcPr>
-            <w:tcW w:w="900" w:type="dxa"/>
-            <w:vAlign w:val="center"/>
-          </w:tcPr>
-          <w:p>
-            <w:r>
-              <w:rPr>
-                <w:color w:val="000000"/>
-              </w:rPr>
-              <w:t>R-06</w:t>
-            </w:r>
-          </w:p>
-        </w:tc>
-        <w:tc>
-          <w:tcPr>
-            <w:tcW w:w="1400" w:type="dxa"/>
-            <w:vAlign w:val="center"/>
-          </w:tcPr>
-          <w:p>
-            <w:r>
-              <w:rPr>
-                <w:color w:val="000000"/>
-              </w:rPr>
-              <w:t>Aprobado</w:t>
-            </w:r>
-          </w:p>
-        </w:tc>
-      </w:tr>
-      <w:tr>
-        <w:tblPrEx>
-          <w:tblCellMar>
-            <w:top w:w="0" w:type="dxa"/>
-            <w:bottom w:w="0" w:type="dxa"/>
-          </w:tblCellMar>
-        </w:tblPrEx>
-        <w:tc>
-          <w:tcPr>
-            <w:tcW w:w="900" w:type="dxa"/>
-            <w:vAlign w:val="center"/>
-          </w:tcPr>
-          <w:p>
-            <w:r>
-              <w:rPr>
-                <w:color w:val="000000"/>
-              </w:rPr>
-              <w:t>CP-15</w:t>
-            </w:r>
-          </w:p>
-        </w:tc>
-        <w:tc>
-          <w:tcPr>
-            <w:tcW w:w="1500" w:type="dxa"/>
-            <w:vAlign w:val="center"/>
-          </w:tcPr>
-          <w:p>
-            <w:r>
-              <w:rPr>
-                <w:color w:val="000000"/>
-              </w:rPr>
-              <w:t>HU-06</w:t>
-            </w:r>
-          </w:p>
-        </w:tc>
-        <w:tc>
-          <w:tcPr>
-            <w:tcW w:w="2200" w:type="dxa"/>
-            <w:vAlign w:val="center"/>
-          </w:tcPr>
-          <w:p>
-            <w:r>
-              <w:rPr>
-                <w:color w:val="000000"/>
-              </w:rPr>
-              <w:t>Eliminar una línea</w:t>
-            </w:r>
-          </w:p>
-        </w:tc>
-        <w:tc>
-          <w:tcPr>
-            <w:tcW w:w="1400" w:type="dxa"/>
-            <w:vAlign w:val="center"/>
-          </w:tcPr>
-          <w:p>
-            <w:r>
-              <w:rPr>
-                <w:color w:val="000000"/>
-              </w:rPr>
-              <w:t>Positiva</w:t>
-            </w:r>
-          </w:p>
-        </w:tc>
-        <w:tc>
-          <w:tcPr>
-            <w:tcW w:w="900" w:type="dxa"/>
-            <w:vAlign w:val="center"/>
-          </w:tcPr>
-          <w:p>
-            <w:r>
-              <w:rPr>
-                <w:color w:val="000000"/>
-              </w:rPr>
-              <w:t>Alta</w:t>
-            </w:r>
-          </w:p>
-        </w:tc>
-        <w:tc>
-          <w:tcPr>
-            <w:tcW w:w="2600" w:type="dxa"/>
-            <w:vAlign w:val="center"/>
-          </w:tcPr>
-          <w:p>
-            <w:r>
-              <w:rPr>
-                <w:color w:val="000000"/>
-              </w:rPr>
-              <w:t>Recalcula el total</w:t>
-            </w:r>
-          </w:p>
-        </w:tc>
-        <w:tc>
-          <w:tcPr>
-            <w:tcW w:w="900" w:type="dxa"/>
-            <w:vAlign w:val="center"/>
-          </w:tcPr>
-          <w:p>
-            <w:r>
-              <w:rPr>
-                <w:color w:val="000000"/>
-              </w:rPr>
-              <w:t>R-07</w:t>
-            </w:r>
-          </w:p>
-        </w:tc>
-        <w:tc>
-          <w:tcPr>
-            <w:tcW w:w="1400" w:type="dxa"/>
-            <w:vAlign w:val="center"/>
-          </w:tcPr>
-          <w:p>
-            <w:r>
-              <w:rPr>
-                <w:color w:val="000000"/>
-              </w:rPr>
-              <w:t>No ejecutado</w:t>
-            </w:r>
-          </w:p>
-        </w:tc>
-      </w:tr>
-      <w:tr>
-        <w:tblPrEx>
-          <w:tblCellMar>
-            <w:top w:w="0" w:type="dxa"/>
-            <w:bottom w:w="0" w:type="dxa"/>
-          </w:tblCellMar>
-        </w:tblPrEx>
-        <w:tc>
-          <w:tcPr>
-            <w:tcW w:w="900" w:type="dxa"/>
-            <w:vAlign w:val="center"/>
-          </w:tcPr>
-          <w:p>
-            <w:r>
-              <w:rPr>
-                <w:color w:val="000000"/>
-              </w:rPr>
-              <w:t>CP-16</w:t>
-            </w:r>
-          </w:p>
-        </w:tc>
-        <w:tc>
-          <w:tcPr>
-            <w:tcW w:w="1500" w:type="dxa"/>
-            <w:vAlign w:val="center"/>
-          </w:tcPr>
-          <w:p>
-            <w:r>
-              <w:rPr>
-                <w:color w:val="000000"/>
-              </w:rPr>
-              <w:t>HU-07 / RN-01</w:t>
-            </w:r>
-          </w:p>
-        </w:tc>
-        <w:tc>
-          <w:tcPr>
-            <w:tcW w:w="2200" w:type="dxa"/>
-            <w:vAlign w:val="center"/>
-          </w:tcPr>
-          <w:p>
-            <w:r>
-              <w:rPr>
-                <w:color w:val="000000"/>
-              </w:rPr>
-              <w:t>Enviar con Q399.99</w:t>
-            </w:r>
-          </w:p>
-        </w:tc>
-        <w:tc>
-          <w:tcPr>
-            <w:tcW w:w="1400" w:type="dxa"/>
-            <w:vAlign w:val="center"/>
-          </w:tcPr>
-          <w:p>
-            <w:r>
-              <w:rPr>
-                <w:color w:val="000000"/>
-              </w:rPr>
-              <w:t>Valores límite</w:t>
-            </w:r>
-          </w:p>
-        </w:tc>
-        <w:tc>
-          <w:tcPr>
-            <w:tcW w:w="900" w:type="dxa"/>
-            <w:vAlign w:val="center"/>
-          </w:tcPr>
-          <w:p>
-            <w:r>
-              <w:rPr>
-                <w:color w:val="000000"/>
-              </w:rPr>
-              <w:t>Crítica</w:t>
-            </w:r>
-          </w:p>
-        </w:tc>
-        <w:tc>
-          <w:tcPr>
-            <w:tcW w:w="2600" w:type="dxa"/>
-            <w:vAlign w:val="center"/>
-          </w:tcPr>
-          <w:p>
-            <w:r>
-              <w:rPr>
-                <w:color w:val="000000"/>
-              </w:rPr>
-              <w:t>No deja, dice cuánto falta</w:t>
-            </w:r>
-          </w:p>
-        </w:tc>
-        <w:tc>
-          <w:tcPr>
-            <w:tcW w:w="900" w:type="dxa"/>
-            <w:vAlign w:val="center"/>
-          </w:tcPr>
-          <w:p>
-            <w:r>
-              <w:rPr>
-                <w:color w:val="000000"/>
-              </w:rPr>
-              <w:t>R-01</w:t>
-            </w:r>
-          </w:p>
-        </w:tc>
-        <w:tc>
-          <w:tcPr>
-            <w:tcW w:w="1400" w:type="dxa"/>
-            <w:vAlign w:val="center"/>
-          </w:tcPr>
-          <w:p>
-            <w:r>
-              <w:rPr>
-                <w:color w:val="000000"/>
-              </w:rPr>
-              <w:t>Aprobado</w:t>
-            </w:r>
-          </w:p>
-        </w:tc>
-      </w:tr>
-      <w:tr>
-        <w:tblPrEx>
-          <w:tblCellMar>
-            <w:top w:w="0" w:type="dxa"/>
-            <w:bottom w:w="0" w:type="dxa"/>
-          </w:tblCellMar>
-        </w:tblPrEx>
-        <w:tc>
-          <w:tcPr>
-            <w:tcW w:w="900" w:type="dxa"/>
-            <w:vAlign w:val="center"/>
-          </w:tcPr>
-          <w:p>
-            <w:r>
-              <w:rPr>
-                <w:color w:val="000000"/>
-              </w:rPr>
-              <w:t>CP-17</w:t>
-            </w:r>
-          </w:p>
-        </w:tc>
-        <w:tc>
-          <w:tcPr>
-            <w:tcW w:w="1500" w:type="dxa"/>
-            <w:vAlign w:val="center"/>
-          </w:tcPr>
-          <w:p>
-            <w:r>
-              <w:rPr>
-                <w:color w:val="000000"/>
-              </w:rPr>
-              <w:t>HU-07 / RN-01</w:t>
-            </w:r>
-          </w:p>
-        </w:tc>
-        <w:tc>
-          <w:tcPr>
-            <w:tcW w:w="2200" w:type="dxa"/>
-            <w:vAlign w:val="center"/>
-          </w:tcPr>
-          <w:p>
-            <w:r>
-              <w:rPr>
-                <w:color w:val="000000"/>
-              </w:rPr>
-              <w:t>Enviar con Q400.00</w:t>
-            </w:r>
-          </w:p>
-        </w:tc>
-        <w:tc>
-          <w:tcPr>
-            <w:tcW w:w="1400" w:type="dxa"/>
-            <w:vAlign w:val="center"/>
-          </w:tcPr>
-          <w:p>
-            <w:r>
-              <w:rPr>
-                <w:color w:val="000000"/>
-              </w:rPr>
-              <w:t>Valores límite</w:t>
-            </w:r>
-          </w:p>
-        </w:tc>
-        <w:tc>
-          <w:tcPr>
-            <w:tcW w:w="900" w:type="dxa"/>
-            <w:vAlign w:val="center"/>
-          </w:tcPr>
-          <w:p>
-            <w:r>
-              <w:rPr>
-                <w:color w:val="000000"/>
-              </w:rPr>
-              <w:t>Crítica</w:t>
-            </w:r>
-          </w:p>
-        </w:tc>
-        <w:tc>
-          <w:tcPr>
-            <w:tcW w:w="2600" w:type="dxa"/>
-            <w:vAlign w:val="center"/>
-          </w:tcPr>
-          <w:p>
-            <w:r>
-              <w:rPr>
-                <w:color w:val="000000"/>
-              </w:rPr>
-              <w:t>Envía y da el número</w:t>
-            </w:r>
-          </w:p>
-        </w:tc>
-        <w:tc>
-          <w:tcPr>
-            <w:tcW w:w="900" w:type="dxa"/>
-            <w:vAlign w:val="center"/>
-          </w:tcPr>
-          <w:p>
-            <w:r>
-              <w:rPr>
-                <w:color w:val="000000"/>
-              </w:rPr>
-              <w:t>R-01</w:t>
-            </w:r>
-          </w:p>
-        </w:tc>
-        <w:tc>
-          <w:tcPr>
-            <w:tcW w:w="1400" w:type="dxa"/>
-            <w:vAlign w:val="center"/>
-          </w:tcPr>
-          <w:p>
-            <w:r>
-              <w:rPr>
-                <w:color w:val="000000"/>
-              </w:rPr>
-              <w:t>Aprobado</w:t>
-            </w:r>
-          </w:p>
-        </w:tc>
-      </w:tr>
-      <w:tr>
-        <w:tblPrEx>
-          <w:tblCellMar>
-            <w:top w:w="0" w:type="dxa"/>
-            <w:bottom w:w="0" w:type="dxa"/>
-          </w:tblCellMar>
-        </w:tblPrEx>
-        <w:tc>
-          <w:tcPr>
-            <w:tcW w:w="900" w:type="dxa"/>
-            <w:vAlign w:val="center"/>
-          </w:tcPr>
-          <w:p>
-            <w:r>
-              <w:rPr>
-                <w:color w:val="000000"/>
-              </w:rPr>
-              <w:t>CP-18</w:t>
-            </w:r>
-          </w:p>
-        </w:tc>
-        <w:tc>
-          <w:tcPr>
-            <w:tcW w:w="1500" w:type="dxa"/>
-            <w:vAlign w:val="center"/>
-          </w:tcPr>
-          <w:p>
-            <w:r>
-              <w:rPr>
-                <w:color w:val="000000"/>
-              </w:rPr>
-              <w:t>HU-07</w:t>
-            </w:r>
-          </w:p>
-        </w:tc>
-        <w:tc>
-          <w:tcPr>
-            <w:tcW w:w="2200" w:type="dxa"/>
-            <w:vAlign w:val="center"/>
-          </w:tcPr>
-          <w:p>
-            <w:r>
-              <w:rPr>
-                <w:color w:val="000000"/>
-              </w:rPr>
-              <w:t>Doble clic en enviar</w:t>
-            </w:r>
-          </w:p>
-        </w:tc>
-        <w:tc>
-          <w:tcPr>
-            <w:tcW w:w="1400" w:type="dxa"/>
-            <w:vAlign w:val="center"/>
-          </w:tcPr>
-          <w:p>
-            <w:r>
-              <w:rPr>
-                <w:color w:val="000000"/>
-              </w:rPr>
-              <w:t>Estim. de errores</w:t>
-            </w:r>
-          </w:p>
-        </w:tc>
-        <w:tc>
-          <w:tcPr>
-            <w:tcW w:w="900" w:type="dxa"/>
-            <w:vAlign w:val="center"/>
-          </w:tcPr>
-          <w:p>
-            <w:r>
-              <w:rPr>
-                <w:color w:val="000000"/>
-              </w:rPr>
-              <w:t>Crítica</w:t>
-            </w:r>
-          </w:p>
-        </w:tc>
-        <w:tc>
-          <w:tcPr>
-            <w:tcW w:w="2600" w:type="dxa"/>
-            <w:vAlign w:val="center"/>
-          </w:tcPr>
-          <w:p>
-            <w:r>
-              <w:rPr>
-                <w:color w:val="000000"/>
-              </w:rPr>
-              <w:t>Un solo pedido</w:t>
-            </w:r>
-          </w:p>
-        </w:tc>
-        <w:tc>
-          <w:tcPr>
-            <w:tcW w:w="900" w:type="dxa"/>
-            <w:vAlign w:val="center"/>
-          </w:tcPr>
-          <w:p>
-            <w:r>
-              <w:rPr>
-                <w:color w:val="000000"/>
-              </w:rPr>
-              <w:t>R-03</w:t>
-            </w:r>
-          </w:p>
-        </w:tc>
-        <w:tc>
-          <w:tcPr>
-            <w:tcW w:w="1400" w:type="dxa"/>
-            <w:vAlign w:val="center"/>
-          </w:tcPr>
-          <w:p>
-            <w:r>
-              <w:rPr>
-                <w:color w:val="000000"/>
-              </w:rPr>
-              <w:t>No ejecutado</w:t>
-            </w:r>
-          </w:p>
-        </w:tc>
-      </w:tr>
-      <w:tr>
-        <w:tblPrEx>
-          <w:tblCellMar>
-            <w:top w:w="0" w:type="dxa"/>
-            <w:bottom w:w="0" w:type="dxa"/>
-          </w:tblCellMar>
-        </w:tblPrEx>
-        <w:tc>
-          <w:tcPr>
-            <w:tcW w:w="900" w:type="dxa"/>
-            <w:vAlign w:val="center"/>
-          </w:tcPr>
-          <w:p>
-            <w:r>
-              <w:rPr>
-                <w:color w:val="000000"/>
-              </w:rPr>
-              <w:t>CP-19</w:t>
-            </w:r>
-          </w:p>
-        </w:tc>
-        <w:tc>
-          <w:tcPr>
-            <w:tcW w:w="1500" w:type="dxa"/>
-            <w:vAlign w:val="center"/>
-          </w:tcPr>
-          <w:p>
-            <w:r>
-              <w:rPr>
-                <w:color w:val="000000"/>
-              </w:rPr>
-              <w:t>HU-08</w:t>
-            </w:r>
-          </w:p>
-        </w:tc>
-        <w:tc>
-          <w:tcPr>
-            <w:tcW w:w="2200" w:type="dxa"/>
-            <w:vAlign w:val="center"/>
-          </w:tcPr>
-          <w:p>
-            <w:r>
-              <w:rPr>
-                <w:color w:val="000000"/>
-              </w:rPr>
-              <w:t>Botón atrás tras salir</w:t>
-            </w:r>
-          </w:p>
-        </w:tc>
-        <w:tc>
-          <w:tcPr>
-            <w:tcW w:w="1400" w:type="dxa"/>
-            <w:vAlign w:val="center"/>
-          </w:tcPr>
-          <w:p>
-            <w:r>
-              <w:rPr>
-                <w:color w:val="000000"/>
-              </w:rPr>
-              <w:t>Estim. de errores</w:t>
-            </w:r>
-          </w:p>
-        </w:tc>
-        <w:tc>
-          <w:tcPr>
-            <w:tcW w:w="900" w:type="dxa"/>
-            <w:vAlign w:val="center"/>
-          </w:tcPr>
-          <w:p>
-            <w:r>
-              <w:rPr>
-                <w:color w:val="000000"/>
-              </w:rPr>
-              <w:t>Media</w:t>
-            </w:r>
-          </w:p>
-        </w:tc>
-        <w:tc>
-          <w:tcPr>
-            <w:tcW w:w="2600" w:type="dxa"/>
-            <w:vAlign w:val="center"/>
-          </w:tcPr>
-          <w:p>
-            <w:r>
-              <w:rPr>
-                <w:color w:val="000000"/>
-              </w:rPr>
-              <w:t>No vuelve a entrar</w:t>
-            </w:r>
-          </w:p>
-        </w:tc>
-        <w:tc>
-          <w:tcPr>
-            <w:tcW w:w="900" w:type="dxa"/>
-            <w:vAlign w:val="center"/>
-          </w:tcPr>
-          <w:p>
-            <w:r>
-              <w:rPr>
-                <w:color w:val="000000"/>
-              </w:rPr>
-              <w:t>R-05</w:t>
-            </w:r>
-          </w:p>
-        </w:tc>
-        <w:tc>
-          <w:tcPr>
-            <w:tcW w:w="1400" w:type="dxa"/>
-            <w:vAlign w:val="center"/>
-          </w:tcPr>
-          <w:p>
-            <w:r>
-              <w:rPr>
-                <w:color w:val="000000"/>
-              </w:rPr>
-              <w:t>No ejecutado</w:t>
             </w:r>
           </w:p>
         </w:tc>
@@ -9326,7 +9326,7 @@
           <w:iCs/>
           <w:color w:val="555555"/>
         </w:rPr>
-        <w:t>Cada caso está ligado a una historia de usuario, a la regla que verifica y al riesgo que ayuda a controlar. La columna Estado se actualizó el 12 de octubre de 2026 solo con lo que se ejecutó de verdad. CP-03, CP-04, CP-07 y CP-08 se aprobaron con las pruebas de Playwright (npm run test:e2e). CP-09 a CP-14, CP-16 y CP-17 se aprobaron con las pruebas unitarias (npm test), que revisan la regla de negocio en el código y no la pantalla. CP-02 quedó como No ejecutado porque solo se corrió con una respuesta simulada de Supabase. Las pruebas del filtro CP-20 a CP-30 (HU-09) también están aprobadas con npm test; el detalle está en docs/rtm-estado.md del repositorio.</w:t>
+        <w:t>Cada caso está ligado a una historia de usuario, a la regla que verifica y al riesgo que ayuda a controlar. La columna Estado se actualizó el 12 de octubre de 2026 solo con lo que se ejecutó de verdad. CP-01, CP-03 a CP-08, CP-15, CP-16 y CP-19 se aprobaron con pruebas de Playwright en el navegador (npm run test:e2e). CP-09 a CP-14 y CP-17 se aprobaron con las pruebas unitarias (npm test), que revisan la regla de negocio en el código. El resultado esperado de CP-06 se corrigió a 16 productos con 3 marcados, que es el catálogo real en Supabase. CP-02 y CP-18 quedan como No ejecutado porque solo se probaron con una respuesta simulada de Supabase. Las pruebas del filtro CP-20 a CP-30 (HU-09) también están aprobadas con npm test; el detalle está en docs/rtm-estado.md del repositorio.</w:t>
       </w:r>
     </w:p>
     <w:p>

</xml_diff>

<commit_message>
docs: registrar prueba real de envio y cerrar RTM con 19 casos aprobados
</commit_message>
<xml_diff>
--- a/docs/Hito-Integracion-SQA.docx.docx
+++ b/docs/Hito-Integracion-SQA.docx.docx
@@ -7270,7 +7270,7 @@
               <w:rPr>
                 <w:color w:val="000000"/>
               </w:rPr>
-              <w:t>No ejecutado</w:t>
+              <w:t>Aprobado</w:t>
             </w:r>
           </w:p>
         </w:tc>
@@ -9190,7 +9190,7 @@
               <w:rPr>
                 <w:color w:val="000000"/>
               </w:rPr>
-              <w:t>No ejecutado</w:t>
+              <w:t>Aprobado</w:t>
             </w:r>
           </w:p>
         </w:tc>
@@ -9326,7 +9326,7 @@
           <w:iCs/>
           <w:color w:val="555555"/>
         </w:rPr>
-        <w:t>Cada caso está ligado a una historia de usuario, a la regla que verifica y al riesgo que ayuda a controlar. La columna Estado se actualizó el 12 de octubre de 2026 solo con lo que se ejecutó de verdad. CP-01, CP-03 a CP-08, CP-15, CP-16 y CP-19 se aprobaron con pruebas de Playwright en el navegador (npm run test:e2e). CP-09 a CP-14 y CP-17 se aprobaron con las pruebas unitarias (npm test), que revisan la regla de negocio en el código. El resultado esperado de CP-06 se corrigió a 16 productos con 3 marcados, que es el catálogo real en Supabase. CP-02 y CP-18 quedan como No ejecutado porque solo se probaron con una respuesta simulada de Supabase. Las pruebas del filtro CP-20 a CP-30 (HU-09) también están aprobadas con npm test; el detalle está en docs/rtm-estado.md del repositorio.</w:t>
+        <w:t>Cada caso está ligado a una historia de usuario, a la regla que verifica y al riesgo que ayuda a controlar. La columna Estado se actualizó el 12 de octubre de 2026 solo con lo que se ejecutó de verdad. CP-01, CP-03 a CP-08, CP-15, CP-16 y CP-19 se aprobaron con pruebas de Playwright en el navegador (npm run test:e2e). CP-09 a CP-14 y CP-17 se aprobaron con las pruebas unitarias (npm test), que revisan la regla de negocio en el código. El resultado esperado de CP-06 se corrigió a 16 productos con 3 marcados, que es el catálogo real en Supabase. CP-02, CP-17 y CP-18 se probaron además a mano con la base real: inicio de sesión con una consejera activa, envío de Q400.00 exactos con doble clic y un solo pedido registrado (PED-2026-8675). Las pruebas del filtro CP-20 a CP-30 (HU-09) también están aprobadas con npm test; el detalle está en docs/rtm-estado.md del repositorio.</w:t>
       </w:r>
     </w:p>
     <w:p>

</xml_diff>